<commit_message>
[LOGIC] Added first Hub (ChatHub)
</commit_message>
<xml_diff>
--- a/0_Documents/Projekthandbuch.docx
+++ b/0_Documents/Projekthandbuch.docx
@@ -2203,7 +2203,15 @@
         <w:ind w:left="714" w:hanging="357"/>
       </w:pPr>
       <w:r>
-        <w:t>Das Projekthandbuch beinhaltet die wesentlichen Planungsschritte und –methoden. Es soll in jedem Fall während des gesamten Projektverlaufs aktualisiert werden! Sämtliche Änderungen sind im Änderungsverzeichnis zu erfassen.</w:t>
+        <w:t>Das Projekthandbuch beinhaltet die wesentlichen Planungsschritte und –</w:t>
+      </w:r>
+      <w:proofErr w:type="spellStart"/>
+      <w:r>
+        <w:t>methoden</w:t>
+      </w:r>
+      <w:proofErr w:type="spellEnd"/>
+      <w:r>
+        <w:t>. Es soll in jedem Fall während des gesamten Projektverlaufs aktualisiert werden! Sämtliche Änderungen sind im Änderungsverzeichnis zu erfassen.</w:t>
       </w:r>
     </w:p>
     <w:p/>
@@ -2359,7 +2367,15 @@
               <w:t>Fragen an</w:t>
             </w:r>
             <w:r>
-              <w:t xml:space="preserve"> GPT -&gt; Danach google -&gt; Danach</w:t>
+              <w:t xml:space="preserve"> GPT -&gt; Danach </w:t>
+            </w:r>
+            <w:proofErr w:type="spellStart"/>
+            <w:r>
+              <w:t>google</w:t>
+            </w:r>
+            <w:proofErr w:type="spellEnd"/>
+            <w:r>
+              <w:t xml:space="preserve"> -&gt; Danach</w:t>
             </w:r>
             <w:r>
               <w:t xml:space="preserve"> </w:t>
@@ -2893,8 +2909,13 @@
               <w:spacing w:before="60" w:after="60"/>
             </w:pPr>
             <w:r>
-              <w:t>1 DEV, 1 AzureAccount</w:t>
-            </w:r>
+              <w:t xml:space="preserve">1 DEV, 1 </w:t>
+            </w:r>
+            <w:proofErr w:type="spellStart"/>
+            <w:r>
+              <w:t>AzureAccount</w:t>
+            </w:r>
+            <w:proofErr w:type="spellEnd"/>
           </w:p>
         </w:tc>
       </w:tr>
@@ -2927,8 +2948,13 @@
               <w:spacing w:before="60" w:after="60"/>
             </w:pPr>
             <w:r>
-              <w:t>Power, Stress, Zielstrebigkeit  xD</w:t>
-            </w:r>
+              <w:t xml:space="preserve">Power, Stress, Zielstrebigkeit  </w:t>
+            </w:r>
+            <w:proofErr w:type="spellStart"/>
+            <w:r>
+              <w:t>xD</w:t>
+            </w:r>
+            <w:proofErr w:type="spellEnd"/>
           </w:p>
         </w:tc>
       </w:tr>
@@ -3440,15 +3466,15 @@
         <w:tblLook w:val="00A0" w:firstRow="1" w:lastRow="0" w:firstColumn="1" w:lastColumn="0" w:noHBand="0" w:noVBand="0"/>
       </w:tblPr>
       <w:tblGrid>
-        <w:gridCol w:w="2255"/>
-        <w:gridCol w:w="2288"/>
-        <w:gridCol w:w="2264"/>
-        <w:gridCol w:w="2253"/>
+        <w:gridCol w:w="2285"/>
+        <w:gridCol w:w="2280"/>
+        <w:gridCol w:w="2246"/>
+        <w:gridCol w:w="2249"/>
       </w:tblGrid>
       <w:tr>
         <w:tc>
           <w:tcPr>
-            <w:tcW w:w="9210" w:type="dxa"/>
+            <w:tcW w:w="9060" w:type="dxa"/>
             <w:gridSpan w:val="4"/>
             <w:shd w:val="clear" w:color="auto" w:fill="8DB3E2"/>
             <w:vAlign w:val="center"/>
@@ -3479,7 +3505,7 @@
       <w:tr>
         <w:tc>
           <w:tcPr>
-            <w:tcW w:w="2302" w:type="dxa"/>
+            <w:tcW w:w="2285" w:type="dxa"/>
             <w:shd w:val="clear" w:color="auto" w:fill="8DB3E2"/>
             <w:vAlign w:val="center"/>
           </w:tcPr>
@@ -3501,7 +3527,7 @@
         </w:tc>
         <w:tc>
           <w:tcPr>
-            <w:tcW w:w="2302" w:type="dxa"/>
+            <w:tcW w:w="2280" w:type="dxa"/>
             <w:shd w:val="clear" w:color="auto" w:fill="8DB3E2"/>
             <w:vAlign w:val="center"/>
           </w:tcPr>
@@ -3523,7 +3549,7 @@
         </w:tc>
         <w:tc>
           <w:tcPr>
-            <w:tcW w:w="2303" w:type="dxa"/>
+            <w:tcW w:w="2246" w:type="dxa"/>
             <w:shd w:val="clear" w:color="auto" w:fill="8DB3E2"/>
             <w:vAlign w:val="center"/>
           </w:tcPr>
@@ -3545,7 +3571,7 @@
         </w:tc>
         <w:tc>
           <w:tcPr>
-            <w:tcW w:w="2303" w:type="dxa"/>
+            <w:tcW w:w="2249" w:type="dxa"/>
             <w:shd w:val="clear" w:color="auto" w:fill="8DB3E2"/>
             <w:vAlign w:val="center"/>
           </w:tcPr>
@@ -3569,7 +3595,7 @@
       <w:tr>
         <w:tc>
           <w:tcPr>
-            <w:tcW w:w="2302" w:type="dxa"/>
+            <w:tcW w:w="2285" w:type="dxa"/>
           </w:tcPr>
           <w:p>
             <w:pPr>
@@ -3579,175 +3605,49 @@
               <w:rPr>
                 <w:bCs/>
               </w:rPr>
-              <w:fldChar w:fldCharType="begin">
-                <w:ffData>
-                  <w:name w:val=""/>
-                  <w:enabled/>
-                  <w:calcOnExit w:val="0"/>
-                  <w:textInput>
-                    <w:default w:val="&lt;Name und Beschreibung des Risikos&gt;"/>
-                  </w:textInput>
-                </w:ffData>
-              </w:fldChar>
-            </w:r>
+              <w:t>Krankheitsfall / Ausfall von Personal</w:t>
+            </w:r>
+          </w:p>
+        </w:tc>
+        <w:tc>
+          <w:tcPr>
+            <w:tcW w:w="2280" w:type="dxa"/>
+          </w:tcPr>
+          <w:p>
+            <w:pPr>
+              <w:spacing w:before="60" w:after="60"/>
+            </w:pPr>
+            <w:r>
+              <w:t>10%</w:t>
+            </w:r>
+          </w:p>
+        </w:tc>
+        <w:tc>
+          <w:tcPr>
+            <w:tcW w:w="2246" w:type="dxa"/>
+          </w:tcPr>
+          <w:p>
+            <w:pPr>
+              <w:spacing w:before="60" w:after="60"/>
+            </w:pPr>
+            <w:r>
+              <w:t>Verzögerung von Arbeitsschritten und Terminen</w:t>
+            </w:r>
+          </w:p>
+        </w:tc>
+        <w:tc>
+          <w:tcPr>
+            <w:tcW w:w="2249" w:type="dxa"/>
+          </w:tcPr>
+          <w:p>
+            <w:pPr>
+              <w:spacing w:before="60" w:after="60"/>
+            </w:pPr>
             <w:r>
               <w:rPr>
                 <w:bCs/>
               </w:rPr>
-              <w:instrText xml:space="preserve"> FORMTEXT </w:instrText>
-            </w:r>
-            <w:r>
-              <w:rPr>
-                <w:bCs/>
-              </w:rPr>
-            </w:r>
-            <w:r>
-              <w:rPr>
-                <w:bCs/>
-              </w:rPr>
-              <w:fldChar w:fldCharType="separate"/>
-            </w:r>
-            <w:r>
-              <w:rPr>
-                <w:bCs/>
-                <w:noProof/>
-              </w:rPr>
-              <w:t>&lt;Name und Beschreibung des Risikos&gt;</w:t>
-            </w:r>
-            <w:r>
-              <w:rPr>
-                <w:bCs/>
-              </w:rPr>
-              <w:fldChar w:fldCharType="end"/>
-            </w:r>
-          </w:p>
-        </w:tc>
-        <w:tc>
-          <w:tcPr>
-            <w:tcW w:w="2302" w:type="dxa"/>
-          </w:tcPr>
-          <w:p>
-            <w:pPr>
-              <w:spacing w:before="60" w:after="60"/>
-            </w:pPr>
-            <w:r>
-              <w:fldChar w:fldCharType="begin">
-                <w:ffData>
-                  <w:name w:val=""/>
-                  <w:enabled/>
-                  <w:calcOnExit w:val="0"/>
-                  <w:textInput>
-                    <w:default w:val="&lt;z.B. in %&gt;"/>
-                  </w:textInput>
-                </w:ffData>
-              </w:fldChar>
-            </w:r>
-            <w:r>
-              <w:instrText xml:space="preserve"> FORMTEXT </w:instrText>
-            </w:r>
-            <w:r>
-              <w:fldChar w:fldCharType="separate"/>
-            </w:r>
-            <w:r>
-              <w:rPr>
-                <w:noProof/>
-              </w:rPr>
-              <w:t>&lt;z.B. in %&gt;</w:t>
-            </w:r>
-            <w:r>
-              <w:fldChar w:fldCharType="end"/>
-            </w:r>
-          </w:p>
-        </w:tc>
-        <w:tc>
-          <w:tcPr>
-            <w:tcW w:w="2303" w:type="dxa"/>
-          </w:tcPr>
-          <w:p>
-            <w:pPr>
-              <w:spacing w:before="60" w:after="60"/>
-            </w:pPr>
-            <w:r>
-              <w:fldChar w:fldCharType="begin">
-                <w:ffData>
-                  <w:name w:val=""/>
-                  <w:enabled/>
-                  <w:calcOnExit w:val="0"/>
-                  <w:textInput>
-                    <w:default w:val="&lt;z.B. auf Qualität, Kosten, Termin...&gt;"/>
-                  </w:textInput>
-                </w:ffData>
-              </w:fldChar>
-            </w:r>
-            <w:r>
-              <w:instrText xml:space="preserve"> FORMTEXT </w:instrText>
-            </w:r>
-            <w:r>
-              <w:fldChar w:fldCharType="separate"/>
-            </w:r>
-            <w:r>
-              <w:rPr>
-                <w:noProof/>
-              </w:rPr>
-              <w:t>&lt;z.B. auf Qualität, Kosten, Termin...&gt;</w:t>
-            </w:r>
-            <w:r>
-              <w:fldChar w:fldCharType="end"/>
-            </w:r>
-          </w:p>
-        </w:tc>
-        <w:tc>
-          <w:tcPr>
-            <w:tcW w:w="2303" w:type="dxa"/>
-          </w:tcPr>
-          <w:p>
-            <w:pPr>
-              <w:spacing w:before="60" w:after="60"/>
-            </w:pPr>
-            <w:r>
-              <w:rPr>
-                <w:bCs/>
-              </w:rPr>
-              <w:fldChar w:fldCharType="begin">
-                <w:ffData>
-                  <w:name w:val=""/>
-                  <w:enabled/>
-                  <w:calcOnExit w:val="0"/>
-                  <w:textInput>
-                    <w:default w:val="&lt;PSP-Code: AP-Name&gt;"/>
-                  </w:textInput>
-                </w:ffData>
-              </w:fldChar>
-            </w:r>
-            <w:r>
-              <w:rPr>
-                <w:bCs/>
-              </w:rPr>
-              <w:instrText xml:space="preserve"> FORMTEXT </w:instrText>
-            </w:r>
-            <w:r>
-              <w:rPr>
-                <w:bCs/>
-              </w:rPr>
-            </w:r>
-            <w:r>
-              <w:rPr>
-                <w:bCs/>
-              </w:rPr>
-              <w:fldChar w:fldCharType="separate"/>
-            </w:r>
-            <w:r>
-              <w:rPr>
-                <w:bCs/>
-                <w:noProof/>
-              </w:rPr>
-              <w:t>&lt;PSP-Code: AP-Name&gt;</w:t>
-            </w:r>
-            <w:r>
-              <w:rPr>
-                <w:bCs/>
-              </w:rPr>
-              <w:fldChar w:fldCharType="end"/>
+              <w:t>Zeitpuffer einplanen. Aufgaben priorisieren.</w:t>
             </w:r>
           </w:p>
         </w:tc>
@@ -3755,42 +3655,297 @@
       <w:tr>
         <w:tc>
           <w:tcPr>
-            <w:tcW w:w="2302" w:type="dxa"/>
-          </w:tcPr>
-          <w:p>
-            <w:pPr>
-              <w:spacing w:before="60" w:after="60"/>
-            </w:pPr>
-          </w:p>
-        </w:tc>
-        <w:tc>
-          <w:tcPr>
-            <w:tcW w:w="2302" w:type="dxa"/>
-          </w:tcPr>
-          <w:p>
-            <w:pPr>
-              <w:spacing w:before="60" w:after="60"/>
-            </w:pPr>
-          </w:p>
-        </w:tc>
-        <w:tc>
-          <w:tcPr>
-            <w:tcW w:w="2303" w:type="dxa"/>
-          </w:tcPr>
-          <w:p>
-            <w:pPr>
-              <w:spacing w:before="60" w:after="60"/>
-            </w:pPr>
-          </w:p>
-        </w:tc>
-        <w:tc>
-          <w:tcPr>
-            <w:tcW w:w="2303" w:type="dxa"/>
-          </w:tcPr>
-          <w:p>
-            <w:pPr>
-              <w:spacing w:before="60" w:after="60"/>
-            </w:pPr>
+            <w:tcW w:w="2285" w:type="dxa"/>
+          </w:tcPr>
+          <w:p>
+            <w:pPr>
+              <w:spacing w:before="60" w:after="60"/>
+            </w:pPr>
+            <w:r>
+              <w:t>Probleme bei Echtzeit-Synchronisation.</w:t>
+            </w:r>
+            <w:r>
+              <w:t xml:space="preserve"> (SignalR)</w:t>
+            </w:r>
+          </w:p>
+        </w:tc>
+        <w:tc>
+          <w:tcPr>
+            <w:tcW w:w="2280" w:type="dxa"/>
+          </w:tcPr>
+          <w:p>
+            <w:pPr>
+              <w:spacing w:before="60" w:after="60"/>
+            </w:pPr>
+            <w:r>
+              <w:t>15%</w:t>
+            </w:r>
+          </w:p>
+        </w:tc>
+        <w:tc>
+          <w:tcPr>
+            <w:tcW w:w="2246" w:type="dxa"/>
+          </w:tcPr>
+          <w:p>
+            <w:pPr>
+              <w:spacing w:before="60" w:after="60"/>
+            </w:pPr>
+            <w:r>
+              <w:t>Fehlerhafte oder verzögerte Aktualisierung von Daten</w:t>
+            </w:r>
+          </w:p>
+        </w:tc>
+        <w:tc>
+          <w:tcPr>
+            <w:tcW w:w="2249" w:type="dxa"/>
+          </w:tcPr>
+          <w:p>
+            <w:pPr>
+              <w:spacing w:before="60" w:after="60"/>
+            </w:pPr>
+            <w:r>
+              <w:t>Frühzeitige Tests bei erster fertiger Implementation.</w:t>
+            </w:r>
+          </w:p>
+        </w:tc>
+      </w:tr>
+      <w:tr>
+        <w:tc>
+          <w:tcPr>
+            <w:tcW w:w="2285" w:type="dxa"/>
+          </w:tcPr>
+          <w:p>
+            <w:pPr>
+              <w:spacing w:before="60" w:after="60"/>
+            </w:pPr>
+            <w:r>
+              <w:t>Fehlerhafte Vordefinierung/</w:t>
+            </w:r>
+            <w:proofErr w:type="spellStart"/>
+            <w:r>
+              <w:t>planung</w:t>
+            </w:r>
+            <w:proofErr w:type="spellEnd"/>
+            <w:r>
+              <w:t xml:space="preserve"> der Datenbank</w:t>
+            </w:r>
+          </w:p>
+        </w:tc>
+        <w:tc>
+          <w:tcPr>
+            <w:tcW w:w="2280" w:type="dxa"/>
+          </w:tcPr>
+          <w:p>
+            <w:pPr>
+              <w:spacing w:before="60" w:after="60"/>
+            </w:pPr>
+            <w:r>
+              <w:t>15%</w:t>
+            </w:r>
+          </w:p>
+        </w:tc>
+        <w:tc>
+          <w:tcPr>
+            <w:tcW w:w="2246" w:type="dxa"/>
+          </w:tcPr>
+          <w:p>
+            <w:pPr>
+              <w:spacing w:before="60" w:after="60"/>
+            </w:pPr>
+            <w:r>
+              <w:t>Endpoints oder Funktionen im Frontend könnten nicht vorhandene Infos benötigen</w:t>
+            </w:r>
+          </w:p>
+        </w:tc>
+        <w:tc>
+          <w:tcPr>
+            <w:tcW w:w="2249" w:type="dxa"/>
+          </w:tcPr>
+          <w:p>
+            <w:pPr>
+              <w:spacing w:before="60" w:after="60"/>
+            </w:pPr>
+            <w:r>
+              <w:t>Genaue Überprüfung der Anforderungen.</w:t>
+            </w:r>
+          </w:p>
+          <w:p>
+            <w:pPr>
+              <w:spacing w:before="60" w:after="60"/>
+            </w:pPr>
+            <w:r>
+              <w:t>Features modular und frühzeitig testen.</w:t>
+            </w:r>
+          </w:p>
+        </w:tc>
+      </w:tr>
+      <w:tr>
+        <w:tc>
+          <w:tcPr>
+            <w:tcW w:w="2285" w:type="dxa"/>
+          </w:tcPr>
+          <w:p>
+            <w:pPr>
+              <w:spacing w:before="60" w:after="60"/>
+            </w:pPr>
+            <w:r>
+              <w:t>Fehler bei Workspace-Rechten</w:t>
+            </w:r>
+          </w:p>
+        </w:tc>
+        <w:tc>
+          <w:tcPr>
+            <w:tcW w:w="2280" w:type="dxa"/>
+          </w:tcPr>
+          <w:p>
+            <w:pPr>
+              <w:spacing w:before="60" w:after="60"/>
+            </w:pPr>
+            <w:r>
+              <w:t>20%</w:t>
+            </w:r>
+          </w:p>
+        </w:tc>
+        <w:tc>
+          <w:tcPr>
+            <w:tcW w:w="2246" w:type="dxa"/>
+          </w:tcPr>
+          <w:p>
+            <w:pPr>
+              <w:spacing w:before="60" w:after="60"/>
+            </w:pPr>
+            <w:r>
+              <w:t>Benutzer könnten Befehle ausführen zu denen sie nicht berechtigt sind.</w:t>
+            </w:r>
+          </w:p>
+        </w:tc>
+        <w:tc>
+          <w:tcPr>
+            <w:tcW w:w="2249" w:type="dxa"/>
+          </w:tcPr>
+          <w:p>
+            <w:pPr>
+              <w:spacing w:before="60" w:after="60"/>
+            </w:pPr>
+            <w:r>
+              <w:t xml:space="preserve">Funktionen mit allen Berechtigungstypen testen. </w:t>
+            </w:r>
+          </w:p>
+        </w:tc>
+      </w:tr>
+      <w:tr>
+        <w:tc>
+          <w:tcPr>
+            <w:tcW w:w="2285" w:type="dxa"/>
+          </w:tcPr>
+          <w:p>
+            <w:pPr>
+              <w:spacing w:before="60" w:after="60"/>
+            </w:pPr>
+            <w:r>
+              <w:t>Probleme mit dem HTTPS-Zertifikat</w:t>
+            </w:r>
+          </w:p>
+        </w:tc>
+        <w:tc>
+          <w:tcPr>
+            <w:tcW w:w="2280" w:type="dxa"/>
+          </w:tcPr>
+          <w:p>
+            <w:pPr>
+              <w:spacing w:before="60" w:after="60"/>
+            </w:pPr>
+            <w:r>
+              <w:t>20%</w:t>
+            </w:r>
+          </w:p>
+        </w:tc>
+        <w:tc>
+          <w:tcPr>
+            <w:tcW w:w="2246" w:type="dxa"/>
+          </w:tcPr>
+          <w:p>
+            <w:pPr>
+              <w:spacing w:before="60" w:after="60"/>
+            </w:pPr>
+            <w:r>
+              <w:t xml:space="preserve">Benutzer könnten die </w:t>
+            </w:r>
+            <w:proofErr w:type="spellStart"/>
+            <w:r>
+              <w:t>WebApp</w:t>
+            </w:r>
+            <w:proofErr w:type="spellEnd"/>
+            <w:r>
+              <w:t xml:space="preserve"> nicht erreichen.</w:t>
+            </w:r>
+          </w:p>
+        </w:tc>
+        <w:tc>
+          <w:tcPr>
+            <w:tcW w:w="2249" w:type="dxa"/>
+          </w:tcPr>
+          <w:p>
+            <w:pPr>
+              <w:spacing w:before="60" w:after="60"/>
+            </w:pPr>
+            <w:r>
+              <w:t>Möglichst früh implementieren und prüfen. Eventuell Hilfe von Experten holen.</w:t>
+            </w:r>
+          </w:p>
+        </w:tc>
+      </w:tr>
+      <w:tr>
+        <w:tc>
+          <w:tcPr>
+            <w:tcW w:w="2285" w:type="dxa"/>
+          </w:tcPr>
+          <w:p>
+            <w:pPr>
+              <w:spacing w:before="60" w:after="60"/>
+            </w:pPr>
+            <w:r>
+              <w:t>Azure-Guthaben aufgebraucht</w:t>
+            </w:r>
+          </w:p>
+        </w:tc>
+        <w:tc>
+          <w:tcPr>
+            <w:tcW w:w="2280" w:type="dxa"/>
+          </w:tcPr>
+          <w:p>
+            <w:pPr>
+              <w:spacing w:before="60" w:after="60"/>
+            </w:pPr>
+            <w:r>
+              <w:t>10%</w:t>
+            </w:r>
+          </w:p>
+        </w:tc>
+        <w:tc>
+          <w:tcPr>
+            <w:tcW w:w="2246" w:type="dxa"/>
+          </w:tcPr>
+          <w:p>
+            <w:pPr>
+              <w:spacing w:before="60" w:after="60"/>
+            </w:pPr>
+            <w:r>
+              <w:t>Datenbank kann nicht mehr gehostet werden.</w:t>
+            </w:r>
+          </w:p>
+        </w:tc>
+        <w:tc>
+          <w:tcPr>
+            <w:tcW w:w="2249" w:type="dxa"/>
+          </w:tcPr>
+          <w:p>
+            <w:pPr>
+              <w:spacing w:before="60" w:after="60"/>
+            </w:pPr>
+            <w:r>
+              <w:t>Guthaben im Auge behalten. Azure-Features kontrolliert nutzen.</w:t>
+            </w:r>
           </w:p>
         </w:tc>
       </w:tr>
@@ -13553,8 +13708,13 @@
             <w:pPr>
               <w:spacing w:before="60" w:after="60"/>
             </w:pPr>
-            <w:r>
-              <w:t>AP Inhalte / Ergebnisse:</w:t>
+            <w:proofErr w:type="gramStart"/>
+            <w:r>
+              <w:t>AP Inhalte</w:t>
+            </w:r>
+            <w:proofErr w:type="gramEnd"/>
+            <w:r>
+              <w:t xml:space="preserve"> / Ergebnisse:</w:t>
             </w:r>
           </w:p>
         </w:tc>
@@ -13939,8 +14099,13 @@
             <w:pPr>
               <w:spacing w:before="60" w:after="60"/>
             </w:pPr>
-            <w:r>
-              <w:t>AP Inhalte / Ergebnisse:</w:t>
+            <w:proofErr w:type="gramStart"/>
+            <w:r>
+              <w:t>AP Inhalte</w:t>
+            </w:r>
+            <w:proofErr w:type="gramEnd"/>
+            <w:r>
+              <w:t xml:space="preserve"> / Ergebnisse:</w:t>
             </w:r>
           </w:p>
         </w:tc>
@@ -14360,8 +14525,13 @@
             <w:pPr>
               <w:spacing w:before="60" w:after="60"/>
             </w:pPr>
-            <w:r>
-              <w:t>AP Inhalte / Ergebnisse:</w:t>
+            <w:proofErr w:type="gramStart"/>
+            <w:r>
+              <w:t>AP Inhalte</w:t>
+            </w:r>
+            <w:proofErr w:type="gramEnd"/>
+            <w:r>
+              <w:t xml:space="preserve"> / Ergebnisse:</w:t>
             </w:r>
           </w:p>
         </w:tc>
@@ -15079,12 +15249,14 @@
         </w:rPr>
         <w:t xml:space="preserve">Idealerweise fügen Sie an dieser Stelle einen Balkenplan Ihres Projekts ein. Diesen erstellen Sie mittels </w:t>
       </w:r>
+      <w:proofErr w:type="spellStart"/>
       <w:r>
         <w:rPr>
           <w:i/>
         </w:rPr>
         <w:t>ProjektLibre</w:t>
       </w:r>
+      <w:proofErr w:type="spellEnd"/>
       <w:r>
         <w:rPr>
           <w:i/>
@@ -18102,13 +18274,23 @@
                 <w:lang w:val="en-GB"/>
               </w:rPr>
             </w:pPr>
+            <w:proofErr w:type="spellStart"/>
             <w:r>
               <w:rPr>
                 <w:b/>
                 <w:bCs/>
                 <w:lang w:val="en-GB"/>
               </w:rPr>
-              <w:t>Teamarbeit:</w:t>
+              <w:t>Teamarbeit</w:t>
+            </w:r>
+            <w:proofErr w:type="spellEnd"/>
+            <w:r>
+              <w:rPr>
+                <w:b/>
+                <w:bCs/>
+                <w:lang w:val="en-GB"/>
+              </w:rPr>
+              <w:t>:</w:t>
             </w:r>
           </w:p>
           <w:p>
@@ -18368,7 +18550,25 @@
                 <w:bCs/>
                 <w:lang w:val="de-AT"/>
               </w:rPr>
-              <w:t xml:space="preserve"> Lernerfahrungen („Learnings“):</w:t>
+              <w:t xml:space="preserve"> Lernerfahrungen („</w:t>
+            </w:r>
+            <w:proofErr w:type="spellStart"/>
+            <w:r>
+              <w:rPr>
+                <w:b/>
+                <w:bCs/>
+                <w:lang w:val="de-AT"/>
+              </w:rPr>
+              <w:t>Learnings</w:t>
+            </w:r>
+            <w:proofErr w:type="spellEnd"/>
+            <w:r>
+              <w:rPr>
+                <w:b/>
+                <w:bCs/>
+                <w:lang w:val="de-AT"/>
+              </w:rPr>
+              <w:t>“):</w:t>
             </w:r>
           </w:p>
           <w:p>
@@ -19008,12 +19208,9 @@
     </w:tbl>
     <w:p/>
     <w:sectPr>
-      <w:headerReference w:type="even" r:id="rId10"/>
-      <w:headerReference w:type="default" r:id="rId11"/>
-      <w:footerReference w:type="even" r:id="rId12"/>
-      <w:footerReference w:type="default" r:id="rId13"/>
-      <w:headerReference w:type="first" r:id="rId14"/>
-      <w:footerReference w:type="first" r:id="rId15"/>
+      <w:headerReference w:type="default" r:id="rId10"/>
+      <w:footerReference w:type="default" r:id="rId11"/>
+      <w:headerReference w:type="first" r:id="rId12"/>
       <w:pgSz w:w="11906" w:h="16838"/>
       <w:pgMar w:top="1985" w:right="1418" w:bottom="1134" w:left="1418" w:header="709" w:footer="709" w:gutter="0"/>
       <w:cols w:space="708"/>
@@ -19048,16 +19245,6 @@
   <w:p>
     <w:pPr>
       <w:pStyle w:val="Fuzeile"/>
-    </w:pPr>
-  </w:p>
-</w:ftr>
-</file>
-
-<file path=word/footer2.xml><?xml version="1.0" encoding="utf-8"?>
-<w:ftr xmlns:wpc="http://schemas.microsoft.com/office/word/2010/wordprocessingCanvas" xmlns:cx="http://schemas.microsoft.com/office/drawing/2014/chartex" xmlns:cx1="http://schemas.microsoft.com/office/drawing/2015/9/8/chartex" xmlns:cx2="http://schemas.microsoft.com/office/drawing/2015/10/21/chartex" xmlns:cx3="http://schemas.microsoft.com/office/drawing/2016/5/9/chartex" xmlns:cx4="http://schemas.microsoft.com/office/drawing/2016/5/10/chartex" xmlns:cx5="http://schemas.microsoft.com/office/drawing/2016/5/11/chartex" xmlns:cx6="http://schemas.microsoft.com/office/drawing/2016/5/12/chartex" xmlns:cx7="http://schemas.microsoft.com/office/drawing/2016/5/13/chartex" xmlns:cx8="http://schemas.microsoft.com/office/drawing/2016/5/14/chartex" xmlns:mc="http://schemas.openxmlformats.org/markup-compatibility/2006" xmlns:aink="http://schemas.microsoft.com/office/drawing/2016/ink" xmlns:am3d="http://schemas.microsoft.com/office/drawing/2017/model3d" xmlns:o="urn:schemas-microsoft-com:office:office" xmlns:oel="http://schemas.microsoft.com/office/2019/extlst" xmlns:r="http://schemas.openxmlformats.org/officeDocument/2006/relationships" xmlns:m="http://schemas.openxmlformats.org/officeDocument/2006/math" xmlns:v="urn:schemas-microsoft-com:vml" xmlns:wp14="http://schemas.microsoft.com/office/word/2010/wordprocessingDrawing" xmlns:wp="http://schemas.openxmlformats.org/drawingml/2006/wordprocessingDrawing" xmlns:w10="urn:schemas-microsoft-com:office:word" xmlns:w="http://schemas.openxmlformats.org/wordprocessingml/2006/main" xmlns:w14="http://schemas.microsoft.com/office/word/2010/wordml" xmlns:w15="http://schemas.microsoft.com/office/word/2012/wordml" xmlns:w16cex="http://schemas.microsoft.com/office/word/2018/wordml/cex" xmlns:w16cid="http://schemas.microsoft.com/office/word/2016/wordml/cid" xmlns:w16="http://schemas.microsoft.com/office/word/2018/wordml" xmlns:w16du="http://schemas.microsoft.com/office/word/2023/wordml/word16du" xmlns:w16sdtdh="http://schemas.microsoft.com/office/word/2020/wordml/sdtdatahash" xmlns:w16sdtfl="http://schemas.microsoft.com/office/word/2024/wordml/sdtformatlock" xmlns:w16se="http://schemas.microsoft.com/office/word/2015/wordml/symex" xmlns:wpg="http://schemas.microsoft.com/office/word/2010/wordprocessingGroup" xmlns:wpi="http://schemas.microsoft.com/office/word/2010/wordprocessingInk" xmlns:wne="http://schemas.microsoft.com/office/word/2006/wordml" xmlns:wps="http://schemas.microsoft.com/office/word/2010/wordprocessingShape" mc:Ignorable="w14 w15 w16se w16cid w16 w16cex w16sdtdh w16sdtfl w16du wp14">
-  <w:p>
-    <w:pPr>
-      <w:pStyle w:val="Fuzeile"/>
       <w:rPr>
         <w:sz w:val="16"/>
       </w:rPr>
@@ -19066,7 +19253,7 @@
       <w:rPr>
         <w:sz w:val="16"/>
       </w:rPr>
-      <w:t>Vor- und Nachname</w:t>
+      <w:t>Christian Riepl</w:t>
     </w:r>
     <w:r>
       <w:rPr>
@@ -19122,7 +19309,7 @@
         <w:noProof/>
         <w:sz w:val="16"/>
       </w:rPr>
-      <w:t>08.05.2026</w:t>
+      <w:t>19.05.2026</w:t>
     </w:r>
     <w:r>
       <w:rPr>
@@ -19190,16 +19377,6 @@
 </w:ftr>
 </file>
 
-<file path=word/footer3.xml><?xml version="1.0" encoding="utf-8"?>
-<w:ftr xmlns:wpc="http://schemas.microsoft.com/office/word/2010/wordprocessingCanvas" xmlns:cx="http://schemas.microsoft.com/office/drawing/2014/chartex" xmlns:cx1="http://schemas.microsoft.com/office/drawing/2015/9/8/chartex" xmlns:cx2="http://schemas.microsoft.com/office/drawing/2015/10/21/chartex" xmlns:cx3="http://schemas.microsoft.com/office/drawing/2016/5/9/chartex" xmlns:cx4="http://schemas.microsoft.com/office/drawing/2016/5/10/chartex" xmlns:cx5="http://schemas.microsoft.com/office/drawing/2016/5/11/chartex" xmlns:cx6="http://schemas.microsoft.com/office/drawing/2016/5/12/chartex" xmlns:cx7="http://schemas.microsoft.com/office/drawing/2016/5/13/chartex" xmlns:cx8="http://schemas.microsoft.com/office/drawing/2016/5/14/chartex" xmlns:mc="http://schemas.openxmlformats.org/markup-compatibility/2006" xmlns:aink="http://schemas.microsoft.com/office/drawing/2016/ink" xmlns:am3d="http://schemas.microsoft.com/office/drawing/2017/model3d" xmlns:o="urn:schemas-microsoft-com:office:office" xmlns:oel="http://schemas.microsoft.com/office/2019/extlst" xmlns:r="http://schemas.openxmlformats.org/officeDocument/2006/relationships" xmlns:m="http://schemas.openxmlformats.org/officeDocument/2006/math" xmlns:v="urn:schemas-microsoft-com:vml" xmlns:wp14="http://schemas.microsoft.com/office/word/2010/wordprocessingDrawing" xmlns:wp="http://schemas.openxmlformats.org/drawingml/2006/wordprocessingDrawing" xmlns:w10="urn:schemas-microsoft-com:office:word" xmlns:w="http://schemas.openxmlformats.org/wordprocessingml/2006/main" xmlns:w14="http://schemas.microsoft.com/office/word/2010/wordml" xmlns:w15="http://schemas.microsoft.com/office/word/2012/wordml" xmlns:w16cex="http://schemas.microsoft.com/office/word/2018/wordml/cex" xmlns:w16cid="http://schemas.microsoft.com/office/word/2016/wordml/cid" xmlns:w16="http://schemas.microsoft.com/office/word/2018/wordml" xmlns:w16du="http://schemas.microsoft.com/office/word/2023/wordml/word16du" xmlns:w16sdtdh="http://schemas.microsoft.com/office/word/2020/wordml/sdtdatahash" xmlns:w16sdtfl="http://schemas.microsoft.com/office/word/2024/wordml/sdtformatlock" xmlns:w16se="http://schemas.microsoft.com/office/word/2015/wordml/symex" xmlns:wpg="http://schemas.microsoft.com/office/word/2010/wordprocessingGroup" xmlns:wpi="http://schemas.microsoft.com/office/word/2010/wordprocessingInk" xmlns:wne="http://schemas.microsoft.com/office/word/2006/wordml" xmlns:wps="http://schemas.microsoft.com/office/word/2010/wordprocessingShape" mc:Ignorable="w14 w15 w16se w16cid w16 w16cex w16sdtdh w16sdtfl w16du wp14">
-  <w:p>
-    <w:pPr>
-      <w:pStyle w:val="Fuzeile"/>
-    </w:pPr>
-  </w:p>
-</w:ftr>
-</file>
-
 <file path=word/footnotes.xml><?xml version="1.0" encoding="utf-8"?>
 <w:footnotes xmlns:wpc="http://schemas.microsoft.com/office/word/2010/wordprocessingCanvas" xmlns:cx="http://schemas.microsoft.com/office/drawing/2014/chartex" xmlns:cx1="http://schemas.microsoft.com/office/drawing/2015/9/8/chartex" xmlns:cx2="http://schemas.microsoft.com/office/drawing/2015/10/21/chartex" xmlns:cx3="http://schemas.microsoft.com/office/drawing/2016/5/9/chartex" xmlns:cx4="http://schemas.microsoft.com/office/drawing/2016/5/10/chartex" xmlns:cx5="http://schemas.microsoft.com/office/drawing/2016/5/11/chartex" xmlns:cx6="http://schemas.microsoft.com/office/drawing/2016/5/12/chartex" xmlns:cx7="http://schemas.microsoft.com/office/drawing/2016/5/13/chartex" xmlns:cx8="http://schemas.microsoft.com/office/drawing/2016/5/14/chartex" xmlns:mc="http://schemas.openxmlformats.org/markup-compatibility/2006" xmlns:aink="http://schemas.microsoft.com/office/drawing/2016/ink" xmlns:am3d="http://schemas.microsoft.com/office/drawing/2017/model3d" xmlns:o="urn:schemas-microsoft-com:office:office" xmlns:oel="http://schemas.microsoft.com/office/2019/extlst" xmlns:r="http://schemas.openxmlformats.org/officeDocument/2006/relationships" xmlns:m="http://schemas.openxmlformats.org/officeDocument/2006/math" xmlns:v="urn:schemas-microsoft-com:vml" xmlns:wp14="http://schemas.microsoft.com/office/word/2010/wordprocessingDrawing" xmlns:wp="http://schemas.openxmlformats.org/drawingml/2006/wordprocessingDrawing" xmlns:w10="urn:schemas-microsoft-com:office:word" xmlns:w="http://schemas.openxmlformats.org/wordprocessingml/2006/main" xmlns:w14="http://schemas.microsoft.com/office/word/2010/wordml" xmlns:w15="http://schemas.microsoft.com/office/word/2012/wordml" xmlns:w16cex="http://schemas.microsoft.com/office/word/2018/wordml/cex" xmlns:w16cid="http://schemas.microsoft.com/office/word/2016/wordml/cid" xmlns:w16="http://schemas.microsoft.com/office/word/2018/wordml" xmlns:w16du="http://schemas.microsoft.com/office/word/2023/wordml/word16du" xmlns:w16sdtdh="http://schemas.microsoft.com/office/word/2020/wordml/sdtdatahash" xmlns:w16sdtfl="http://schemas.microsoft.com/office/word/2024/wordml/sdtformatlock" xmlns:w16se="http://schemas.microsoft.com/office/word/2015/wordml/symex" xmlns:wpg="http://schemas.microsoft.com/office/word/2010/wordprocessingGroup" xmlns:wpi="http://schemas.microsoft.com/office/word/2010/wordprocessingInk" xmlns:wne="http://schemas.microsoft.com/office/word/2006/wordml" xmlns:wps="http://schemas.microsoft.com/office/word/2010/wordprocessingShape" mc:Ignorable="w14 w15 w16se w16cid w16 w16cex w16sdtdh w16sdtfl w16du wp14">
   <w:footnote w:type="separator" w:id="-1">
@@ -19232,7 +19409,15 @@
       </w:r>
       <w:r>
         <w:tab/>
-        <w:t>Beispiel Versionierungs-Systematik: Arbeitsversionen 0.1, 0.2 etc. | Hauptversionen 1.0, 2.0 etc.</w:t>
+        <w:t xml:space="preserve">Beispiel </w:t>
+      </w:r>
+      <w:proofErr w:type="spellStart"/>
+      <w:r>
+        <w:t>Versionierungs</w:t>
+      </w:r>
+      <w:proofErr w:type="spellEnd"/>
+      <w:r>
+        <w:t>-Systematik: Arbeitsversionen 0.1, 0.2 etc. | Hauptversionen 1.0, 2.0 etc.</w:t>
       </w:r>
     </w:p>
   </w:footnote>
@@ -19252,7 +19437,15 @@
       </w:r>
       <w:r>
         <w:tab/>
-        <w:t xml:space="preserve">Die MindMapping Methode eignet sich besonders gut für die </w:t>
+        <w:t xml:space="preserve">Die </w:t>
+      </w:r>
+      <w:proofErr w:type="spellStart"/>
+      <w:r>
+        <w:t>MindMapping</w:t>
+      </w:r>
+      <w:proofErr w:type="spellEnd"/>
+      <w:r>
+        <w:t xml:space="preserve"> Methode eignet sich besonders gut für die </w:t>
       </w:r>
       <w:r>
         <w:rPr>
@@ -19401,16 +19594,6 @@
     <w:pPr>
       <w:pStyle w:val="Kopfzeile"/>
     </w:pPr>
-  </w:p>
-</w:hdr>
-</file>
-
-<file path=word/header2.xml><?xml version="1.0" encoding="utf-8"?>
-<w:hdr xmlns:wpc="http://schemas.microsoft.com/office/word/2010/wordprocessingCanvas" xmlns:cx="http://schemas.microsoft.com/office/drawing/2014/chartex" xmlns:cx1="http://schemas.microsoft.com/office/drawing/2015/9/8/chartex" xmlns:cx2="http://schemas.microsoft.com/office/drawing/2015/10/21/chartex" xmlns:cx3="http://schemas.microsoft.com/office/drawing/2016/5/9/chartex" xmlns:cx4="http://schemas.microsoft.com/office/drawing/2016/5/10/chartex" xmlns:cx5="http://schemas.microsoft.com/office/drawing/2016/5/11/chartex" xmlns:cx6="http://schemas.microsoft.com/office/drawing/2016/5/12/chartex" xmlns:cx7="http://schemas.microsoft.com/office/drawing/2016/5/13/chartex" xmlns:cx8="http://schemas.microsoft.com/office/drawing/2016/5/14/chartex" xmlns:mc="http://schemas.openxmlformats.org/markup-compatibility/2006" xmlns:aink="http://schemas.microsoft.com/office/drawing/2016/ink" xmlns:am3d="http://schemas.microsoft.com/office/drawing/2017/model3d" xmlns:o="urn:schemas-microsoft-com:office:office" xmlns:oel="http://schemas.microsoft.com/office/2019/extlst" xmlns:r="http://schemas.openxmlformats.org/officeDocument/2006/relationships" xmlns:m="http://schemas.openxmlformats.org/officeDocument/2006/math" xmlns:v="urn:schemas-microsoft-com:vml" xmlns:wp14="http://schemas.microsoft.com/office/word/2010/wordprocessingDrawing" xmlns:wp="http://schemas.openxmlformats.org/drawingml/2006/wordprocessingDrawing" xmlns:w10="urn:schemas-microsoft-com:office:word" xmlns:w="http://schemas.openxmlformats.org/wordprocessingml/2006/main" xmlns:w14="http://schemas.microsoft.com/office/word/2010/wordml" xmlns:w15="http://schemas.microsoft.com/office/word/2012/wordml" xmlns:w16cex="http://schemas.microsoft.com/office/word/2018/wordml/cex" xmlns:w16cid="http://schemas.microsoft.com/office/word/2016/wordml/cid" xmlns:w16="http://schemas.microsoft.com/office/word/2018/wordml" xmlns:w16du="http://schemas.microsoft.com/office/word/2023/wordml/word16du" xmlns:w16sdtdh="http://schemas.microsoft.com/office/word/2020/wordml/sdtdatahash" xmlns:w16sdtfl="http://schemas.microsoft.com/office/word/2024/wordml/sdtformatlock" xmlns:w16se="http://schemas.microsoft.com/office/word/2015/wordml/symex" xmlns:wpg="http://schemas.microsoft.com/office/word/2010/wordprocessingGroup" xmlns:wpi="http://schemas.microsoft.com/office/word/2010/wordprocessingInk" xmlns:wne="http://schemas.microsoft.com/office/word/2006/wordml" xmlns:wps="http://schemas.microsoft.com/office/word/2010/wordprocessingShape" mc:Ignorable="w14 w15 w16se w16cid w16 w16cex w16sdtdh w16sdtfl w16du wp14">
-  <w:p>
-    <w:pPr>
-      <w:pStyle w:val="Kopfzeile"/>
-    </w:pPr>
     <w:r>
       <w:rPr>
         <w:sz w:val="16"/>
@@ -19481,7 +19664,7 @@
 </w:hdr>
 </file>
 
-<file path=word/header3.xml><?xml version="1.0" encoding="utf-8"?>
+<file path=word/header2.xml><?xml version="1.0" encoding="utf-8"?>
 <w:hdr xmlns:wpc="http://schemas.microsoft.com/office/word/2010/wordprocessingCanvas" xmlns:cx="http://schemas.microsoft.com/office/drawing/2014/chartex" xmlns:cx1="http://schemas.microsoft.com/office/drawing/2015/9/8/chartex" xmlns:cx2="http://schemas.microsoft.com/office/drawing/2015/10/21/chartex" xmlns:cx3="http://schemas.microsoft.com/office/drawing/2016/5/9/chartex" xmlns:cx4="http://schemas.microsoft.com/office/drawing/2016/5/10/chartex" xmlns:cx5="http://schemas.microsoft.com/office/drawing/2016/5/11/chartex" xmlns:cx6="http://schemas.microsoft.com/office/drawing/2016/5/12/chartex" xmlns:cx7="http://schemas.microsoft.com/office/drawing/2016/5/13/chartex" xmlns:cx8="http://schemas.microsoft.com/office/drawing/2016/5/14/chartex" xmlns:mc="http://schemas.openxmlformats.org/markup-compatibility/2006" xmlns:aink="http://schemas.microsoft.com/office/drawing/2016/ink" xmlns:am3d="http://schemas.microsoft.com/office/drawing/2017/model3d" xmlns:o="urn:schemas-microsoft-com:office:office" xmlns:oel="http://schemas.microsoft.com/office/2019/extlst" xmlns:r="http://schemas.openxmlformats.org/officeDocument/2006/relationships" xmlns:m="http://schemas.openxmlformats.org/officeDocument/2006/math" xmlns:v="urn:schemas-microsoft-com:vml" xmlns:wp14="http://schemas.microsoft.com/office/word/2010/wordprocessingDrawing" xmlns:wp="http://schemas.openxmlformats.org/drawingml/2006/wordprocessingDrawing" xmlns:w10="urn:schemas-microsoft-com:office:word" xmlns:w="http://schemas.openxmlformats.org/wordprocessingml/2006/main" xmlns:w14="http://schemas.microsoft.com/office/word/2010/wordml" xmlns:w15="http://schemas.microsoft.com/office/word/2012/wordml" xmlns:w16cex="http://schemas.microsoft.com/office/word/2018/wordml/cex" xmlns:w16cid="http://schemas.microsoft.com/office/word/2016/wordml/cid" xmlns:w16="http://schemas.microsoft.com/office/word/2018/wordml" xmlns:w16du="http://schemas.microsoft.com/office/word/2023/wordml/word16du" xmlns:w16sdtdh="http://schemas.microsoft.com/office/word/2020/wordml/sdtdatahash" xmlns:w16sdtfl="http://schemas.microsoft.com/office/word/2024/wordml/sdtformatlock" xmlns:w16se="http://schemas.microsoft.com/office/word/2015/wordml/symex" xmlns:wpg="http://schemas.microsoft.com/office/word/2010/wordprocessingGroup" xmlns:wpi="http://schemas.microsoft.com/office/word/2010/wordprocessingInk" xmlns:wne="http://schemas.microsoft.com/office/word/2006/wordml" xmlns:wps="http://schemas.microsoft.com/office/word/2010/wordprocessingShape" mc:Ignorable="w14 w15 w16se w16cid w16 w16cex w16sdtdh w16sdtfl w16du wp14">
   <w:p>
     <w:pPr>

</xml_diff>

<commit_message>
[LOG] Further updates to documents: Pflichtenheft & Projektplan
</commit_message>
<xml_diff>
--- a/0_Documents/Projekthandbuch.docx
+++ b/0_Documents/Projekthandbuch.docx
@@ -433,7 +433,7 @@
       <w:r>
         <w:fldChar w:fldCharType="separate"/>
       </w:r>
-      <w:hyperlink w:anchor="_Toc230787808" w:history="1">
+      <w:hyperlink w:anchor="_Toc230788879" w:history="1">
         <w:r>
           <w:rPr>
             <w:rStyle w:val="Hyperlink"/>
@@ -473,7 +473,7 @@
           <w:rPr>
             <w:webHidden/>
           </w:rPr>
-          <w:instrText xml:space="preserve"> PAGEREF _Toc230787808 \h </w:instrText>
+          <w:instrText xml:space="preserve"> PAGEREF _Toc230788879 \h </w:instrText>
         </w:r>
         <w:r>
           <w:rPr>
@@ -512,7 +512,7 @@
           <w14:ligatures w14:val="standardContextual"/>
         </w:rPr>
       </w:pPr>
-      <w:hyperlink w:anchor="_Toc230787809" w:history="1">
+      <w:hyperlink w:anchor="_Toc230788880" w:history="1">
         <w:r>
           <w:rPr>
             <w:rStyle w:val="Hyperlink"/>
@@ -552,7 +552,7 @@
           <w:rPr>
             <w:webHidden/>
           </w:rPr>
-          <w:instrText xml:space="preserve"> PAGEREF _Toc230787809 \h </w:instrText>
+          <w:instrText xml:space="preserve"> PAGEREF _Toc230788880 \h </w:instrText>
         </w:r>
         <w:r>
           <w:rPr>
@@ -591,7 +591,7 @@
           <w14:ligatures w14:val="standardContextual"/>
         </w:rPr>
       </w:pPr>
-      <w:hyperlink w:anchor="_Toc230787810" w:history="1">
+      <w:hyperlink w:anchor="_Toc230788881" w:history="1">
         <w:r>
           <w:rPr>
             <w:rStyle w:val="Hyperlink"/>
@@ -631,7 +631,7 @@
           <w:rPr>
             <w:webHidden/>
           </w:rPr>
-          <w:instrText xml:space="preserve"> PAGEREF _Toc230787810 \h </w:instrText>
+          <w:instrText xml:space="preserve"> PAGEREF _Toc230788881 \h </w:instrText>
         </w:r>
         <w:r>
           <w:rPr>
@@ -670,7 +670,7 @@
           <w14:ligatures w14:val="standardContextual"/>
         </w:rPr>
       </w:pPr>
-      <w:hyperlink w:anchor="_Toc230787811" w:history="1">
+      <w:hyperlink w:anchor="_Toc230788882" w:history="1">
         <w:r>
           <w:rPr>
             <w:rStyle w:val="Hyperlink"/>
@@ -710,7 +710,7 @@
           <w:rPr>
             <w:webHidden/>
           </w:rPr>
-          <w:instrText xml:space="preserve"> PAGEREF _Toc230787811 \h </w:instrText>
+          <w:instrText xml:space="preserve"> PAGEREF _Toc230788882 \h </w:instrText>
         </w:r>
         <w:r>
           <w:rPr>
@@ -749,7 +749,7 @@
           <w14:ligatures w14:val="standardContextual"/>
         </w:rPr>
       </w:pPr>
-      <w:hyperlink w:anchor="_Toc230787812" w:history="1">
+      <w:hyperlink w:anchor="_Toc230788883" w:history="1">
         <w:r>
           <w:rPr>
             <w:rStyle w:val="Hyperlink"/>
@@ -789,7 +789,7 @@
           <w:rPr>
             <w:webHidden/>
           </w:rPr>
-          <w:instrText xml:space="preserve"> PAGEREF _Toc230787812 \h </w:instrText>
+          <w:instrText xml:space="preserve"> PAGEREF _Toc230788883 \h </w:instrText>
         </w:r>
         <w:r>
           <w:rPr>
@@ -828,7 +828,7 @@
           <w14:ligatures w14:val="standardContextual"/>
         </w:rPr>
       </w:pPr>
-      <w:hyperlink w:anchor="_Toc230787813" w:history="1">
+      <w:hyperlink w:anchor="_Toc230788884" w:history="1">
         <w:r>
           <w:rPr>
             <w:rStyle w:val="Hyperlink"/>
@@ -868,7 +868,7 @@
           <w:rPr>
             <w:webHidden/>
           </w:rPr>
-          <w:instrText xml:space="preserve"> PAGEREF _Toc230787813 \h </w:instrText>
+          <w:instrText xml:space="preserve"> PAGEREF _Toc230788884 \h </w:instrText>
         </w:r>
         <w:r>
           <w:rPr>
@@ -907,7 +907,7 @@
           <w14:ligatures w14:val="standardContextual"/>
         </w:rPr>
       </w:pPr>
-      <w:hyperlink w:anchor="_Toc230787814" w:history="1">
+      <w:hyperlink w:anchor="_Toc230788885" w:history="1">
         <w:r>
           <w:rPr>
             <w:rStyle w:val="Hyperlink"/>
@@ -947,7 +947,7 @@
           <w:rPr>
             <w:webHidden/>
           </w:rPr>
-          <w:instrText xml:space="preserve"> PAGEREF _Toc230787814 \h </w:instrText>
+          <w:instrText xml:space="preserve"> PAGEREF _Toc230788885 \h </w:instrText>
         </w:r>
         <w:r>
           <w:rPr>
@@ -986,7 +986,7 @@
           <w14:ligatures w14:val="standardContextual"/>
         </w:rPr>
       </w:pPr>
-      <w:hyperlink w:anchor="_Toc230787815" w:history="1">
+      <w:hyperlink w:anchor="_Toc230788886" w:history="1">
         <w:r>
           <w:rPr>
             <w:rStyle w:val="Hyperlink"/>
@@ -1026,7 +1026,7 @@
           <w:rPr>
             <w:webHidden/>
           </w:rPr>
-          <w:instrText xml:space="preserve"> PAGEREF _Toc230787815 \h </w:instrText>
+          <w:instrText xml:space="preserve"> PAGEREF _Toc230788886 \h </w:instrText>
         </w:r>
         <w:r>
           <w:rPr>
@@ -1065,7 +1065,7 @@
           <w14:ligatures w14:val="standardContextual"/>
         </w:rPr>
       </w:pPr>
-      <w:hyperlink w:anchor="_Toc230787816" w:history="1">
+      <w:hyperlink w:anchor="_Toc230788887" w:history="1">
         <w:r>
           <w:rPr>
             <w:rStyle w:val="Hyperlink"/>
@@ -1105,7 +1105,7 @@
           <w:rPr>
             <w:webHidden/>
           </w:rPr>
-          <w:instrText xml:space="preserve"> PAGEREF _Toc230787816 \h </w:instrText>
+          <w:instrText xml:space="preserve"> PAGEREF _Toc230788887 \h </w:instrText>
         </w:r>
         <w:r>
           <w:rPr>
@@ -1144,7 +1144,7 @@
           <w14:ligatures w14:val="standardContextual"/>
         </w:rPr>
       </w:pPr>
-      <w:hyperlink w:anchor="_Toc230787817" w:history="1">
+      <w:hyperlink w:anchor="_Toc230788888" w:history="1">
         <w:r>
           <w:rPr>
             <w:rStyle w:val="Hyperlink"/>
@@ -1167,7 +1167,7 @@
           <w:rPr>
             <w:webHidden/>
           </w:rPr>
-          <w:instrText xml:space="preserve"> PAGEREF _Toc230787817 \h </w:instrText>
+          <w:instrText xml:space="preserve"> PAGEREF _Toc230788888 \h </w:instrText>
         </w:r>
         <w:r>
           <w:rPr>
@@ -1206,7 +1206,7 @@
           <w14:ligatures w14:val="standardContextual"/>
         </w:rPr>
       </w:pPr>
-      <w:hyperlink w:anchor="_Toc230787818" w:history="1">
+      <w:hyperlink w:anchor="_Toc230788889" w:history="1">
         <w:r>
           <w:rPr>
             <w:rStyle w:val="Hyperlink"/>
@@ -1246,7 +1246,7 @@
           <w:rPr>
             <w:webHidden/>
           </w:rPr>
-          <w:instrText xml:space="preserve"> PAGEREF _Toc230787818 \h </w:instrText>
+          <w:instrText xml:space="preserve"> PAGEREF _Toc230788889 \h </w:instrText>
         </w:r>
         <w:r>
           <w:rPr>
@@ -1285,7 +1285,7 @@
           <w14:ligatures w14:val="standardContextual"/>
         </w:rPr>
       </w:pPr>
-      <w:hyperlink w:anchor="_Toc230787819" w:history="1">
+      <w:hyperlink w:anchor="_Toc230788890" w:history="1">
         <w:r>
           <w:rPr>
             <w:rStyle w:val="Hyperlink"/>
@@ -1325,7 +1325,7 @@
           <w:rPr>
             <w:webHidden/>
           </w:rPr>
-          <w:instrText xml:space="preserve"> PAGEREF _Toc230787819 \h </w:instrText>
+          <w:instrText xml:space="preserve"> PAGEREF _Toc230788890 \h </w:instrText>
         </w:r>
         <w:r>
           <w:rPr>
@@ -1364,7 +1364,7 @@
           <w14:ligatures w14:val="standardContextual"/>
         </w:rPr>
       </w:pPr>
-      <w:hyperlink w:anchor="_Toc230787820" w:history="1">
+      <w:hyperlink w:anchor="_Toc230788891" w:history="1">
         <w:r>
           <w:rPr>
             <w:rStyle w:val="Hyperlink"/>
@@ -1404,7 +1404,7 @@
           <w:rPr>
             <w:webHidden/>
           </w:rPr>
-          <w:instrText xml:space="preserve"> PAGEREF _Toc230787820 \h </w:instrText>
+          <w:instrText xml:space="preserve"> PAGEREF _Toc230788891 \h </w:instrText>
         </w:r>
         <w:r>
           <w:rPr>
@@ -1443,7 +1443,7 @@
           <w14:ligatures w14:val="standardContextual"/>
         </w:rPr>
       </w:pPr>
-      <w:hyperlink w:anchor="_Toc230787821" w:history="1">
+      <w:hyperlink w:anchor="_Toc230788892" w:history="1">
         <w:r>
           <w:rPr>
             <w:rStyle w:val="Hyperlink"/>
@@ -1483,7 +1483,7 @@
           <w:rPr>
             <w:webHidden/>
           </w:rPr>
-          <w:instrText xml:space="preserve"> PAGEREF _Toc230787821 \h </w:instrText>
+          <w:instrText xml:space="preserve"> PAGEREF _Toc230788892 \h </w:instrText>
         </w:r>
         <w:r>
           <w:rPr>
@@ -1522,7 +1522,7 @@
           <w14:ligatures w14:val="standardContextual"/>
         </w:rPr>
       </w:pPr>
-      <w:hyperlink w:anchor="_Toc230787822" w:history="1">
+      <w:hyperlink w:anchor="_Toc230788893" w:history="1">
         <w:r>
           <w:rPr>
             <w:rStyle w:val="Hyperlink"/>
@@ -1545,7 +1545,7 @@
           <w:rPr>
             <w:webHidden/>
           </w:rPr>
-          <w:instrText xml:space="preserve"> PAGEREF _Toc230787822 \h </w:instrText>
+          <w:instrText xml:space="preserve"> PAGEREF _Toc230788893 \h </w:instrText>
         </w:r>
         <w:r>
           <w:rPr>
@@ -1596,7 +1596,7 @@
       <w:bookmarkStart w:id="0" w:name="_Toc116286518"/>
       <w:bookmarkStart w:id="1" w:name="_Toc396809833"/>
       <w:bookmarkStart w:id="2" w:name="_Toc397882988"/>
-      <w:bookmarkStart w:id="3" w:name="_Toc230787808"/>
+      <w:bookmarkStart w:id="3" w:name="_Toc230788879"/>
       <w:r>
         <w:lastRenderedPageBreak/>
         <w:t>Änderungsverzeichnis</w:t>
@@ -2327,7 +2327,7 @@
       <w:bookmarkStart w:id="4" w:name="_Toc396809834"/>
       <w:bookmarkStart w:id="5" w:name="_Toc397882989"/>
       <w:bookmarkStart w:id="6" w:name="_Toc116286519"/>
-      <w:bookmarkStart w:id="7" w:name="_Toc230787809"/>
+      <w:bookmarkStart w:id="7" w:name="_Toc230788880"/>
       <w:r>
         <w:lastRenderedPageBreak/>
         <w:t>Teamregeln</w:t>
@@ -2741,7 +2741,7 @@
       </w:pPr>
       <w:bookmarkStart w:id="8" w:name="_Toc397882990"/>
       <w:bookmarkStart w:id="9" w:name="_Toc396809835"/>
-      <w:bookmarkStart w:id="10" w:name="_Toc230787810"/>
+      <w:bookmarkStart w:id="10" w:name="_Toc230788881"/>
       <w:r>
         <w:lastRenderedPageBreak/>
         <w:t>Zielfindung</w:t>
@@ -3537,7 +3537,7 @@
       <w:bookmarkStart w:id="11" w:name="_Toc116286528"/>
       <w:bookmarkStart w:id="12" w:name="_Toc396809844"/>
       <w:bookmarkStart w:id="13" w:name="_Toc397882991"/>
-      <w:bookmarkStart w:id="14" w:name="_Toc230787811"/>
+      <w:bookmarkStart w:id="14" w:name="_Toc230788882"/>
       <w:r>
         <w:lastRenderedPageBreak/>
         <w:t>Projektrisiken</w:t>
@@ -3601,7 +3601,7 @@
       <w:pPr>
         <w:pStyle w:val="berschrift1"/>
       </w:pPr>
-      <w:bookmarkStart w:id="18" w:name="_Toc230787812"/>
+      <w:bookmarkStart w:id="18" w:name="_Toc230788883"/>
       <w:r>
         <w:t>Projektzieleplan</w:t>
       </w:r>
@@ -4075,7 +4075,7 @@
       <w:bookmarkStart w:id="20" w:name="_Toc116286521"/>
       <w:bookmarkStart w:id="21" w:name="_Toc396809837"/>
       <w:bookmarkStart w:id="22" w:name="_Toc397882993"/>
-      <w:bookmarkStart w:id="23" w:name="_Toc230787813"/>
+      <w:bookmarkStart w:id="23" w:name="_Toc230788884"/>
       <w:r>
         <w:lastRenderedPageBreak/>
         <w:t>Projektkontext</w:t>
@@ -4781,7 +4781,7 @@
         <w:br w:type="page"/>
       </w:r>
       <w:bookmarkStart w:id="24" w:name="_Toc397882994"/>
-      <w:bookmarkStart w:id="25" w:name="_Toc230787814"/>
+      <w:bookmarkStart w:id="25" w:name="_Toc230788885"/>
       <w:r>
         <w:lastRenderedPageBreak/>
         <w:t>Projektorganisation</w:t>
@@ -6051,7 +6051,7 @@
       <w:r>
         <w:br w:type="page"/>
       </w:r>
-      <w:bookmarkStart w:id="26" w:name="_Toc230787815"/>
+      <w:bookmarkStart w:id="26" w:name="_Toc230788886"/>
       <w:bookmarkEnd w:id="6"/>
       <w:bookmarkEnd w:id="9"/>
       <w:r>
@@ -7040,13 +7040,7 @@
               <w:spacing w:before="60" w:after="60"/>
             </w:pPr>
             <w:r>
-              <w:t xml:space="preserve">Hubs </w:t>
-            </w:r>
-            <w:r>
-              <w:t xml:space="preserve">und Hooks </w:t>
-            </w:r>
-            <w:r>
-              <w:t xml:space="preserve">für die Zusammenarbeit in Workspaces implementieren </w:t>
+              <w:t xml:space="preserve">Hubs und Hooks für die Zusammenarbeit in Workspaces implementieren </w:t>
             </w:r>
           </w:p>
           <w:p>
@@ -7857,7 +7851,7 @@
       <w:bookmarkStart w:id="35" w:name="_Toc116286523"/>
       <w:bookmarkStart w:id="36" w:name="_Toc396809839"/>
       <w:bookmarkStart w:id="37" w:name="_Toc397882996"/>
-      <w:bookmarkStart w:id="38" w:name="_Toc230787816"/>
+      <w:bookmarkStart w:id="38" w:name="_Toc230788887"/>
       <w:r>
         <w:lastRenderedPageBreak/>
         <w:t>Projektstrukturplan (PSP)</w:t>
@@ -7885,6 +7879,7 @@
       <w:r>
         <w:rPr>
           <w:rFonts w:cs="Arial"/>
+          <w:noProof/>
         </w:rPr>
         <w:drawing>
           <wp:inline distT="0" distB="0" distL="0" distR="0" wp14:anchorId="0FC9701B" wp14:editId="3F9A492F">
@@ -7988,7 +7983,7 @@
       <w:bookmarkStart w:id="39" w:name="_Toc116286524"/>
       <w:bookmarkStart w:id="40" w:name="_Toc396809840"/>
       <w:bookmarkStart w:id="41" w:name="_Toc397882997"/>
-      <w:bookmarkStart w:id="42" w:name="_Toc230787817"/>
+      <w:bookmarkStart w:id="42" w:name="_Toc230788888"/>
       <w:r>
         <w:lastRenderedPageBreak/>
         <w:t>AP-Spezifikation / AP Beschreibung</w:t>
@@ -8392,7 +8387,14 @@
               <w:spacing w:before="60" w:after="60"/>
             </w:pPr>
             <w:r>
-              <w:t>Implementierung einer Rest-Like API. Endpoints sind (Feature-basiert).</w:t>
+              <w:t xml:space="preserve">Implementierung einer Rest-Like API. </w:t>
+            </w:r>
+            <w:r>
+              <w:br/>
+              <w:t>(</w:t>
+            </w:r>
+            <w:r>
+              <w:t>Endpoints sind Feature-basiert).</w:t>
             </w:r>
           </w:p>
           <w:p>
@@ -8411,6 +8413,24 @@
               <w:t>only</w:t>
             </w:r>
             <w:proofErr w:type="spellEnd"/>
+          </w:p>
+          <w:p>
+            <w:pPr>
+              <w:spacing w:before="60" w:after="60"/>
+              <w:ind w:left="720"/>
+            </w:pPr>
+          </w:p>
+          <w:p>
+            <w:pPr>
+              <w:numPr>
+                <w:ilvl w:val="0"/>
+                <w:numId w:val="5"/>
+              </w:numPr>
+              <w:spacing w:before="60" w:after="60"/>
+            </w:pPr>
+            <w:r>
+              <w:t>Erste API-Aufrufe wurden getätigt, sowie Login konnte getestet werden. Es wurden keine Probleme festgestellt.</w:t>
+            </w:r>
           </w:p>
         </w:tc>
       </w:tr>
@@ -8751,6 +8771,32 @@
               <w:t xml:space="preserve"> </w:t>
             </w:r>
           </w:p>
+          <w:p>
+            <w:pPr>
+              <w:spacing w:before="60" w:after="60"/>
+              <w:ind w:left="720"/>
+            </w:pPr>
+          </w:p>
+          <w:p>
+            <w:pPr>
+              <w:numPr>
+                <w:ilvl w:val="0"/>
+                <w:numId w:val="5"/>
+              </w:numPr>
+              <w:spacing w:before="60" w:after="60"/>
+            </w:pPr>
+            <w:r>
+              <w:t xml:space="preserve">Tests zu Hubs und Hooks können erst sicher getestet werden, wenn ein Feature im Frontend gebaut </w:t>
+            </w:r>
+            <w:proofErr w:type="gramStart"/>
+            <w:r>
+              <w:t>ist</w:t>
+            </w:r>
+            <w:proofErr w:type="gramEnd"/>
+            <w:r>
+              <w:t xml:space="preserve"> </w:t>
+            </w:r>
+          </w:p>
         </w:tc>
       </w:tr>
       <w:tr>
@@ -8924,7 +8970,7 @@
       <w:bookmarkStart w:id="44" w:name="_Toc116286525"/>
       <w:bookmarkStart w:id="45" w:name="_Toc396809841"/>
       <w:bookmarkStart w:id="46" w:name="_Toc397882998"/>
-      <w:bookmarkStart w:id="47" w:name="_Toc230787818"/>
+      <w:bookmarkStart w:id="47" w:name="_Toc230788889"/>
       <w:r>
         <w:lastRenderedPageBreak/>
         <w:t>Projektmeilensteinplan</w:t>
@@ -9328,7 +9374,7 @@
       <w:bookmarkStart w:id="48" w:name="_Toc116286526"/>
       <w:bookmarkStart w:id="49" w:name="_Toc396809842"/>
       <w:bookmarkStart w:id="50" w:name="_Toc397882999"/>
-      <w:bookmarkStart w:id="51" w:name="_Toc230787819"/>
+      <w:bookmarkStart w:id="51" w:name="_Toc230788890"/>
       <w:r>
         <w:lastRenderedPageBreak/>
         <w:t>Projektterminplan</w:t>
@@ -9787,7 +9833,7 @@
       <w:bookmarkStart w:id="52" w:name="_Toc116286527"/>
       <w:bookmarkStart w:id="53" w:name="_Toc396809843"/>
       <w:bookmarkStart w:id="54" w:name="_Toc397883000"/>
-      <w:bookmarkStart w:id="55" w:name="_Toc230787820"/>
+      <w:bookmarkStart w:id="55" w:name="_Toc230788891"/>
       <w:r>
         <w:lastRenderedPageBreak/>
         <w:t>Projektkostenplan / Zeiterfassung</w:t>
@@ -10358,7 +10404,7 @@
         <w:pStyle w:val="berschrift1"/>
       </w:pPr>
       <w:bookmarkStart w:id="58" w:name="_Toc397883001"/>
-      <w:bookmarkStart w:id="59" w:name="_Toc230787821"/>
+      <w:bookmarkStart w:id="59" w:name="_Toc230788892"/>
       <w:r>
         <w:lastRenderedPageBreak/>
         <w:t>Projektfortschrittsbericht</w:t>
@@ -12146,7 +12192,7 @@
       <w:bookmarkStart w:id="60" w:name="_Toc116286530"/>
       <w:bookmarkStart w:id="61" w:name="_Toc396809846"/>
       <w:bookmarkStart w:id="62" w:name="_Toc397883002"/>
-      <w:bookmarkStart w:id="63" w:name="_Toc230787822"/>
+      <w:bookmarkStart w:id="63" w:name="_Toc230788893"/>
       <w:r>
         <w:lastRenderedPageBreak/>
         <w:t>Projektabschluss</w:t>

</xml_diff>

<commit_message>
[LOG] Updated documents: "Pflichtenheft" and "Projekthandbuch"
</commit_message>
<xml_diff>
--- a/0_Documents/Projekthandbuch.docx
+++ b/0_Documents/Projekthandbuch.docx
@@ -2211,6 +2211,201 @@
           </w:p>
         </w:tc>
       </w:tr>
+      <w:tr>
+        <w:tc>
+          <w:tcPr>
+            <w:tcW w:w="1389" w:type="dxa"/>
+          </w:tcPr>
+          <w:p>
+            <w:pPr>
+              <w:spacing w:before="60" w:after="60"/>
+              <w:jc w:val="center"/>
+            </w:pPr>
+            <w:r>
+              <w:t>0.1.6</w:t>
+            </w:r>
+          </w:p>
+        </w:tc>
+        <w:tc>
+          <w:tcPr>
+            <w:tcW w:w="1392" w:type="dxa"/>
+          </w:tcPr>
+          <w:p>
+            <w:pPr>
+              <w:spacing w:before="60" w:after="60"/>
+              <w:jc w:val="center"/>
+            </w:pPr>
+            <w:r>
+              <w:t>27.05.2026</w:t>
+            </w:r>
+          </w:p>
+        </w:tc>
+        <w:tc>
+          <w:tcPr>
+            <w:tcW w:w="4852" w:type="dxa"/>
+          </w:tcPr>
+          <w:p>
+            <w:pPr>
+              <w:spacing w:before="60" w:after="60"/>
+            </w:pPr>
+            <w:r>
+              <w:t>Tooltip-Provider und Komponente implementiert.</w:t>
+            </w:r>
+          </w:p>
+          <w:p>
+            <w:pPr>
+              <w:spacing w:before="60" w:after="60"/>
+            </w:pPr>
+            <w:r>
+              <w:t>AccountModal-Komponente erstellt.</w:t>
+            </w:r>
+          </w:p>
+          <w:p>
+            <w:pPr>
+              <w:spacing w:before="60" w:after="60"/>
+            </w:pPr>
+            <w:r>
+              <w:t>Friends-Modul zum Dashboard hinzugefügt und globales Friends-Panel implementiert.</w:t>
+            </w:r>
+          </w:p>
+        </w:tc>
+        <w:tc>
+          <w:tcPr>
+            <w:tcW w:w="1427" w:type="dxa"/>
+          </w:tcPr>
+          <w:p>
+            <w:pPr>
+              <w:spacing w:before="60" w:after="60"/>
+              <w:jc w:val="center"/>
+            </w:pPr>
+            <w:r>
+              <w:t>Christian Riepl</w:t>
+            </w:r>
+          </w:p>
+        </w:tc>
+      </w:tr>
+      <w:tr>
+        <w:tc>
+          <w:tcPr>
+            <w:tcW w:w="1389" w:type="dxa"/>
+          </w:tcPr>
+          <w:p>
+            <w:pPr>
+              <w:spacing w:before="60" w:after="60"/>
+              <w:jc w:val="center"/>
+            </w:pPr>
+            <w:r>
+              <w:t>0.1.7</w:t>
+            </w:r>
+          </w:p>
+        </w:tc>
+        <w:tc>
+          <w:tcPr>
+            <w:tcW w:w="1392" w:type="dxa"/>
+          </w:tcPr>
+          <w:p>
+            <w:pPr>
+              <w:spacing w:before="60" w:after="60"/>
+              <w:jc w:val="center"/>
+            </w:pPr>
+            <w:r>
+              <w:t>28.05.2026</w:t>
+            </w:r>
+          </w:p>
+        </w:tc>
+        <w:tc>
+          <w:tcPr>
+            <w:tcW w:w="4852" w:type="dxa"/>
+          </w:tcPr>
+          <w:p>
+            <w:pPr>
+              <w:spacing w:before="60" w:after="60"/>
+            </w:pPr>
+            <w:r>
+              <w:t xml:space="preserve">Providers implementiert: Modal-Provider </w:t>
+            </w:r>
+            <w:r>
+              <w:t>und</w:t>
+            </w:r>
+            <w:r>
+              <w:t xml:space="preserve"> Alert-Provider. </w:t>
+            </w:r>
+          </w:p>
+          <w:p>
+            <w:pPr>
+              <w:spacing w:before="60" w:after="60"/>
+            </w:pPr>
+            <w:r>
+              <w:t>Recents</w:t>
+            </w:r>
+            <w:r>
+              <w:t>-</w:t>
+            </w:r>
+            <w:r>
+              <w:t>Modul</w:t>
+            </w:r>
+            <w:r>
+              <w:t xml:space="preserve"> erstellt</w:t>
+            </w:r>
+            <w:r>
+              <w:t xml:space="preserve"> f</w:t>
+            </w:r>
+            <w:r>
+              <w:t>ü</w:t>
+            </w:r>
+            <w:r>
+              <w:t xml:space="preserve">r Dashboard </w:t>
+            </w:r>
+            <w:r>
+              <w:t>und</w:t>
+            </w:r>
+            <w:r>
+              <w:t xml:space="preserve"> </w:t>
+            </w:r>
+            <w:r>
+              <w:t>dessen Logik implementiert.</w:t>
+            </w:r>
+          </w:p>
+          <w:p>
+            <w:pPr>
+              <w:spacing w:before="60" w:after="60"/>
+            </w:pPr>
+            <w:r>
+              <w:t>Controllers</w:t>
+            </w:r>
+            <w:r>
+              <w:t xml:space="preserve"> implementiert</w:t>
+            </w:r>
+            <w:r>
+              <w:t>:</w:t>
+            </w:r>
+            <w:r>
+              <w:br/>
+              <w:t xml:space="preserve">Notes, Folders </w:t>
+            </w:r>
+            <w:r>
+              <w:t>und</w:t>
+            </w:r>
+            <w:r>
+              <w:t xml:space="preserve"> Events.</w:t>
+            </w:r>
+          </w:p>
+        </w:tc>
+        <w:tc>
+          <w:tcPr>
+            <w:tcW w:w="1427" w:type="dxa"/>
+          </w:tcPr>
+          <w:p>
+            <w:pPr>
+              <w:spacing w:before="60" w:after="60"/>
+              <w:jc w:val="center"/>
+            </w:pPr>
+            <w:r>
+              <w:t>Christian Riepl</w:t>
+            </w:r>
+          </w:p>
+        </w:tc>
+      </w:tr>
     </w:tbl>
     <w:p/>
     <w:p/>
@@ -2281,6 +2476,7 @@
         <w:ind w:left="714" w:hanging="357"/>
       </w:pPr>
       <w:r>
+        <w:lastRenderedPageBreak/>
         <w:t>Ein</w:t>
       </w:r>
       <w:r>
@@ -2326,15 +2522,15 @@
       </w:r>
       <w:bookmarkStart w:id="4" w:name="_Toc396809834"/>
       <w:bookmarkStart w:id="5" w:name="_Toc397882989"/>
-      <w:bookmarkStart w:id="6" w:name="_Toc116286519"/>
-      <w:bookmarkStart w:id="7" w:name="_Toc230788880"/>
+      <w:bookmarkStart w:id="6" w:name="_Toc230788880"/>
+      <w:bookmarkStart w:id="7" w:name="_Toc116286519"/>
       <w:r>
         <w:lastRenderedPageBreak/>
         <w:t>Teamregeln</w:t>
       </w:r>
       <w:bookmarkEnd w:id="4"/>
       <w:bookmarkEnd w:id="5"/>
-      <w:bookmarkEnd w:id="7"/>
+      <w:bookmarkEnd w:id="6"/>
     </w:p>
     <w:p/>
     <w:tbl>
@@ -2740,14 +2936,14 @@
         <w:pStyle w:val="berschrift1"/>
       </w:pPr>
       <w:bookmarkStart w:id="8" w:name="_Toc397882990"/>
-      <w:bookmarkStart w:id="9" w:name="_Toc396809835"/>
-      <w:bookmarkStart w:id="10" w:name="_Toc230788881"/>
+      <w:bookmarkStart w:id="9" w:name="_Toc230788881"/>
+      <w:bookmarkStart w:id="10" w:name="_Toc396809835"/>
       <w:r>
         <w:lastRenderedPageBreak/>
         <w:t>Zielfindung</w:t>
       </w:r>
       <w:bookmarkEnd w:id="8"/>
-      <w:bookmarkEnd w:id="10"/>
+      <w:bookmarkEnd w:id="9"/>
     </w:p>
     <w:p>
       <w:r>
@@ -3989,21 +4185,17 @@
               <w:spacing w:before="60" w:after="60"/>
             </w:pPr>
             <w:r>
-              <w:t xml:space="preserve">Eigene </w:t>
-            </w:r>
-            <w:proofErr w:type="spellStart"/>
-            <w:r>
-              <w:t>SpaceHubs</w:t>
-            </w:r>
-            <w:proofErr w:type="spellEnd"/>
-            <w:r>
-              <w:t xml:space="preserve">. (Zentrale in der Information der Features zusammengeführt werden) -&gt; </w:t>
-            </w:r>
-            <w:proofErr w:type="spellStart"/>
-            <w:r>
-              <w:t>Ausserhalb</w:t>
-            </w:r>
-            <w:proofErr w:type="spellEnd"/>
+              <w:t>Eigene Space</w:t>
+            </w:r>
+            <w:r>
+              <w:t>-</w:t>
+            </w:r>
+            <w:r>
+              <w:t xml:space="preserve">Hubs. (Zentrale in der Information der Features zusammengeführt werden) -&gt; </w:t>
+            </w:r>
+            <w:r>
+              <w:t>Außerhalb</w:t>
+            </w:r>
             <w:r>
               <w:t xml:space="preserve"> des möglichen Zeitplans</w:t>
             </w:r>
@@ -4289,19 +4481,9 @@
               </w:numPr>
               <w:spacing w:before="60" w:after="60"/>
             </w:pPr>
-            <w:proofErr w:type="gramStart"/>
-            <w:r>
-              <w:t>Keine Ahnung</w:t>
-            </w:r>
-            <w:proofErr w:type="gramEnd"/>
-            <w:r>
-              <w:t xml:space="preserve"> was ich hier </w:t>
-            </w:r>
-            <w:proofErr w:type="gramStart"/>
-            <w:r>
-              <w:t>schreiben sollte</w:t>
-            </w:r>
-            <w:proofErr w:type="gramEnd"/>
+            <w:r>
+              <w:t>Keine Ahnung was ich hier schreiben sollte</w:t>
+            </w:r>
           </w:p>
         </w:tc>
         <w:tc>
@@ -4943,19 +5125,9 @@
               </w:numPr>
               <w:spacing w:before="60" w:after="60"/>
             </w:pPr>
-            <w:proofErr w:type="gramStart"/>
-            <w:r>
-              <w:t>Will</w:t>
-            </w:r>
-            <w:proofErr w:type="gramEnd"/>
-            <w:r>
-              <w:t xml:space="preserve"> dass ich das Projekt </w:t>
-            </w:r>
-            <w:proofErr w:type="gramStart"/>
-            <w:r>
-              <w:t>mache</w:t>
-            </w:r>
-            <w:proofErr w:type="gramEnd"/>
+            <w:r>
+              <w:t>Will dass ich das Projekt mache</w:t>
+            </w:r>
           </w:p>
         </w:tc>
         <w:tc>
@@ -6052,8 +6224,8 @@
         <w:br w:type="page"/>
       </w:r>
       <w:bookmarkStart w:id="26" w:name="_Toc230788886"/>
-      <w:bookmarkEnd w:id="6"/>
-      <w:bookmarkEnd w:id="9"/>
+      <w:bookmarkEnd w:id="7"/>
+      <w:bookmarkEnd w:id="10"/>
       <w:r>
         <w:lastRenderedPageBreak/>
         <w:t>Projektauftrag</w:t>
@@ -7134,13 +7306,11 @@
               <w:spacing w:before="60" w:after="60"/>
             </w:pPr>
             <w:r>
-              <w:t xml:space="preserve">Fertige Logik-Systeme (Hubs, Friendship, Chat, </w:t>
-            </w:r>
-            <w:proofErr w:type="spellStart"/>
-            <w:r>
-              <w:t>etc</w:t>
-            </w:r>
-            <w:proofErr w:type="spellEnd"/>
+              <w:t>Fertige Logik-Systeme (Hubs, Friendship, Chat, etc</w:t>
+            </w:r>
+            <w:r>
+              <w:t>.</w:t>
+            </w:r>
             <w:r>
               <w:t>) – 20.05.2026</w:t>
             </w:r>
@@ -8110,13 +8280,8 @@
             <w:pPr>
               <w:spacing w:before="60" w:after="60"/>
             </w:pPr>
-            <w:proofErr w:type="gramStart"/>
-            <w:r>
-              <w:t>AP Inhalte</w:t>
-            </w:r>
-            <w:proofErr w:type="gramEnd"/>
-            <w:r>
-              <w:t xml:space="preserve"> / Ergebnisse:</w:t>
+            <w:r>
+              <w:t>AP Inhalte / Ergebnisse:</w:t>
             </w:r>
           </w:p>
         </w:tc>
@@ -8358,13 +8523,8 @@
             <w:pPr>
               <w:spacing w:before="60" w:after="60"/>
             </w:pPr>
-            <w:proofErr w:type="gramStart"/>
-            <w:r>
-              <w:t>AP Inhalte</w:t>
-            </w:r>
-            <w:proofErr w:type="gramEnd"/>
-            <w:r>
-              <w:t xml:space="preserve"> / Ergebnisse:</w:t>
+            <w:r>
+              <w:t>AP Inhalte / Ergebnisse:</w:t>
             </w:r>
           </w:p>
         </w:tc>
@@ -8733,13 +8893,8 @@
             <w:pPr>
               <w:spacing w:before="60" w:after="60"/>
             </w:pPr>
-            <w:proofErr w:type="gramStart"/>
-            <w:r>
-              <w:t>AP Inhalte</w:t>
-            </w:r>
-            <w:proofErr w:type="gramEnd"/>
-            <w:r>
-              <w:t xml:space="preserve"> / Ergebnisse:</w:t>
+            <w:r>
+              <w:t>AP Inhalte / Ergebnisse:</w:t>
             </w:r>
           </w:p>
         </w:tc>
@@ -8786,15 +8941,7 @@
               <w:spacing w:before="60" w:after="60"/>
             </w:pPr>
             <w:r>
-              <w:t xml:space="preserve">Tests zu Hubs und Hooks können erst sicher getestet werden, wenn ein Feature im Frontend gebaut </w:t>
-            </w:r>
-            <w:proofErr w:type="gramStart"/>
-            <w:r>
-              <w:t>ist</w:t>
-            </w:r>
-            <w:proofErr w:type="gramEnd"/>
-            <w:r>
-              <w:t xml:space="preserve"> </w:t>
+              <w:t xml:space="preserve">Tests zu Hubs und Hooks können erst sicher getestet werden, wenn ein Feature im Frontend gebaut ist </w:t>
             </w:r>
           </w:p>
         </w:tc>
@@ -12146,23 +12293,7 @@
                 <w:rFonts w:ascii="Tahoma" w:hAnsi="Tahoma" w:cs="Tahoma"/>
                 <w:sz w:val="18"/>
               </w:rPr>
-              <w:t xml:space="preserve">Projektarbeit </w:t>
-            </w:r>
-            <w:proofErr w:type="gramStart"/>
-            <w:r>
-              <w:rPr>
-                <w:rFonts w:ascii="Tahoma" w:hAnsi="Tahoma" w:cs="Tahoma"/>
-                <w:sz w:val="18"/>
-              </w:rPr>
-              <w:t>einstellen</w:t>
-            </w:r>
-            <w:proofErr w:type="gramEnd"/>
-            <w:r>
-              <w:rPr>
-                <w:rFonts w:ascii="Tahoma" w:hAnsi="Tahoma" w:cs="Tahoma"/>
-                <w:sz w:val="18"/>
-              </w:rPr>
-              <w:t xml:space="preserve"> bis die Dokumentation wieder auf gleicher Basis ist.</w:t>
+              <w:t>Projektarbeit einstellen bis die Dokumentation wieder auf gleicher Basis ist.</w:t>
             </w:r>
           </w:p>
           <w:p>
@@ -13648,7 +13779,7 @@
         <w:noProof/>
         <w:sz w:val="16"/>
       </w:rPr>
-      <w:t>27.05.2026</w:t>
+      <w:t>28.05.2026</w:t>
     </w:r>
     <w:r>
       <w:rPr>

</xml_diff>

<commit_message>
[LOG] Corrected todays changes in: Projekthandbuch
</commit_message>
<xml_diff>
--- a/0_Documents/Projekthandbuch.docx
+++ b/0_Documents/Projekthandbuch.docx
@@ -371,7 +371,7 @@
         <w:rPr>
           <w:noProof/>
         </w:rPr>
-        <w:t>Mai 2026</w:t>
+        <w:t>Juni 2026</w:t>
       </w:r>
       <w:r>
         <w:fldChar w:fldCharType="end"/>
@@ -2406,6 +2406,222 @@
           </w:p>
         </w:tc>
       </w:tr>
+      <w:tr>
+        <w:tc>
+          <w:tcPr>
+            <w:tcW w:w="1389" w:type="dxa"/>
+          </w:tcPr>
+          <w:p>
+            <w:pPr>
+              <w:spacing w:before="60" w:after="60"/>
+              <w:jc w:val="center"/>
+            </w:pPr>
+            <w:r>
+              <w:t>0.1.8</w:t>
+            </w:r>
+          </w:p>
+        </w:tc>
+        <w:tc>
+          <w:tcPr>
+            <w:tcW w:w="1392" w:type="dxa"/>
+          </w:tcPr>
+          <w:p>
+            <w:pPr>
+              <w:spacing w:before="60" w:after="60"/>
+              <w:jc w:val="center"/>
+            </w:pPr>
+            <w:r>
+              <w:t>01.06.2026</w:t>
+            </w:r>
+          </w:p>
+        </w:tc>
+        <w:tc>
+          <w:tcPr>
+            <w:tcW w:w="4852" w:type="dxa"/>
+          </w:tcPr>
+          <w:p>
+            <w:pPr>
+              <w:spacing w:before="60" w:after="60"/>
+            </w:pPr>
+            <w:proofErr w:type="spellStart"/>
+            <w:r>
+              <w:t>Created</w:t>
+            </w:r>
+            <w:proofErr w:type="spellEnd"/>
+            <w:r>
+              <w:t xml:space="preserve"> </w:t>
+            </w:r>
+            <w:proofErr w:type="spellStart"/>
+            <w:r>
+              <w:t>public</w:t>
+            </w:r>
+            <w:proofErr w:type="spellEnd"/>
+            <w:r>
+              <w:t xml:space="preserve"> container-</w:t>
+            </w:r>
+            <w:proofErr w:type="spellStart"/>
+            <w:r>
+              <w:t>component</w:t>
+            </w:r>
+            <w:proofErr w:type="spellEnd"/>
+            <w:r>
+              <w:t xml:space="preserve"> „Sidebar“.</w:t>
+            </w:r>
+          </w:p>
+          <w:p>
+            <w:pPr>
+              <w:spacing w:before="60" w:after="60"/>
+            </w:pPr>
+            <w:proofErr w:type="spellStart"/>
+            <w:r>
+              <w:t>Created</w:t>
+            </w:r>
+            <w:proofErr w:type="spellEnd"/>
+            <w:r>
+              <w:t xml:space="preserve"> </w:t>
+            </w:r>
+            <w:proofErr w:type="spellStart"/>
+            <w:r>
+              <w:t>page</w:t>
+            </w:r>
+            <w:proofErr w:type="spellEnd"/>
+            <w:r>
+              <w:t xml:space="preserve"> </w:t>
+            </w:r>
+            <w:proofErr w:type="spellStart"/>
+            <w:r>
+              <w:t>for</w:t>
+            </w:r>
+            <w:proofErr w:type="spellEnd"/>
+            <w:r>
+              <w:t xml:space="preserve"> Todos and </w:t>
+            </w:r>
+            <w:proofErr w:type="spellStart"/>
+            <w:r>
+              <w:t>implemented</w:t>
+            </w:r>
+            <w:proofErr w:type="spellEnd"/>
+            <w:r>
+              <w:t xml:space="preserve"> </w:t>
+            </w:r>
+            <w:proofErr w:type="spellStart"/>
+            <w:r>
+              <w:t>logic</w:t>
+            </w:r>
+            <w:proofErr w:type="spellEnd"/>
+            <w:r>
+              <w:t xml:space="preserve"> </w:t>
+            </w:r>
+            <w:proofErr w:type="spellStart"/>
+            <w:r>
+              <w:t>including</w:t>
+            </w:r>
+            <w:proofErr w:type="spellEnd"/>
+            <w:r>
+              <w:t xml:space="preserve"> Hooks </w:t>
+            </w:r>
+            <w:proofErr w:type="spellStart"/>
+            <w:r>
+              <w:t>for</w:t>
+            </w:r>
+            <w:proofErr w:type="spellEnd"/>
+            <w:r>
+              <w:t xml:space="preserve"> Hubs. </w:t>
+            </w:r>
+            <w:r>
+              <w:br/>
+            </w:r>
+            <w:proofErr w:type="spellStart"/>
+            <w:r>
+              <w:t>Implemented</w:t>
+            </w:r>
+            <w:proofErr w:type="spellEnd"/>
+            <w:r>
+              <w:t xml:space="preserve"> Sidebar-</w:t>
+            </w:r>
+            <w:proofErr w:type="spellStart"/>
+            <w:r>
+              <w:t>component</w:t>
+            </w:r>
+            <w:proofErr w:type="spellEnd"/>
+            <w:r>
+              <w:t xml:space="preserve"> (Todo-Collection) </w:t>
+            </w:r>
+            <w:proofErr w:type="spellStart"/>
+            <w:r>
+              <w:t>for</w:t>
+            </w:r>
+            <w:proofErr w:type="spellEnd"/>
+            <w:r>
+              <w:t xml:space="preserve"> Todos and </w:t>
+            </w:r>
+            <w:proofErr w:type="spellStart"/>
+            <w:r>
+              <w:t>wired</w:t>
+            </w:r>
+            <w:proofErr w:type="spellEnd"/>
+            <w:r>
+              <w:t xml:space="preserve"> </w:t>
+            </w:r>
+            <w:proofErr w:type="spellStart"/>
+            <w:r>
+              <w:t>logic</w:t>
+            </w:r>
+            <w:proofErr w:type="spellEnd"/>
+            <w:r>
+              <w:t>.</w:t>
+            </w:r>
+          </w:p>
+          <w:p>
+            <w:pPr>
+              <w:spacing w:before="60" w:after="60"/>
+            </w:pPr>
+            <w:proofErr w:type="spellStart"/>
+            <w:r>
+              <w:t>Added</w:t>
+            </w:r>
+            <w:proofErr w:type="spellEnd"/>
+            <w:r>
+              <w:t xml:space="preserve"> </w:t>
+            </w:r>
+            <w:proofErr w:type="spellStart"/>
+            <w:r>
+              <w:t>component</w:t>
+            </w:r>
+            <w:proofErr w:type="spellEnd"/>
+            <w:r>
+              <w:t xml:space="preserve"> </w:t>
+            </w:r>
+            <w:proofErr w:type="spellStart"/>
+            <w:r>
+              <w:t>TodoBoard</w:t>
+            </w:r>
+            <w:proofErr w:type="spellEnd"/>
+            <w:r>
+              <w:t xml:space="preserve"> </w:t>
+            </w:r>
+            <w:proofErr w:type="spellStart"/>
+            <w:r>
+              <w:t>for</w:t>
+            </w:r>
+            <w:proofErr w:type="spellEnd"/>
+            <w:r>
+              <w:t xml:space="preserve"> Todos.</w:t>
+            </w:r>
+          </w:p>
+        </w:tc>
+        <w:tc>
+          <w:tcPr>
+            <w:tcW w:w="1427" w:type="dxa"/>
+          </w:tcPr>
+          <w:p>
+            <w:pPr>
+              <w:spacing w:before="60" w:after="60"/>
+              <w:jc w:val="center"/>
+            </w:pPr>
+          </w:p>
+        </w:tc>
+      </w:tr>
     </w:tbl>
     <w:p/>
     <w:p/>
@@ -2476,7 +2692,6 @@
         <w:ind w:left="714" w:hanging="357"/>
       </w:pPr>
       <w:r>
-        <w:lastRenderedPageBreak/>
         <w:t>Ein</w:t>
       </w:r>
       <w:r>
@@ -4481,9 +4696,19 @@
               </w:numPr>
               <w:spacing w:before="60" w:after="60"/>
             </w:pPr>
-            <w:r>
-              <w:t>Keine Ahnung was ich hier schreiben sollte</w:t>
-            </w:r>
+            <w:proofErr w:type="gramStart"/>
+            <w:r>
+              <w:t>Keine Ahnung</w:t>
+            </w:r>
+            <w:proofErr w:type="gramEnd"/>
+            <w:r>
+              <w:t xml:space="preserve"> was ich hier </w:t>
+            </w:r>
+            <w:proofErr w:type="gramStart"/>
+            <w:r>
+              <w:t>schreiben sollte</w:t>
+            </w:r>
+            <w:proofErr w:type="gramEnd"/>
           </w:p>
         </w:tc>
         <w:tc>
@@ -5125,9 +5350,19 @@
               </w:numPr>
               <w:spacing w:before="60" w:after="60"/>
             </w:pPr>
-            <w:r>
-              <w:t>Will dass ich das Projekt mache</w:t>
-            </w:r>
+            <w:proofErr w:type="gramStart"/>
+            <w:r>
+              <w:t>Will</w:t>
+            </w:r>
+            <w:proofErr w:type="gramEnd"/>
+            <w:r>
+              <w:t xml:space="preserve"> dass ich das Projekt </w:t>
+            </w:r>
+            <w:proofErr w:type="gramStart"/>
+            <w:r>
+              <w:t>mache</w:t>
+            </w:r>
+            <w:proofErr w:type="gramEnd"/>
           </w:p>
         </w:tc>
         <w:tc>
@@ -8280,8 +8515,13 @@
             <w:pPr>
               <w:spacing w:before="60" w:after="60"/>
             </w:pPr>
-            <w:r>
-              <w:t>AP Inhalte / Ergebnisse:</w:t>
+            <w:proofErr w:type="gramStart"/>
+            <w:r>
+              <w:t>AP Inhalte</w:t>
+            </w:r>
+            <w:proofErr w:type="gramEnd"/>
+            <w:r>
+              <w:t xml:space="preserve"> / Ergebnisse:</w:t>
             </w:r>
           </w:p>
         </w:tc>
@@ -8523,8 +8763,13 @@
             <w:pPr>
               <w:spacing w:before="60" w:after="60"/>
             </w:pPr>
-            <w:r>
-              <w:t>AP Inhalte / Ergebnisse:</w:t>
+            <w:proofErr w:type="gramStart"/>
+            <w:r>
+              <w:t>AP Inhalte</w:t>
+            </w:r>
+            <w:proofErr w:type="gramEnd"/>
+            <w:r>
+              <w:t xml:space="preserve"> / Ergebnisse:</w:t>
             </w:r>
           </w:p>
         </w:tc>
@@ -8893,8 +9138,13 @@
             <w:pPr>
               <w:spacing w:before="60" w:after="60"/>
             </w:pPr>
-            <w:r>
-              <w:t>AP Inhalte / Ergebnisse:</w:t>
+            <w:proofErr w:type="gramStart"/>
+            <w:r>
+              <w:t>AP Inhalte</w:t>
+            </w:r>
+            <w:proofErr w:type="gramEnd"/>
+            <w:r>
+              <w:t xml:space="preserve"> / Ergebnisse:</w:t>
             </w:r>
           </w:p>
         </w:tc>
@@ -8941,7 +9191,15 @@
               <w:spacing w:before="60" w:after="60"/>
             </w:pPr>
             <w:r>
-              <w:t xml:space="preserve">Tests zu Hubs und Hooks können erst sicher getestet werden, wenn ein Feature im Frontend gebaut ist </w:t>
+              <w:t xml:space="preserve">Tests zu Hubs und Hooks können erst sicher getestet werden, wenn ein Feature im Frontend gebaut </w:t>
+            </w:r>
+            <w:proofErr w:type="gramStart"/>
+            <w:r>
+              <w:t>ist</w:t>
+            </w:r>
+            <w:proofErr w:type="gramEnd"/>
+            <w:r>
+              <w:t xml:space="preserve"> </w:t>
             </w:r>
           </w:p>
         </w:tc>
@@ -12293,7 +12551,23 @@
                 <w:rFonts w:ascii="Tahoma" w:hAnsi="Tahoma" w:cs="Tahoma"/>
                 <w:sz w:val="18"/>
               </w:rPr>
-              <w:t>Projektarbeit einstellen bis die Dokumentation wieder auf gleicher Basis ist.</w:t>
+              <w:t xml:space="preserve">Projektarbeit </w:t>
+            </w:r>
+            <w:proofErr w:type="gramStart"/>
+            <w:r>
+              <w:rPr>
+                <w:rFonts w:ascii="Tahoma" w:hAnsi="Tahoma" w:cs="Tahoma"/>
+                <w:sz w:val="18"/>
+              </w:rPr>
+              <w:t>einstellen</w:t>
+            </w:r>
+            <w:proofErr w:type="gramEnd"/>
+            <w:r>
+              <w:rPr>
+                <w:rFonts w:ascii="Tahoma" w:hAnsi="Tahoma" w:cs="Tahoma"/>
+                <w:sz w:val="18"/>
+              </w:rPr>
+              <w:t xml:space="preserve"> bis die Dokumentation wieder auf gleicher Basis ist.</w:t>
             </w:r>
           </w:p>
           <w:p>
@@ -13779,7 +14053,7 @@
         <w:noProof/>
         <w:sz w:val="16"/>
       </w:rPr>
-      <w:t>28.05.2026</w:t>
+      <w:t>01.06.2026</w:t>
     </w:r>
     <w:r>
       <w:rPr>

</xml_diff>

<commit_message>
[LOGIC / GUI] Implemented SpaceSwitcher including an own little dropdownProvider. (To escape the browser's native hell-dropdown). Added FeatureNavigationBar.
</commit_message>
<xml_diff>
--- a/0_Documents/Projekthandbuch.docx
+++ b/0_Documents/Projekthandbuch.docx
@@ -2619,6 +2619,128 @@
               <w:spacing w:before="60" w:after="60"/>
               <w:jc w:val="center"/>
             </w:pPr>
+            <w:r>
+              <w:t>Christian Riepl</w:t>
+            </w:r>
+          </w:p>
+        </w:tc>
+      </w:tr>
+      <w:tr>
+        <w:tc>
+          <w:tcPr>
+            <w:tcW w:w="1389" w:type="dxa"/>
+          </w:tcPr>
+          <w:p>
+            <w:pPr>
+              <w:spacing w:before="60" w:after="60"/>
+              <w:jc w:val="center"/>
+            </w:pPr>
+            <w:r>
+              <w:lastRenderedPageBreak/>
+              <w:t>0.1.8</w:t>
+            </w:r>
+          </w:p>
+        </w:tc>
+        <w:tc>
+          <w:tcPr>
+            <w:tcW w:w="1392" w:type="dxa"/>
+          </w:tcPr>
+          <w:p>
+            <w:pPr>
+              <w:spacing w:before="60" w:after="60"/>
+              <w:jc w:val="center"/>
+            </w:pPr>
+            <w:r>
+              <w:t>09.06.2026</w:t>
+            </w:r>
+          </w:p>
+        </w:tc>
+        <w:tc>
+          <w:tcPr>
+            <w:tcW w:w="4852" w:type="dxa"/>
+          </w:tcPr>
+          <w:p>
+            <w:pPr>
+              <w:spacing w:before="60" w:after="60"/>
+            </w:pPr>
+            <w:r>
+              <w:t>Feature-Seite „Events“ gestartet. Sidebar-</w:t>
+            </w:r>
+            <w:proofErr w:type="spellStart"/>
+            <w:r>
+              <w:t>component</w:t>
+            </w:r>
+            <w:proofErr w:type="spellEnd"/>
+            <w:r>
+              <w:t xml:space="preserve"> implementiert. Kalender mit </w:t>
+            </w:r>
+            <w:proofErr w:type="spellStart"/>
+            <w:r>
+              <w:t>Grid</w:t>
+            </w:r>
+            <w:proofErr w:type="spellEnd"/>
+            <w:r>
+              <w:t xml:space="preserve"> für </w:t>
+            </w:r>
+            <w:proofErr w:type="spellStart"/>
+            <w:r>
+              <w:t>Daycells</w:t>
+            </w:r>
+            <w:proofErr w:type="spellEnd"/>
+            <w:r>
+              <w:t xml:space="preserve"> aufgebaut. </w:t>
+            </w:r>
+          </w:p>
+          <w:p>
+            <w:pPr>
+              <w:spacing w:before="60" w:after="60"/>
+            </w:pPr>
+            <w:r>
+              <w:t>Kalender mit Logik erweitert (</w:t>
+            </w:r>
+            <w:proofErr w:type="spellStart"/>
+            <w:r>
+              <w:t>Paging</w:t>
+            </w:r>
+            <w:proofErr w:type="spellEnd"/>
+            <w:r>
+              <w:t xml:space="preserve"> und Offset Cells inklusive </w:t>
+            </w:r>
+            <w:proofErr w:type="spellStart"/>
+            <w:r>
+              <w:t>DayCellCount-Berrechnung</w:t>
+            </w:r>
+            <w:proofErr w:type="spellEnd"/>
+            <w:r>
+              <w:t>)</w:t>
+            </w:r>
+          </w:p>
+          <w:p>
+            <w:pPr>
+              <w:spacing w:before="60" w:after="60"/>
+            </w:pPr>
+            <w:proofErr w:type="spellStart"/>
+            <w:r>
+              <w:t>EventModal</w:t>
+            </w:r>
+            <w:proofErr w:type="spellEnd"/>
+            <w:r>
+              <w:t xml:space="preserve"> implementiert. (Detailansicht eines Tages und dessen Einträge)</w:t>
+            </w:r>
+          </w:p>
+        </w:tc>
+        <w:tc>
+          <w:tcPr>
+            <w:tcW w:w="1427" w:type="dxa"/>
+          </w:tcPr>
+          <w:p>
+            <w:pPr>
+              <w:spacing w:before="60" w:after="60"/>
+              <w:jc w:val="center"/>
+            </w:pPr>
+            <w:r>
+              <w:t>Christian Riepl</w:t>
+            </w:r>
           </w:p>
         </w:tc>
       </w:tr>
@@ -14053,7 +14175,7 @@
         <w:noProof/>
         <w:sz w:val="16"/>
       </w:rPr>
-      <w:t>01.06.2026</w:t>
+      <w:t>09.06.2026</w:t>
     </w:r>
     <w:r>
       <w:rPr>

</xml_diff>

<commit_message>
[ORG] Updated Projektplan. (Änderungsverzeichnis / Projektstatusplan / Generelles CleanUp)
</commit_message>
<xml_diff>
--- a/0_Documents/Projekthandbuch.docx
+++ b/0_Documents/Projekthandbuch.docx
@@ -1772,7 +1772,13 @@
               <w:jc w:val="center"/>
             </w:pPr>
             <w:r>
-              <w:t>18.05.2026</w:t>
+              <w:t>1</w:t>
+            </w:r>
+            <w:r>
+              <w:t>5</w:t>
+            </w:r>
+            <w:r>
+              <w:t>.05.2026</w:t>
             </w:r>
           </w:p>
         </w:tc>
@@ -2727,6 +2733,174 @@
             <w:r>
               <w:t xml:space="preserve"> implementiert. (Detailansicht eines Tages und dessen Einträge)</w:t>
             </w:r>
+          </w:p>
+        </w:tc>
+        <w:tc>
+          <w:tcPr>
+            <w:tcW w:w="1427" w:type="dxa"/>
+          </w:tcPr>
+          <w:p>
+            <w:pPr>
+              <w:spacing w:before="60" w:after="60"/>
+              <w:jc w:val="center"/>
+            </w:pPr>
+            <w:r>
+              <w:t>Christian Riepl</w:t>
+            </w:r>
+          </w:p>
+        </w:tc>
+      </w:tr>
+      <w:tr>
+        <w:tc>
+          <w:tcPr>
+            <w:tcW w:w="1389" w:type="dxa"/>
+          </w:tcPr>
+          <w:p>
+            <w:pPr>
+              <w:spacing w:before="60" w:after="60"/>
+              <w:jc w:val="center"/>
+            </w:pPr>
+            <w:r>
+              <w:t>0.1.9</w:t>
+            </w:r>
+          </w:p>
+        </w:tc>
+        <w:tc>
+          <w:tcPr>
+            <w:tcW w:w="1392" w:type="dxa"/>
+          </w:tcPr>
+          <w:p>
+            <w:pPr>
+              <w:spacing w:before="60" w:after="60"/>
+              <w:jc w:val="center"/>
+            </w:pPr>
+            <w:r>
+              <w:t>10.06.2026</w:t>
+            </w:r>
+          </w:p>
+        </w:tc>
+        <w:tc>
+          <w:tcPr>
+            <w:tcW w:w="4852" w:type="dxa"/>
+          </w:tcPr>
+          <w:p>
+            <w:pPr>
+              <w:spacing w:before="60" w:after="60"/>
+            </w:pPr>
+            <w:proofErr w:type="spellStart"/>
+            <w:r>
+              <w:t>Implemented</w:t>
+            </w:r>
+            <w:proofErr w:type="spellEnd"/>
+            <w:r>
+              <w:t xml:space="preserve"> Navigation „</w:t>
+            </w:r>
+            <w:proofErr w:type="spellStart"/>
+            <w:r>
+              <w:t>SpaceSwitcher</w:t>
+            </w:r>
+            <w:proofErr w:type="spellEnd"/>
+            <w:r>
+              <w:t xml:space="preserve">“ </w:t>
+            </w:r>
+            <w:proofErr w:type="spellStart"/>
+            <w:r>
+              <w:t>to</w:t>
+            </w:r>
+            <w:proofErr w:type="spellEnd"/>
+            <w:r>
+              <w:t xml:space="preserve"> switch </w:t>
+            </w:r>
+            <w:proofErr w:type="spellStart"/>
+            <w:r>
+              <w:t>between</w:t>
+            </w:r>
+            <w:proofErr w:type="spellEnd"/>
+            <w:r>
+              <w:t xml:space="preserve"> different </w:t>
+            </w:r>
+            <w:proofErr w:type="spellStart"/>
+            <w:r>
+              <w:t>spaces</w:t>
+            </w:r>
+            <w:proofErr w:type="spellEnd"/>
+            <w:r>
+              <w:t>.</w:t>
+            </w:r>
+          </w:p>
+          <w:p>
+            <w:pPr>
+              <w:spacing w:before="60" w:after="60"/>
+            </w:pPr>
+            <w:proofErr w:type="spellStart"/>
+            <w:r>
+              <w:t>Implemented</w:t>
+            </w:r>
+            <w:proofErr w:type="spellEnd"/>
+            <w:r>
+              <w:t xml:space="preserve"> Navigation „</w:t>
+            </w:r>
+            <w:proofErr w:type="spellStart"/>
+            <w:r>
+              <w:t>FeatureNavigation</w:t>
+            </w:r>
+            <w:proofErr w:type="spellEnd"/>
+            <w:r>
+              <w:t xml:space="preserve">“ </w:t>
+            </w:r>
+            <w:proofErr w:type="spellStart"/>
+            <w:r>
+              <w:t>to</w:t>
+            </w:r>
+            <w:proofErr w:type="spellEnd"/>
+            <w:r>
+              <w:t xml:space="preserve"> switch </w:t>
+            </w:r>
+            <w:proofErr w:type="spellStart"/>
+            <w:r>
+              <w:t>between</w:t>
+            </w:r>
+            <w:proofErr w:type="spellEnd"/>
+            <w:r>
+              <w:t xml:space="preserve"> </w:t>
+            </w:r>
+            <w:proofErr w:type="spellStart"/>
+            <w:r>
+              <w:t>features</w:t>
+            </w:r>
+            <w:proofErr w:type="spellEnd"/>
+            <w:r>
+              <w:t xml:space="preserve"> in </w:t>
+            </w:r>
+            <w:proofErr w:type="spellStart"/>
+            <w:r>
+              <w:t>the</w:t>
+            </w:r>
+            <w:proofErr w:type="spellEnd"/>
+            <w:r>
+              <w:t xml:space="preserve"> </w:t>
+            </w:r>
+            <w:proofErr w:type="spellStart"/>
+            <w:r>
+              <w:t>current</w:t>
+            </w:r>
+            <w:proofErr w:type="spellEnd"/>
+            <w:r>
+              <w:t xml:space="preserve"> </w:t>
+            </w:r>
+            <w:proofErr w:type="spellStart"/>
+            <w:r>
+              <w:t>space</w:t>
+            </w:r>
+            <w:proofErr w:type="spellEnd"/>
+            <w:r>
+              <w:t>.</w:t>
+            </w:r>
+          </w:p>
+          <w:p>
+            <w:pPr>
+              <w:spacing w:before="60" w:after="60"/>
+            </w:pPr>
           </w:p>
         </w:tc>
         <w:tc>
@@ -3470,7 +3644,13 @@
               <w:t>Um</w:t>
             </w:r>
             <w:r>
-              <w:t xml:space="preserve"> eine Erleichterung im Alltag oder auch in Projektteams zur Verfügung zu stellen.</w:t>
+              <w:t xml:space="preserve"> eine Erleichterung </w:t>
+            </w:r>
+            <w:r>
+              <w:t xml:space="preserve">der Übersicht </w:t>
+            </w:r>
+            <w:r>
+              <w:t>im Alltag oder auch in Projektteams zur Verfügung zu stellen.</w:t>
             </w:r>
           </w:p>
         </w:tc>
@@ -7279,28 +7459,7 @@
               </w:rPr>
             </w:pPr>
             <w:r>
-              <w:fldChar w:fldCharType="begin">
-                <w:ffData>
-                  <w:name w:val=""/>
-                  <w:enabled/>
-                  <w:calcOnExit w:val="0"/>
-                  <w:textInput>
-                    <w:default w:val="&lt;Teilziel 2&gt;"/>
-                  </w:textInput>
-                </w:ffData>
-              </w:fldChar>
-            </w:r>
-            <w:r>
-              <w:instrText xml:space="preserve"> FORMTEXT </w:instrText>
-            </w:r>
-            <w:r>
-              <w:fldChar w:fldCharType="separate"/>
-            </w:r>
-            <w:r>
-              <w:t>&lt;Teilziel 2&gt;</w:t>
-            </w:r>
-            <w:r>
-              <w:fldChar w:fldCharType="end"/>
+              <w:t>Hub-System implementieren</w:t>
             </w:r>
           </w:p>
         </w:tc>
@@ -7318,28 +7477,7 @@
               <w:spacing w:before="60" w:after="60"/>
             </w:pPr>
             <w:r>
-              <w:fldChar w:fldCharType="begin">
-                <w:ffData>
-                  <w:name w:val=""/>
-                  <w:enabled/>
-                  <w:calcOnExit w:val="0"/>
-                  <w:textInput>
-                    <w:default w:val="&lt;messbare Ergebnisse TZ 2&gt;"/>
-                  </w:textInput>
-                </w:ffData>
-              </w:fldChar>
-            </w:r>
-            <w:r>
-              <w:instrText xml:space="preserve"> FORMTEXT </w:instrText>
-            </w:r>
-            <w:r>
-              <w:fldChar w:fldCharType="separate"/>
-            </w:r>
-            <w:r>
-              <w:t>&lt;messbare Ergebnisse TZ 2&gt;</w:t>
-            </w:r>
-            <w:r>
-              <w:fldChar w:fldCharType="end"/>
+              <w:t>User können in einer geschlossenen Gruppe zusammenarbeiten.</w:t>
             </w:r>
           </w:p>
         </w:tc>
@@ -7359,28 +7497,7 @@
               </w:rPr>
             </w:pPr>
             <w:r>
-              <w:fldChar w:fldCharType="begin">
-                <w:ffData>
-                  <w:name w:val=""/>
-                  <w:enabled/>
-                  <w:calcOnExit w:val="0"/>
-                  <w:textInput>
-                    <w:default w:val="&lt;Teilziel 3&gt;"/>
-                  </w:textInput>
-                </w:ffData>
-              </w:fldChar>
-            </w:r>
-            <w:r>
-              <w:instrText xml:space="preserve"> FORMTEXT </w:instrText>
-            </w:r>
-            <w:r>
-              <w:fldChar w:fldCharType="separate"/>
-            </w:r>
-            <w:r>
-              <w:t>&lt;Teilziel 3&gt;</w:t>
-            </w:r>
-            <w:r>
-              <w:fldChar w:fldCharType="end"/>
+              <w:t>Basisstruktur aufbauen im Frontend.</w:t>
             </w:r>
           </w:p>
         </w:tc>
@@ -7398,28 +7515,7 @@
               <w:spacing w:before="60" w:after="60"/>
             </w:pPr>
             <w:r>
-              <w:fldChar w:fldCharType="begin">
-                <w:ffData>
-                  <w:name w:val=""/>
-                  <w:enabled/>
-                  <w:calcOnExit w:val="0"/>
-                  <w:textInput>
-                    <w:default w:val="&lt;messbare Ergebnisse TZ 3&gt;"/>
-                  </w:textInput>
-                </w:ffData>
-              </w:fldChar>
-            </w:r>
-            <w:r>
-              <w:instrText xml:space="preserve"> FORMTEXT </w:instrText>
-            </w:r>
-            <w:r>
-              <w:fldChar w:fldCharType="separate"/>
-            </w:r>
-            <w:r>
-              <w:t>&lt;messbare Ergebnisse TZ 3&gt;</w:t>
-            </w:r>
-            <w:r>
-              <w:fldChar w:fldCharType="end"/>
+              <w:t>User können die Website besuchen und navigieren.</w:t>
             </w:r>
           </w:p>
         </w:tc>
@@ -7439,28 +7535,7 @@
               </w:rPr>
             </w:pPr>
             <w:r>
-              <w:fldChar w:fldCharType="begin">
-                <w:ffData>
-                  <w:name w:val=""/>
-                  <w:enabled/>
-                  <w:calcOnExit w:val="0"/>
-                  <w:textInput>
-                    <w:default w:val="&lt;Teilziel 4&gt;"/>
-                  </w:textInput>
-                </w:ffData>
-              </w:fldChar>
-            </w:r>
-            <w:r>
-              <w:instrText xml:space="preserve"> FORMTEXT </w:instrText>
-            </w:r>
-            <w:r>
-              <w:fldChar w:fldCharType="separate"/>
-            </w:r>
-            <w:r>
-              <w:t>&lt;Teilziel 4&gt;</w:t>
-            </w:r>
-            <w:r>
-              <w:fldChar w:fldCharType="end"/>
+              <w:t>Frontend-Provider implementieren</w:t>
             </w:r>
           </w:p>
         </w:tc>
@@ -7478,28 +7553,75 @@
               <w:spacing w:before="60" w:after="60"/>
             </w:pPr>
             <w:r>
-              <w:fldChar w:fldCharType="begin">
-                <w:ffData>
-                  <w:name w:val=""/>
-                  <w:enabled/>
-                  <w:calcOnExit w:val="0"/>
-                  <w:textInput>
-                    <w:default w:val="&lt;messbare Ergebnisse TZ 4&gt;"/>
-                  </w:textInput>
-                </w:ffData>
-              </w:fldChar>
-            </w:r>
-            <w:r>
-              <w:instrText xml:space="preserve"> FORMTEXT </w:instrText>
-            </w:r>
-            <w:r>
-              <w:fldChar w:fldCharType="separate"/>
-            </w:r>
-            <w:r>
-              <w:t>&lt;messbare Ergebnisse TZ 4&gt;</w:t>
-            </w:r>
-            <w:r>
-              <w:fldChar w:fldCharType="end"/>
+              <w:t>Der User kann Elemente Seitenübergreifend sehen und nutzen.</w:t>
+            </w:r>
+          </w:p>
+        </w:tc>
+      </w:tr>
+      <w:tr>
+        <w:tc>
+          <w:tcPr>
+            <w:tcW w:w="2764" w:type="dxa"/>
+            <w:gridSpan w:val="2"/>
+          </w:tcPr>
+          <w:p>
+            <w:pPr>
+              <w:spacing w:before="60" w:after="60"/>
+            </w:pPr>
+            <w:r>
+              <w:t>Logik zwischen API und Frontend zusammenführen</w:t>
+            </w:r>
+          </w:p>
+        </w:tc>
+        <w:tc>
+          <w:tcPr>
+            <w:tcW w:w="6446" w:type="dxa"/>
+            <w:gridSpan w:val="3"/>
+          </w:tcPr>
+          <w:p>
+            <w:pPr>
+              <w:numPr>
+                <w:ilvl w:val="0"/>
+                <w:numId w:val="15"/>
+              </w:numPr>
+              <w:spacing w:before="60" w:after="60"/>
+            </w:pPr>
+            <w:r>
+              <w:t xml:space="preserve">User können alle Features der App verwenden. </w:t>
+            </w:r>
+          </w:p>
+        </w:tc>
+      </w:tr>
+      <w:tr>
+        <w:tc>
+          <w:tcPr>
+            <w:tcW w:w="2764" w:type="dxa"/>
+            <w:gridSpan w:val="2"/>
+          </w:tcPr>
+          <w:p>
+            <w:pPr>
+              <w:spacing w:before="60" w:after="60"/>
+            </w:pPr>
+            <w:r>
+              <w:t>Polish</w:t>
+            </w:r>
+          </w:p>
+        </w:tc>
+        <w:tc>
+          <w:tcPr>
+            <w:tcW w:w="6446" w:type="dxa"/>
+            <w:gridSpan w:val="3"/>
+          </w:tcPr>
+          <w:p>
+            <w:pPr>
+              <w:numPr>
+                <w:ilvl w:val="0"/>
+                <w:numId w:val="15"/>
+              </w:numPr>
+              <w:spacing w:before="60" w:after="60"/>
+            </w:pPr>
+            <w:r>
+              <w:t>Der Code ist lesbar für den Programmierer und das Frontend angenehmer zum Nutzen für den User.</w:t>
             </w:r>
           </w:p>
         </w:tc>
@@ -7581,25 +7703,10 @@
               <w:spacing w:before="60" w:after="60"/>
             </w:pPr>
             <w:r>
-              <w:t>Frontendbasis schaffen mit Authentication, Friendship</w:t>
-            </w:r>
-            <w:r>
-              <w:t>-</w:t>
-            </w:r>
-            <w:r>
-              <w:t>System, Presence</w:t>
-            </w:r>
-            <w:r>
-              <w:t>-</w:t>
-            </w:r>
-            <w:r>
-              <w:t>System und Chat</w:t>
-            </w:r>
-            <w:r>
-              <w:t>-</w:t>
-            </w:r>
-            <w:r>
-              <w:t>System.</w:t>
+              <w:t xml:space="preserve">Frontend </w:t>
+            </w:r>
+            <w:r>
+              <w:t>aufbauen und mit API-Logik verbinden.</w:t>
             </w:r>
           </w:p>
           <w:p>
@@ -7611,6 +7718,40 @@
               <w:spacing w:before="60" w:after="60"/>
             </w:pPr>
             <w:r>
+              <w:lastRenderedPageBreak/>
+              <w:t>Frontendbasis schaffen mit Authentication, Friendship</w:t>
+            </w:r>
+            <w:r>
+              <w:t>-</w:t>
+            </w:r>
+            <w:r>
+              <w:t>System, Presence</w:t>
+            </w:r>
+            <w:r>
+              <w:t>-</w:t>
+            </w:r>
+            <w:r>
+              <w:t>System und Chat</w:t>
+            </w:r>
+            <w:r>
+              <w:t>-</w:t>
+            </w:r>
+            <w:r>
+              <w:t>System.</w:t>
+            </w:r>
+          </w:p>
+          <w:p>
+            <w:pPr>
+              <w:numPr>
+                <w:ilvl w:val="0"/>
+                <w:numId w:val="16"/>
+              </w:numPr>
+              <w:spacing w:before="60" w:after="60"/>
+            </w:pPr>
+            <w:r>
+              <w:t xml:space="preserve">Dashboard &amp; </w:t>
+            </w:r>
+            <w:r>
               <w:t>Feature-Seiten bauen</w:t>
             </w:r>
           </w:p>
@@ -7630,6 +7771,7 @@
               <w:rPr>
                 <w:b/>
               </w:rPr>
+              <w:lastRenderedPageBreak/>
               <w:t>Meilensteine</w:t>
             </w:r>
             <w:r>
@@ -7652,32 +7794,67 @@
           </w:tcPr>
           <w:p>
             <w:pPr>
-              <w:spacing w:before="60" w:after="60"/>
-            </w:pPr>
-            <w:r>
-              <w:t>Fertige API – 15.05.2026</w:t>
-            </w:r>
-          </w:p>
-          <w:p>
-            <w:pPr>
-              <w:spacing w:before="60" w:after="60"/>
-            </w:pPr>
-            <w:r>
-              <w:t>Fertige Logik-Systeme (Hubs, Friendship, Chat, etc</w:t>
-            </w:r>
-            <w:r>
-              <w:t>.</w:t>
-            </w:r>
-            <w:r>
-              <w:t>) – 20.05.2026</w:t>
-            </w:r>
-          </w:p>
-          <w:p>
-            <w:pPr>
-              <w:spacing w:before="60" w:after="60"/>
-            </w:pPr>
-            <w:r>
-              <w:t>API und APP verbunden und erste Website erfolgreich abrufbar – 22.05.2026</w:t>
+              <w:pStyle w:val="Listenabsatz"/>
+              <w:numPr>
+                <w:ilvl w:val="0"/>
+                <w:numId w:val="22"/>
+              </w:numPr>
+              <w:spacing w:before="60" w:after="60"/>
+            </w:pPr>
+            <w:r>
+              <w:t>Projektplanung</w:t>
+            </w:r>
+          </w:p>
+          <w:p>
+            <w:pPr>
+              <w:pStyle w:val="Listenabsatz"/>
+              <w:numPr>
+                <w:ilvl w:val="0"/>
+                <w:numId w:val="22"/>
+              </w:numPr>
+              <w:spacing w:before="60" w:after="60"/>
+            </w:pPr>
+            <w:r>
+              <w:t>Projektbasis / Struktur</w:t>
+            </w:r>
+          </w:p>
+          <w:p>
+            <w:pPr>
+              <w:pStyle w:val="Listenabsatz"/>
+              <w:numPr>
+                <w:ilvl w:val="0"/>
+                <w:numId w:val="22"/>
+              </w:numPr>
+              <w:spacing w:before="60" w:after="60"/>
+            </w:pPr>
+            <w:r>
+              <w:t>API</w:t>
+            </w:r>
+          </w:p>
+          <w:p>
+            <w:pPr>
+              <w:pStyle w:val="Listenabsatz"/>
+              <w:numPr>
+                <w:ilvl w:val="0"/>
+                <w:numId w:val="22"/>
+              </w:numPr>
+              <w:spacing w:before="60" w:after="60"/>
+            </w:pPr>
+            <w:r>
+              <w:t>Frontend</w:t>
+            </w:r>
+          </w:p>
+          <w:p>
+            <w:pPr>
+              <w:pStyle w:val="Listenabsatz"/>
+              <w:numPr>
+                <w:ilvl w:val="0"/>
+                <w:numId w:val="22"/>
+              </w:numPr>
+              <w:spacing w:before="60" w:after="60"/>
+            </w:pPr>
+            <w:r>
+              <w:t>Abschluss</w:t>
             </w:r>
           </w:p>
         </w:tc>
@@ -7702,7 +7879,6 @@
               <w:rPr>
                 <w:b/>
               </w:rPr>
-              <w:lastRenderedPageBreak/>
               <w:t>Projektrisiken:</w:t>
             </w:r>
           </w:p>
@@ -7843,7 +8019,7 @@
               <w:spacing w:before="60" w:after="60"/>
             </w:pPr>
             <w:r>
-              <w:t xml:space="preserve">Solo-Projekt -&gt; </w:t>
+              <w:t>-</w:t>
             </w:r>
           </w:p>
         </w:tc>
@@ -8914,7 +9090,13 @@
               <w:spacing w:before="60" w:after="60"/>
             </w:pPr>
             <w:r>
-              <w:t xml:space="preserve">Implementierung einer Rest-Like API. </w:t>
+              <w:t>Implementierung einer Rest-</w:t>
+            </w:r>
+            <w:r>
+              <w:t>Like-</w:t>
+            </w:r>
+            <w:r>
+              <w:t xml:space="preserve">API. </w:t>
             </w:r>
             <w:r>
               <w:br/>
@@ -8940,12 +9122,6 @@
               <w:t>only</w:t>
             </w:r>
             <w:proofErr w:type="spellEnd"/>
-          </w:p>
-          <w:p>
-            <w:pPr>
-              <w:spacing w:before="60" w:after="60"/>
-              <w:ind w:left="720"/>
-            </w:pPr>
           </w:p>
           <w:p>
             <w:pPr>
@@ -9186,58 +9362,7 @@
               <w:rPr>
                 <w:bCs/>
               </w:rPr>
-              <w:fldChar w:fldCharType="begin">
-                <w:ffData>
-                  <w:name w:val="Text97"/>
-                  <w:enabled/>
-                  <w:calcOnExit w:val="0"/>
-                  <w:textInput>
-                    <w:default w:val="&lt;PSP-Code: AP-Name&gt;"/>
-                  </w:textInput>
-                </w:ffData>
-              </w:fldChar>
-            </w:r>
-            <w:r>
-              <w:rPr>
-                <w:bCs/>
-              </w:rPr>
-              <w:instrText xml:space="preserve"> </w:instrText>
-            </w:r>
-            <w:r>
-              <w:rPr>
-                <w:bCs/>
-              </w:rPr>
-              <w:instrText>FORMTEXT</w:instrText>
-            </w:r>
-            <w:r>
-              <w:rPr>
-                <w:bCs/>
-              </w:rPr>
-              <w:instrText xml:space="preserve"> </w:instrText>
-            </w:r>
-            <w:r>
-              <w:rPr>
-                <w:bCs/>
-              </w:rPr>
-            </w:r>
-            <w:r>
-              <w:rPr>
-                <w:bCs/>
-              </w:rPr>
-              <w:fldChar w:fldCharType="separate"/>
-            </w:r>
-            <w:r>
-              <w:rPr>
-                <w:bCs/>
-                <w:noProof/>
-              </w:rPr>
-              <w:t>&lt;PSP-Code: AP-Name&gt;</w:t>
-            </w:r>
-            <w:r>
-              <w:rPr>
-                <w:bCs/>
-              </w:rPr>
-              <w:fldChar w:fldCharType="end"/>
+              <w:t>Hub-System</w:t>
             </w:r>
           </w:p>
         </w:tc>
@@ -9297,12 +9422,6 @@
             <w:r>
               <w:t xml:space="preserve"> </w:t>
             </w:r>
-          </w:p>
-          <w:p>
-            <w:pPr>
-              <w:spacing w:before="60" w:after="60"/>
-              <w:ind w:left="720"/>
-            </w:pPr>
           </w:p>
           <w:p>
             <w:pPr>
@@ -9673,6 +9792,9 @@
             <w:pPr>
               <w:spacing w:before="60" w:after="60"/>
             </w:pPr>
+            <w:r>
+              <w:t>1</w:t>
+            </w:r>
           </w:p>
         </w:tc>
         <w:tc>
@@ -9683,6 +9805,9 @@
             <w:pPr>
               <w:spacing w:before="60" w:after="60"/>
             </w:pPr>
+            <w:r>
+              <w:t>Projektplanung</w:t>
+            </w:r>
           </w:p>
         </w:tc>
         <w:tc>
@@ -9693,6 +9818,9 @@
             <w:pPr>
               <w:spacing w:before="60" w:after="60"/>
             </w:pPr>
+            <w:r>
+              <w:t>12.05.2026</w:t>
+            </w:r>
           </w:p>
         </w:tc>
         <w:tc>
@@ -9703,6 +9831,15 @@
             <w:pPr>
               <w:spacing w:before="60" w:after="60"/>
             </w:pPr>
+            <w:r>
+              <w:t>1</w:t>
+            </w:r>
+            <w:r>
+              <w:t>5</w:t>
+            </w:r>
+            <w:r>
+              <w:t>.05.2026</w:t>
+            </w:r>
           </w:p>
         </w:tc>
       </w:tr>
@@ -9715,6 +9852,9 @@
             <w:pPr>
               <w:spacing w:before="60" w:after="60"/>
             </w:pPr>
+            <w:r>
+              <w:t>2</w:t>
+            </w:r>
           </w:p>
         </w:tc>
         <w:tc>
@@ -9725,6 +9865,9 @@
             <w:pPr>
               <w:spacing w:before="60" w:after="60"/>
             </w:pPr>
+            <w:r>
+              <w:t>Projektbasis/Struktur</w:t>
+            </w:r>
           </w:p>
         </w:tc>
         <w:tc>
@@ -9735,6 +9878,9 @@
             <w:pPr>
               <w:spacing w:before="60" w:after="60"/>
             </w:pPr>
+            <w:r>
+              <w:t>15.05.2026</w:t>
+            </w:r>
           </w:p>
         </w:tc>
         <w:tc>
@@ -9745,6 +9891,9 @@
             <w:pPr>
               <w:spacing w:before="60" w:after="60"/>
             </w:pPr>
+            <w:r>
+              <w:t>18.05.2026</w:t>
+            </w:r>
           </w:p>
         </w:tc>
       </w:tr>
@@ -9757,6 +9906,9 @@
             <w:pPr>
               <w:spacing w:before="60" w:after="60"/>
             </w:pPr>
+            <w:r>
+              <w:t>3</w:t>
+            </w:r>
           </w:p>
         </w:tc>
         <w:tc>
@@ -9767,6 +9919,9 @@
             <w:pPr>
               <w:spacing w:before="60" w:after="60"/>
             </w:pPr>
+            <w:r>
+              <w:t>API</w:t>
+            </w:r>
           </w:p>
         </w:tc>
         <w:tc>
@@ -9777,6 +9932,9 @@
             <w:pPr>
               <w:spacing w:before="60" w:after="60"/>
             </w:pPr>
+            <w:r>
+              <w:t>25.05.2026</w:t>
+            </w:r>
           </w:p>
         </w:tc>
         <w:tc>
@@ -9787,6 +9945,9 @@
             <w:pPr>
               <w:spacing w:before="60" w:after="60"/>
             </w:pPr>
+            <w:r>
+              <w:t>22.05.2026</w:t>
+            </w:r>
           </w:p>
         </w:tc>
       </w:tr>
@@ -9799,6 +9960,9 @@
             <w:pPr>
               <w:spacing w:before="60" w:after="60"/>
             </w:pPr>
+            <w:r>
+              <w:t>4</w:t>
+            </w:r>
           </w:p>
         </w:tc>
         <w:tc>
@@ -9809,6 +9973,9 @@
             <w:pPr>
               <w:spacing w:before="60" w:after="60"/>
             </w:pPr>
+            <w:r>
+              <w:t>Frontend</w:t>
+            </w:r>
           </w:p>
         </w:tc>
         <w:tc>
@@ -9819,6 +9986,9 @@
             <w:pPr>
               <w:spacing w:before="60" w:after="60"/>
             </w:pPr>
+            <w:r>
+              <w:t>25.06.2026</w:t>
+            </w:r>
           </w:p>
         </w:tc>
         <w:tc>
@@ -9829,6 +9999,9 @@
             <w:pPr>
               <w:spacing w:before="60" w:after="60"/>
             </w:pPr>
+            <w:r>
+              <w:t>-</w:t>
+            </w:r>
           </w:p>
         </w:tc>
       </w:tr>
@@ -9841,6 +10014,9 @@
             <w:pPr>
               <w:spacing w:before="60" w:after="60"/>
             </w:pPr>
+            <w:r>
+              <w:t>5</w:t>
+            </w:r>
           </w:p>
         </w:tc>
         <w:tc>
@@ -9851,6 +10027,9 @@
             <w:pPr>
               <w:spacing w:before="60" w:after="60"/>
             </w:pPr>
+            <w:r>
+              <w:t>Abschluss</w:t>
+            </w:r>
           </w:p>
         </w:tc>
         <w:tc>
@@ -9861,6 +10040,12 @@
             <w:pPr>
               <w:spacing w:before="60" w:after="60"/>
             </w:pPr>
+            <w:r>
+              <w:t>26</w:t>
+            </w:r>
+            <w:r>
+              <w:t>.06.2026</w:t>
+            </w:r>
           </w:p>
         </w:tc>
         <w:tc>
@@ -9871,6 +10056,9 @@
             <w:pPr>
               <w:spacing w:before="60" w:after="60"/>
             </w:pPr>
+            <w:r>
+              <w:t>-</w:t>
+            </w:r>
           </w:p>
         </w:tc>
       </w:tr>
@@ -9880,495 +10068,105 @@
     <w:p>
       <w:pPr>
         <w:rPr>
-          <w:i/>
+          <w:iCs/>
+          <w:sz w:val="28"/>
+          <w:szCs w:val="28"/>
         </w:rPr>
       </w:pPr>
+      <w:r>
+        <w:rPr>
+          <w:iCs/>
+          <w:sz w:val="28"/>
+          <w:szCs w:val="28"/>
+        </w:rPr>
+        <w:t xml:space="preserve">PSP </w:t>
+      </w:r>
+      <w:r>
+        <w:rPr>
+          <w:iCs/>
+          <w:sz w:val="28"/>
+          <w:szCs w:val="28"/>
+        </w:rPr>
+        <w:t>Visuell:</w:t>
+      </w:r>
       <w:r>
         <w:rPr>
           <w:i/>
         </w:rPr>
-        <w:t>&lt;ggf. können Sie hier noch einen Phasenplan als Grafik einfügen&gt;</w:t>
+        <w:t xml:space="preserve"> </w:t>
       </w:r>
+      <w:r>
+        <w:rPr>
+          <w:i/>
+        </w:rPr>
+        <w:drawing>
+          <wp:inline distT="0" distB="0" distL="0" distR="0" wp14:anchorId="371C9D87" wp14:editId="5F476F41">
+            <wp:extent cx="5759450" cy="3732530"/>
+            <wp:effectExtent l="0" t="0" r="0" b="1270"/>
+            <wp:docPr id="696562315" name="Grafik 1"/>
+            <wp:cNvGraphicFramePr>
+              <a:graphicFrameLocks xmlns:a="http://schemas.openxmlformats.org/drawingml/2006/main" noChangeAspect="1"/>
+            </wp:cNvGraphicFramePr>
+            <a:graphic xmlns:a="http://schemas.openxmlformats.org/drawingml/2006/main">
+              <a:graphicData uri="http://schemas.openxmlformats.org/drawingml/2006/picture">
+                <pic:pic xmlns:pic="http://schemas.openxmlformats.org/drawingml/2006/picture">
+                  <pic:nvPicPr>
+                    <pic:cNvPr id="696562315" name=""/>
+                    <pic:cNvPicPr/>
+                  </pic:nvPicPr>
+                  <pic:blipFill>
+                    <a:blip r:embed="rId10"/>
+                    <a:stretch>
+                      <a:fillRect/>
+                    </a:stretch>
+                  </pic:blipFill>
+                  <pic:spPr>
+                    <a:xfrm>
+                      <a:off x="0" y="0"/>
+                      <a:ext cx="5759450" cy="3732530"/>
+                    </a:xfrm>
+                    <a:prstGeom prst="rect">
+                      <a:avLst/>
+                    </a:prstGeom>
+                  </pic:spPr>
+                </pic:pic>
+              </a:graphicData>
+            </a:graphic>
+          </wp:inline>
+        </w:drawing>
+      </w:r>
+    </w:p>
+    <w:p>
+      <w:pPr>
+        <w:rPr>
+          <w:i/>
+        </w:rPr>
+      </w:pPr>
     </w:p>
     <w:p/>
     <w:p>
       <w:pPr>
         <w:pStyle w:val="berschrift1"/>
+        <w:numPr>
+          <w:ilvl w:val="0"/>
+          <w:numId w:val="0"/>
+        </w:numPr>
       </w:pPr>
       <w:r>
         <w:br w:type="page"/>
       </w:r>
-      <w:bookmarkStart w:id="48" w:name="_Toc116286526"/>
-      <w:bookmarkStart w:id="49" w:name="_Toc396809842"/>
-      <w:bookmarkStart w:id="50" w:name="_Toc397882999"/>
-      <w:bookmarkStart w:id="51" w:name="_Toc230788890"/>
+      <w:bookmarkStart w:id="48" w:name="_Toc116286527"/>
+      <w:bookmarkStart w:id="49" w:name="_Toc396809843"/>
+      <w:bookmarkStart w:id="50" w:name="_Toc397883000"/>
+      <w:bookmarkStart w:id="51" w:name="_Toc230788891"/>
       <w:r>
         <w:lastRenderedPageBreak/>
-        <w:t>Projektterminplan</w:t>
+        <w:t>Projektkostenplan / Zeiterfassung</w:t>
       </w:r>
       <w:bookmarkEnd w:id="48"/>
       <w:bookmarkEnd w:id="49"/>
       <w:bookmarkEnd w:id="50"/>
       <w:bookmarkEnd w:id="51"/>
-    </w:p>
-    <w:p>
-      <w:pPr>
-        <w:rPr>
-          <w:i/>
-        </w:rPr>
-      </w:pPr>
-      <w:r>
-        <w:rPr>
-          <w:i/>
-        </w:rPr>
-        <w:t xml:space="preserve">Idealerweise fügen Sie an dieser Stelle einen Balkenplan Ihres Projekts ein. Diesen erstellen Sie mittels </w:t>
-      </w:r>
-      <w:proofErr w:type="spellStart"/>
-      <w:r>
-        <w:rPr>
-          <w:i/>
-        </w:rPr>
-        <w:t>ProjektLibre</w:t>
-      </w:r>
-      <w:proofErr w:type="spellEnd"/>
-      <w:r>
-        <w:rPr>
-          <w:i/>
-        </w:rPr>
-        <w:t>.</w:t>
-      </w:r>
-    </w:p>
-    <w:p>
-      <w:pPr>
-        <w:rPr>
-          <w:i/>
-        </w:rPr>
-      </w:pPr>
-    </w:p>
-    <w:p>
-      <w:pPr>
-        <w:rPr>
-          <w:i/>
-        </w:rPr>
-      </w:pPr>
-      <w:r>
-        <w:rPr>
-          <w:i/>
-        </w:rPr>
-        <w:t xml:space="preserve">Bei Projekten mittlerer oder geringer Komplexität kann es aber auch schon ausreichen, eine Terminübersicht </w:t>
-      </w:r>
-      <w:r>
-        <w:rPr>
-          <w:i/>
-        </w:rPr>
-        <w:t>mit nachstehendem</w:t>
-      </w:r>
-      <w:r>
-        <w:rPr>
-          <w:i/>
-        </w:rPr>
-        <w:t xml:space="preserve"> Muster zu führen und kontinuierlich zu aktualisieren:</w:t>
-      </w:r>
-    </w:p>
-    <w:p/>
-    <w:tbl>
-      <w:tblPr>
-        <w:tblW w:w="0" w:type="auto"/>
-        <w:tblBorders>
-          <w:top w:val="single" w:sz="4" w:space="0" w:color="000000"/>
-          <w:left w:val="single" w:sz="4" w:space="0" w:color="000000"/>
-          <w:bottom w:val="single" w:sz="4" w:space="0" w:color="000000"/>
-          <w:right w:val="single" w:sz="4" w:space="0" w:color="000000"/>
-          <w:insideH w:val="single" w:sz="4" w:space="0" w:color="000000"/>
-          <w:insideV w:val="single" w:sz="4" w:space="0" w:color="000000"/>
-        </w:tblBorders>
-        <w:tblLook w:val="00A0" w:firstRow="1" w:lastRow="0" w:firstColumn="1" w:lastColumn="0" w:noHBand="0" w:noVBand="0"/>
-      </w:tblPr>
-      <w:tblGrid>
-        <w:gridCol w:w="2254"/>
-        <w:gridCol w:w="2266"/>
-        <w:gridCol w:w="2270"/>
-        <w:gridCol w:w="2270"/>
-      </w:tblGrid>
-      <w:tr>
-        <w:tc>
-          <w:tcPr>
-            <w:tcW w:w="9210" w:type="dxa"/>
-            <w:gridSpan w:val="4"/>
-            <w:shd w:val="clear" w:color="auto" w:fill="8DB3E2"/>
-          </w:tcPr>
-          <w:p>
-            <w:pPr>
-              <w:spacing w:before="60" w:after="60"/>
-              <w:jc w:val="center"/>
-              <w:rPr>
-                <w:b/>
-                <w:bCs/>
-              </w:rPr>
-            </w:pPr>
-            <w:r>
-              <w:rPr>
-                <w:b/>
-                <w:bCs/>
-              </w:rPr>
-              <w:t>Projektterminplan</w:t>
-            </w:r>
-          </w:p>
-        </w:tc>
-      </w:tr>
-      <w:tr>
-        <w:tc>
-          <w:tcPr>
-            <w:tcW w:w="2302" w:type="dxa"/>
-            <w:shd w:val="clear" w:color="auto" w:fill="8DB3E2"/>
-            <w:vAlign w:val="center"/>
-          </w:tcPr>
-          <w:p>
-            <w:pPr>
-              <w:spacing w:before="60" w:after="60"/>
-              <w:jc w:val="center"/>
-              <w:rPr>
-                <w:b/>
-              </w:rPr>
-            </w:pPr>
-            <w:r>
-              <w:rPr>
-                <w:b/>
-              </w:rPr>
-              <w:t>Arbeitspaket / Meilenstein</w:t>
-            </w:r>
-          </w:p>
-        </w:tc>
-        <w:tc>
-          <w:tcPr>
-            <w:tcW w:w="2302" w:type="dxa"/>
-            <w:shd w:val="clear" w:color="auto" w:fill="8DB3E2"/>
-            <w:vAlign w:val="center"/>
-          </w:tcPr>
-          <w:p>
-            <w:pPr>
-              <w:spacing w:before="60" w:after="60"/>
-              <w:jc w:val="center"/>
-              <w:rPr>
-                <w:b/>
-              </w:rPr>
-            </w:pPr>
-            <w:r>
-              <w:rPr>
-                <w:b/>
-              </w:rPr>
-              <w:t>Verantwortlich für die termingerechte Fertigstellung</w:t>
-            </w:r>
-          </w:p>
-        </w:tc>
-        <w:tc>
-          <w:tcPr>
-            <w:tcW w:w="2303" w:type="dxa"/>
-            <w:shd w:val="clear" w:color="auto" w:fill="8DB3E2"/>
-            <w:vAlign w:val="center"/>
-          </w:tcPr>
-          <w:p>
-            <w:pPr>
-              <w:spacing w:before="60" w:after="60"/>
-              <w:jc w:val="center"/>
-              <w:rPr>
-                <w:b/>
-              </w:rPr>
-            </w:pPr>
-            <w:r>
-              <w:rPr>
-                <w:b/>
-              </w:rPr>
-              <w:t>Termin PLAN</w:t>
-            </w:r>
-          </w:p>
-        </w:tc>
-        <w:tc>
-          <w:tcPr>
-            <w:tcW w:w="2303" w:type="dxa"/>
-            <w:shd w:val="clear" w:color="auto" w:fill="8DB3E2"/>
-            <w:vAlign w:val="center"/>
-          </w:tcPr>
-          <w:p>
-            <w:pPr>
-              <w:spacing w:before="60" w:after="60"/>
-              <w:jc w:val="center"/>
-              <w:rPr>
-                <w:b/>
-              </w:rPr>
-            </w:pPr>
-            <w:r>
-              <w:rPr>
-                <w:b/>
-              </w:rPr>
-              <w:t>Termin IST</w:t>
-            </w:r>
-          </w:p>
-        </w:tc>
-      </w:tr>
-      <w:tr>
-        <w:tc>
-          <w:tcPr>
-            <w:tcW w:w="2302" w:type="dxa"/>
-          </w:tcPr>
-          <w:p>
-            <w:pPr>
-              <w:spacing w:before="60" w:after="60"/>
-            </w:pPr>
-            <w:r>
-              <w:rPr>
-                <w:bCs/>
-              </w:rPr>
-              <w:fldChar w:fldCharType="begin">
-                <w:ffData>
-                  <w:name w:val=""/>
-                  <w:enabled/>
-                  <w:calcOnExit w:val="0"/>
-                  <w:textInput>
-                    <w:default w:val="&lt;PSP-Code: AP-/MS-Name&gt;"/>
-                  </w:textInput>
-                </w:ffData>
-              </w:fldChar>
-            </w:r>
-            <w:r>
-              <w:rPr>
-                <w:bCs/>
-              </w:rPr>
-              <w:instrText xml:space="preserve"> </w:instrText>
-            </w:r>
-            <w:r>
-              <w:rPr>
-                <w:bCs/>
-              </w:rPr>
-              <w:instrText>FORMTEXT</w:instrText>
-            </w:r>
-            <w:r>
-              <w:rPr>
-                <w:bCs/>
-              </w:rPr>
-              <w:instrText xml:space="preserve"> </w:instrText>
-            </w:r>
-            <w:r>
-              <w:rPr>
-                <w:bCs/>
-              </w:rPr>
-            </w:r>
-            <w:r>
-              <w:rPr>
-                <w:bCs/>
-              </w:rPr>
-              <w:fldChar w:fldCharType="separate"/>
-            </w:r>
-            <w:r>
-              <w:rPr>
-                <w:bCs/>
-                <w:noProof/>
-              </w:rPr>
-              <w:t>&lt;PSP-Code: AP-/MS-Name&gt;</w:t>
-            </w:r>
-            <w:r>
-              <w:rPr>
-                <w:bCs/>
-              </w:rPr>
-              <w:fldChar w:fldCharType="end"/>
-            </w:r>
-          </w:p>
-        </w:tc>
-        <w:tc>
-          <w:tcPr>
-            <w:tcW w:w="2302" w:type="dxa"/>
-          </w:tcPr>
-          <w:p>
-            <w:pPr>
-              <w:spacing w:before="60" w:after="60"/>
-            </w:pPr>
-            <w:r>
-              <w:fldChar w:fldCharType="begin">
-                <w:ffData>
-                  <w:name w:val="Text96"/>
-                  <w:enabled/>
-                  <w:calcOnExit w:val="0"/>
-                  <w:textInput>
-                    <w:default w:val="&lt;Name&gt;"/>
-                  </w:textInput>
-                </w:ffData>
-              </w:fldChar>
-            </w:r>
-            <w:r>
-              <w:instrText xml:space="preserve"> </w:instrText>
-            </w:r>
-            <w:r>
-              <w:instrText>FORMTEXT</w:instrText>
-            </w:r>
-            <w:r>
-              <w:instrText xml:space="preserve"> </w:instrText>
-            </w:r>
-            <w:r>
-              <w:fldChar w:fldCharType="separate"/>
-            </w:r>
-            <w:r>
-              <w:rPr>
-                <w:noProof/>
-              </w:rPr>
-              <w:t>&lt;Name&gt;</w:t>
-            </w:r>
-            <w:r>
-              <w:fldChar w:fldCharType="end"/>
-            </w:r>
-          </w:p>
-        </w:tc>
-        <w:tc>
-          <w:tcPr>
-            <w:tcW w:w="2303" w:type="dxa"/>
-          </w:tcPr>
-          <w:p>
-            <w:pPr>
-              <w:spacing w:before="60" w:after="60"/>
-            </w:pPr>
-            <w:r>
-              <w:fldChar w:fldCharType="begin">
-                <w:ffData>
-                  <w:name w:val=""/>
-                  <w:enabled/>
-                  <w:calcOnExit w:val="0"/>
-                  <w:textInput>
-                    <w:default w:val="&lt;Datum, Kalenderwoche&gt;"/>
-                  </w:textInput>
-                </w:ffData>
-              </w:fldChar>
-            </w:r>
-            <w:r>
-              <w:instrText xml:space="preserve"> </w:instrText>
-            </w:r>
-            <w:r>
-              <w:instrText>FORMTEXT</w:instrText>
-            </w:r>
-            <w:r>
-              <w:instrText xml:space="preserve"> </w:instrText>
-            </w:r>
-            <w:r>
-              <w:fldChar w:fldCharType="separate"/>
-            </w:r>
-            <w:r>
-              <w:rPr>
-                <w:noProof/>
-              </w:rPr>
-              <w:t>&lt;Datum, Kalenderwoche&gt;</w:t>
-            </w:r>
-            <w:r>
-              <w:fldChar w:fldCharType="end"/>
-            </w:r>
-          </w:p>
-        </w:tc>
-        <w:tc>
-          <w:tcPr>
-            <w:tcW w:w="2303" w:type="dxa"/>
-          </w:tcPr>
-          <w:p>
-            <w:pPr>
-              <w:spacing w:before="60" w:after="60"/>
-            </w:pPr>
-            <w:r>
-              <w:fldChar w:fldCharType="begin">
-                <w:ffData>
-                  <w:name w:val=""/>
-                  <w:enabled/>
-                  <w:calcOnExit w:val="0"/>
-                  <w:textInput>
-                    <w:default w:val="&lt;Datum, Kalenderwoche&gt;"/>
-                  </w:textInput>
-                </w:ffData>
-              </w:fldChar>
-            </w:r>
-            <w:r>
-              <w:instrText xml:space="preserve"> </w:instrText>
-            </w:r>
-            <w:r>
-              <w:instrText>FORMTEXT</w:instrText>
-            </w:r>
-            <w:r>
-              <w:instrText xml:space="preserve"> </w:instrText>
-            </w:r>
-            <w:r>
-              <w:fldChar w:fldCharType="separate"/>
-            </w:r>
-            <w:r>
-              <w:rPr>
-                <w:noProof/>
-              </w:rPr>
-              <w:t>&lt;Datum, Kalenderwoche&gt;</w:t>
-            </w:r>
-            <w:r>
-              <w:fldChar w:fldCharType="end"/>
-            </w:r>
-          </w:p>
-        </w:tc>
-      </w:tr>
-      <w:tr>
-        <w:tc>
-          <w:tcPr>
-            <w:tcW w:w="2302" w:type="dxa"/>
-          </w:tcPr>
-          <w:p>
-            <w:pPr>
-              <w:spacing w:before="60" w:after="60"/>
-            </w:pPr>
-          </w:p>
-        </w:tc>
-        <w:tc>
-          <w:tcPr>
-            <w:tcW w:w="2302" w:type="dxa"/>
-          </w:tcPr>
-          <w:p>
-            <w:pPr>
-              <w:spacing w:before="60" w:after="60"/>
-            </w:pPr>
-          </w:p>
-        </w:tc>
-        <w:tc>
-          <w:tcPr>
-            <w:tcW w:w="2303" w:type="dxa"/>
-          </w:tcPr>
-          <w:p>
-            <w:pPr>
-              <w:spacing w:before="60" w:after="60"/>
-            </w:pPr>
-          </w:p>
-        </w:tc>
-        <w:tc>
-          <w:tcPr>
-            <w:tcW w:w="2303" w:type="dxa"/>
-          </w:tcPr>
-          <w:p>
-            <w:pPr>
-              <w:spacing w:before="60" w:after="60"/>
-            </w:pPr>
-          </w:p>
-        </w:tc>
-      </w:tr>
-    </w:tbl>
-    <w:p/>
-    <w:p/>
-    <w:p/>
-    <w:p>
-      <w:pPr>
-        <w:pStyle w:val="berschrift1"/>
-      </w:pPr>
-      <w:r>
-        <w:br w:type="page"/>
-      </w:r>
-      <w:bookmarkStart w:id="52" w:name="_Toc116286527"/>
-      <w:bookmarkStart w:id="53" w:name="_Toc396809843"/>
-      <w:bookmarkStart w:id="54" w:name="_Toc397883000"/>
-      <w:bookmarkStart w:id="55" w:name="_Toc230788891"/>
-      <w:r>
-        <w:lastRenderedPageBreak/>
-        <w:t>Projektkostenplan / Zeiterfassung</w:t>
-      </w:r>
-      <w:bookmarkEnd w:id="52"/>
-      <w:bookmarkEnd w:id="53"/>
-      <w:bookmarkEnd w:id="54"/>
-      <w:bookmarkEnd w:id="55"/>
     </w:p>
     <w:p>
       <w:pPr>
@@ -10410,16 +10208,16 @@
         <w:tblLook w:val="00A0" w:firstRow="1" w:lastRow="0" w:firstColumn="1" w:lastColumn="0" w:noHBand="0" w:noVBand="0"/>
       </w:tblPr>
       <w:tblGrid>
-        <w:gridCol w:w="1832"/>
-        <w:gridCol w:w="1816"/>
-        <w:gridCol w:w="1811"/>
-        <w:gridCol w:w="1800"/>
-        <w:gridCol w:w="1801"/>
+        <w:gridCol w:w="2783"/>
+        <w:gridCol w:w="1619"/>
+        <w:gridCol w:w="1595"/>
+        <w:gridCol w:w="1529"/>
+        <w:gridCol w:w="1534"/>
       </w:tblGrid>
       <w:tr>
         <w:tc>
           <w:tcPr>
-            <w:tcW w:w="9286" w:type="dxa"/>
+            <w:tcW w:w="9060" w:type="dxa"/>
             <w:gridSpan w:val="5"/>
             <w:shd w:val="clear" w:color="auto" w:fill="8DB3E2"/>
           </w:tcPr>
@@ -10445,7 +10243,7 @@
       <w:tr>
         <w:tc>
           <w:tcPr>
-            <w:tcW w:w="1857" w:type="dxa"/>
+            <w:tcW w:w="2783" w:type="dxa"/>
             <w:shd w:val="clear" w:color="auto" w:fill="8DB3E2"/>
             <w:vAlign w:val="center"/>
           </w:tcPr>
@@ -10467,7 +10265,7 @@
         </w:tc>
         <w:tc>
           <w:tcPr>
-            <w:tcW w:w="1857" w:type="dxa"/>
+            <w:tcW w:w="1619" w:type="dxa"/>
             <w:shd w:val="clear" w:color="auto" w:fill="8DB3E2"/>
             <w:vAlign w:val="center"/>
           </w:tcPr>
@@ -10489,7 +10287,7 @@
         </w:tc>
         <w:tc>
           <w:tcPr>
-            <w:tcW w:w="1857" w:type="dxa"/>
+            <w:tcW w:w="1595" w:type="dxa"/>
             <w:shd w:val="clear" w:color="auto" w:fill="8DB3E2"/>
             <w:vAlign w:val="center"/>
           </w:tcPr>
@@ -10511,7 +10309,7 @@
         </w:tc>
         <w:tc>
           <w:tcPr>
-            <w:tcW w:w="1857" w:type="dxa"/>
+            <w:tcW w:w="1529" w:type="dxa"/>
             <w:shd w:val="clear" w:color="auto" w:fill="8DB3E2"/>
             <w:vAlign w:val="center"/>
           </w:tcPr>
@@ -10533,7 +10331,7 @@
         </w:tc>
         <w:tc>
           <w:tcPr>
-            <w:tcW w:w="1858" w:type="dxa"/>
+            <w:tcW w:w="1534" w:type="dxa"/>
             <w:shd w:val="clear" w:color="auto" w:fill="8DB3E2"/>
             <w:vAlign w:val="center"/>
           </w:tcPr>
@@ -10557,117 +10355,36 @@
       <w:tr>
         <w:tc>
           <w:tcPr>
-            <w:tcW w:w="1857" w:type="dxa"/>
-          </w:tcPr>
-          <w:p>
-            <w:pPr>
-              <w:spacing w:before="60" w:after="60"/>
-            </w:pPr>
-            <w:r>
-              <w:rPr>
-                <w:bCs/>
-              </w:rPr>
-              <w:fldChar w:fldCharType="begin">
-                <w:ffData>
-                  <w:name w:val=""/>
-                  <w:enabled/>
-                  <w:calcOnExit w:val="0"/>
-                  <w:textInput>
-                    <w:default w:val="&lt;PSP-Code: AP-/MS-Name&gt;"/>
-                  </w:textInput>
-                </w:ffData>
-              </w:fldChar>
-            </w:r>
-            <w:r>
-              <w:rPr>
-                <w:bCs/>
-              </w:rPr>
-              <w:instrText xml:space="preserve"> </w:instrText>
-            </w:r>
-            <w:r>
-              <w:rPr>
-                <w:bCs/>
-              </w:rPr>
-              <w:instrText>FORMTEXT</w:instrText>
-            </w:r>
-            <w:r>
-              <w:rPr>
-                <w:bCs/>
-              </w:rPr>
-              <w:instrText xml:space="preserve"> </w:instrText>
-            </w:r>
-            <w:r>
-              <w:rPr>
-                <w:bCs/>
-              </w:rPr>
-            </w:r>
-            <w:r>
-              <w:rPr>
-                <w:bCs/>
-              </w:rPr>
-              <w:fldChar w:fldCharType="separate"/>
-            </w:r>
-            <w:r>
-              <w:rPr>
-                <w:bCs/>
-                <w:noProof/>
-              </w:rPr>
-              <w:t>&lt;PSP-Code: AP-/MS-Name&gt;</w:t>
-            </w:r>
-            <w:r>
-              <w:rPr>
-                <w:bCs/>
-              </w:rPr>
-              <w:fldChar w:fldCharType="end"/>
-            </w:r>
-          </w:p>
-        </w:tc>
-        <w:tc>
-          <w:tcPr>
-            <w:tcW w:w="1857" w:type="dxa"/>
-          </w:tcPr>
-          <w:p>
-            <w:pPr>
-              <w:spacing w:before="60" w:after="60"/>
-            </w:pPr>
-            <w:r>
-              <w:fldChar w:fldCharType="begin">
-                <w:ffData>
-                  <w:name w:val=""/>
-                  <w:enabled/>
-                  <w:calcOnExit w:val="0"/>
-                  <w:textInput>
-                    <w:default w:val="&lt;z.B. Personal, Material&gt;"/>
-                  </w:textInput>
-                </w:ffData>
-              </w:fldChar>
-            </w:r>
-            <w:r>
-              <w:instrText xml:space="preserve"> </w:instrText>
-            </w:r>
-            <w:r>
-              <w:instrText>FORMTEXT</w:instrText>
-            </w:r>
-            <w:r>
-              <w:instrText xml:space="preserve"> </w:instrText>
-            </w:r>
-            <w:r>
-              <w:fldChar w:fldCharType="separate"/>
-            </w:r>
-            <w:r>
-              <w:rPr>
-                <w:noProof/>
-              </w:rPr>
-              <w:t>&lt;z.B. Personal, Material&gt;</w:t>
-            </w:r>
-            <w:r>
-              <w:fldChar w:fldCharType="end"/>
-            </w:r>
-          </w:p>
-        </w:tc>
-        <w:tc>
-          <w:tcPr>
-            <w:tcW w:w="1857" w:type="dxa"/>
+            <w:tcW w:w="2783" w:type="dxa"/>
+          </w:tcPr>
+          <w:p>
+            <w:pPr>
+              <w:spacing w:before="60" w:after="60"/>
+            </w:pPr>
+            <w:r>
+              <w:t xml:space="preserve">1 - </w:t>
+            </w:r>
+            <w:r>
+              <w:t>Projektplanung</w:t>
+            </w:r>
+          </w:p>
+        </w:tc>
+        <w:tc>
+          <w:tcPr>
+            <w:tcW w:w="1619" w:type="dxa"/>
+          </w:tcPr>
+          <w:p>
+            <w:pPr>
+              <w:spacing w:before="60" w:after="60"/>
+            </w:pPr>
+            <w:r>
+              <w:t>Personal</w:t>
+            </w:r>
+          </w:p>
+        </w:tc>
+        <w:tc>
+          <w:tcPr>
+            <w:tcW w:w="1595" w:type="dxa"/>
           </w:tcPr>
           <w:p>
             <w:pPr>
@@ -10675,43 +10392,13 @@
               <w:jc w:val="center"/>
             </w:pPr>
             <w:r>
-              <w:fldChar w:fldCharType="begin">
-                <w:ffData>
-                  <w:name w:val=""/>
-                  <w:enabled/>
-                  <w:calcOnExit w:val="0"/>
-                  <w:textInput>
-                    <w:default w:val="&lt;z.B. 5 Stunden&gt;"/>
-                  </w:textInput>
-                </w:ffData>
-              </w:fldChar>
-            </w:r>
-            <w:r>
-              <w:instrText xml:space="preserve"> </w:instrText>
-            </w:r>
-            <w:r>
-              <w:instrText>FORMTEXT</w:instrText>
-            </w:r>
-            <w:r>
-              <w:instrText xml:space="preserve"> </w:instrText>
-            </w:r>
-            <w:r>
-              <w:fldChar w:fldCharType="separate"/>
-            </w:r>
-            <w:r>
-              <w:rPr>
-                <w:noProof/>
-              </w:rPr>
-              <w:t>&lt;z.B. 5 Stunden&gt;</w:t>
-            </w:r>
-            <w:r>
-              <w:fldChar w:fldCharType="end"/>
-            </w:r>
-          </w:p>
-        </w:tc>
-        <w:tc>
-          <w:tcPr>
-            <w:tcW w:w="1857" w:type="dxa"/>
+              <w:t>16 Stunden</w:t>
+            </w:r>
+          </w:p>
+        </w:tc>
+        <w:tc>
+          <w:tcPr>
+            <w:tcW w:w="1529" w:type="dxa"/>
           </w:tcPr>
           <w:p>
             <w:pPr>
@@ -10719,43 +10406,13 @@
               <w:jc w:val="center"/>
             </w:pPr>
             <w:r>
-              <w:fldChar w:fldCharType="begin">
-                <w:ffData>
-                  <w:name w:val=""/>
-                  <w:enabled/>
-                  <w:calcOnExit w:val="0"/>
-                  <w:textInput>
-                    <w:default w:val="&lt;z.B. € 100&gt;"/>
-                  </w:textInput>
-                </w:ffData>
-              </w:fldChar>
-            </w:r>
-            <w:r>
-              <w:instrText xml:space="preserve"> </w:instrText>
-            </w:r>
-            <w:r>
-              <w:instrText>FORMTEXT</w:instrText>
-            </w:r>
-            <w:r>
-              <w:instrText xml:space="preserve"> </w:instrText>
-            </w:r>
-            <w:r>
-              <w:fldChar w:fldCharType="separate"/>
-            </w:r>
-            <w:r>
-              <w:rPr>
-                <w:noProof/>
-              </w:rPr>
-              <w:t>&lt;z.B. € 100&gt;</w:t>
-            </w:r>
-            <w:r>
-              <w:fldChar w:fldCharType="end"/>
-            </w:r>
-          </w:p>
-        </w:tc>
-        <w:tc>
-          <w:tcPr>
-            <w:tcW w:w="1858" w:type="dxa"/>
+              <w:t>50</w:t>
+            </w:r>
+          </w:p>
+        </w:tc>
+        <w:tc>
+          <w:tcPr>
+            <w:tcW w:w="1534" w:type="dxa"/>
           </w:tcPr>
           <w:p>
             <w:pPr>
@@ -10763,37 +10420,7 @@
               <w:jc w:val="center"/>
             </w:pPr>
             <w:r>
-              <w:fldChar w:fldCharType="begin">
-                <w:ffData>
-                  <w:name w:val=""/>
-                  <w:enabled/>
-                  <w:calcOnExit w:val="0"/>
-                  <w:textInput>
-                    <w:default w:val="&lt;z.B. € 500&gt;"/>
-                  </w:textInput>
-                </w:ffData>
-              </w:fldChar>
-            </w:r>
-            <w:r>
-              <w:instrText xml:space="preserve"> </w:instrText>
-            </w:r>
-            <w:r>
-              <w:instrText>FORMTEXT</w:instrText>
-            </w:r>
-            <w:r>
-              <w:instrText xml:space="preserve"> </w:instrText>
-            </w:r>
-            <w:r>
-              <w:fldChar w:fldCharType="separate"/>
-            </w:r>
-            <w:r>
-              <w:rPr>
-                <w:noProof/>
-              </w:rPr>
-              <w:t>&lt;z.B. € 500&gt;</w:t>
-            </w:r>
-            <w:r>
-              <w:fldChar w:fldCharType="end"/>
+              <w:t>800</w:t>
             </w:r>
           </w:p>
         </w:tc>
@@ -10801,104 +10428,331 @@
       <w:tr>
         <w:tc>
           <w:tcPr>
-            <w:tcW w:w="1857" w:type="dxa"/>
-          </w:tcPr>
-          <w:p>
-            <w:pPr>
-              <w:spacing w:before="60" w:after="60"/>
-            </w:pPr>
-          </w:p>
-        </w:tc>
-        <w:tc>
-          <w:tcPr>
-            <w:tcW w:w="1857" w:type="dxa"/>
-          </w:tcPr>
-          <w:p>
-            <w:pPr>
-              <w:spacing w:before="60" w:after="60"/>
-            </w:pPr>
-          </w:p>
-        </w:tc>
-        <w:tc>
-          <w:tcPr>
-            <w:tcW w:w="1857" w:type="dxa"/>
+            <w:tcW w:w="2783" w:type="dxa"/>
+          </w:tcPr>
+          <w:p>
+            <w:pPr>
+              <w:spacing w:before="60" w:after="60"/>
+            </w:pPr>
+            <w:r>
+              <w:t xml:space="preserve">2 - </w:t>
+            </w:r>
+            <w:r>
+              <w:t>Projektbasis/Struktur</w:t>
+            </w:r>
+          </w:p>
+        </w:tc>
+        <w:tc>
+          <w:tcPr>
+            <w:tcW w:w="1619" w:type="dxa"/>
+          </w:tcPr>
+          <w:p>
+            <w:pPr>
+              <w:spacing w:before="60" w:after="60"/>
+            </w:pPr>
+            <w:r>
+              <w:t>Personal</w:t>
+            </w:r>
+          </w:p>
+        </w:tc>
+        <w:tc>
+          <w:tcPr>
+            <w:tcW w:w="1595" w:type="dxa"/>
           </w:tcPr>
           <w:p>
             <w:pPr>
               <w:spacing w:before="60" w:after="60"/>
               <w:jc w:val="center"/>
             </w:pPr>
-          </w:p>
-        </w:tc>
-        <w:tc>
-          <w:tcPr>
-            <w:tcW w:w="1857" w:type="dxa"/>
+            <w:r>
+              <w:t>8 Stunden</w:t>
+            </w:r>
+          </w:p>
+        </w:tc>
+        <w:tc>
+          <w:tcPr>
+            <w:tcW w:w="1529" w:type="dxa"/>
           </w:tcPr>
           <w:p>
             <w:pPr>
               <w:spacing w:before="60" w:after="60"/>
               <w:jc w:val="center"/>
             </w:pPr>
-          </w:p>
-        </w:tc>
-        <w:tc>
-          <w:tcPr>
-            <w:tcW w:w="1858" w:type="dxa"/>
+            <w:r>
+              <w:t>50</w:t>
+            </w:r>
+          </w:p>
+        </w:tc>
+        <w:tc>
+          <w:tcPr>
+            <w:tcW w:w="1534" w:type="dxa"/>
           </w:tcPr>
           <w:p>
             <w:pPr>
               <w:spacing w:before="60" w:after="60"/>
               <w:jc w:val="center"/>
             </w:pPr>
+            <w:r>
+              <w:t>400</w:t>
+            </w:r>
           </w:p>
         </w:tc>
       </w:tr>
       <w:tr>
         <w:tc>
           <w:tcPr>
-            <w:tcW w:w="1857" w:type="dxa"/>
-          </w:tcPr>
-          <w:p>
-            <w:pPr>
-              <w:spacing w:before="60" w:after="60"/>
-            </w:pPr>
-          </w:p>
-        </w:tc>
-        <w:tc>
-          <w:tcPr>
-            <w:tcW w:w="1857" w:type="dxa"/>
-          </w:tcPr>
-          <w:p>
-            <w:pPr>
-              <w:spacing w:before="60" w:after="60"/>
-            </w:pPr>
-          </w:p>
-        </w:tc>
-        <w:tc>
-          <w:tcPr>
-            <w:tcW w:w="1857" w:type="dxa"/>
+            <w:tcW w:w="2783" w:type="dxa"/>
+          </w:tcPr>
+          <w:p>
+            <w:pPr>
+              <w:spacing w:before="60" w:after="60"/>
+            </w:pPr>
+            <w:r>
+              <w:t xml:space="preserve">3 - </w:t>
+            </w:r>
+            <w:r>
+              <w:t>API</w:t>
+            </w:r>
+          </w:p>
+        </w:tc>
+        <w:tc>
+          <w:tcPr>
+            <w:tcW w:w="1619" w:type="dxa"/>
+          </w:tcPr>
+          <w:p>
+            <w:pPr>
+              <w:spacing w:before="60" w:after="60"/>
+            </w:pPr>
+            <w:r>
+              <w:t>Personal</w:t>
+            </w:r>
+          </w:p>
+        </w:tc>
+        <w:tc>
+          <w:tcPr>
+            <w:tcW w:w="1595" w:type="dxa"/>
           </w:tcPr>
           <w:p>
             <w:pPr>
               <w:spacing w:before="60" w:after="60"/>
               <w:jc w:val="center"/>
             </w:pPr>
-          </w:p>
-        </w:tc>
-        <w:tc>
-          <w:tcPr>
-            <w:tcW w:w="1857" w:type="dxa"/>
+            <w:r>
+              <w:t>20 Stunden</w:t>
+            </w:r>
+          </w:p>
+        </w:tc>
+        <w:tc>
+          <w:tcPr>
+            <w:tcW w:w="1529" w:type="dxa"/>
           </w:tcPr>
           <w:p>
             <w:pPr>
               <w:spacing w:before="60" w:after="60"/>
               <w:jc w:val="center"/>
             </w:pPr>
-          </w:p>
-        </w:tc>
-        <w:tc>
-          <w:tcPr>
-            <w:tcW w:w="1858" w:type="dxa"/>
+            <w:r>
+              <w:t>50</w:t>
+            </w:r>
+          </w:p>
+        </w:tc>
+        <w:tc>
+          <w:tcPr>
+            <w:tcW w:w="1534" w:type="dxa"/>
+          </w:tcPr>
+          <w:p>
+            <w:pPr>
+              <w:spacing w:before="60" w:after="60"/>
+              <w:jc w:val="center"/>
+            </w:pPr>
+            <w:r>
+              <w:t>1000</w:t>
+            </w:r>
+          </w:p>
+        </w:tc>
+      </w:tr>
+      <w:tr>
+        <w:tc>
+          <w:tcPr>
+            <w:tcW w:w="2783" w:type="dxa"/>
+          </w:tcPr>
+          <w:p>
+            <w:pPr>
+              <w:spacing w:before="60" w:after="60"/>
+            </w:pPr>
+            <w:r>
+              <w:t xml:space="preserve">4 - </w:t>
+            </w:r>
+            <w:r>
+              <w:t>Frontend</w:t>
+            </w:r>
+          </w:p>
+        </w:tc>
+        <w:tc>
+          <w:tcPr>
+            <w:tcW w:w="1619" w:type="dxa"/>
+          </w:tcPr>
+          <w:p>
+            <w:pPr>
+              <w:spacing w:before="60" w:after="60"/>
+            </w:pPr>
+            <w:r>
+              <w:t>Personal</w:t>
+            </w:r>
+          </w:p>
+        </w:tc>
+        <w:tc>
+          <w:tcPr>
+            <w:tcW w:w="1595" w:type="dxa"/>
+          </w:tcPr>
+          <w:p>
+            <w:pPr>
+              <w:spacing w:before="60" w:after="60"/>
+              <w:jc w:val="center"/>
+            </w:pPr>
+          </w:p>
+        </w:tc>
+        <w:tc>
+          <w:tcPr>
+            <w:tcW w:w="1529" w:type="dxa"/>
+          </w:tcPr>
+          <w:p>
+            <w:pPr>
+              <w:spacing w:before="60" w:after="60"/>
+              <w:jc w:val="center"/>
+            </w:pPr>
+          </w:p>
+        </w:tc>
+        <w:tc>
+          <w:tcPr>
+            <w:tcW w:w="1534" w:type="dxa"/>
+          </w:tcPr>
+          <w:p>
+            <w:pPr>
+              <w:spacing w:before="60" w:after="60"/>
+              <w:jc w:val="center"/>
+            </w:pPr>
+          </w:p>
+        </w:tc>
+      </w:tr>
+      <w:tr>
+        <w:tc>
+          <w:tcPr>
+            <w:tcW w:w="2783" w:type="dxa"/>
+          </w:tcPr>
+          <w:p>
+            <w:pPr>
+              <w:spacing w:before="60" w:after="60"/>
+            </w:pPr>
+            <w:r>
+              <w:t xml:space="preserve">5 - </w:t>
+            </w:r>
+            <w:r>
+              <w:t>Abschluss</w:t>
+            </w:r>
+          </w:p>
+        </w:tc>
+        <w:tc>
+          <w:tcPr>
+            <w:tcW w:w="1619" w:type="dxa"/>
+          </w:tcPr>
+          <w:p>
+            <w:pPr>
+              <w:spacing w:before="60" w:after="60"/>
+            </w:pPr>
+            <w:r>
+              <w:t>Personal</w:t>
+            </w:r>
+          </w:p>
+        </w:tc>
+        <w:tc>
+          <w:tcPr>
+            <w:tcW w:w="1595" w:type="dxa"/>
+          </w:tcPr>
+          <w:p>
+            <w:pPr>
+              <w:spacing w:before="60" w:after="60"/>
+              <w:jc w:val="center"/>
+            </w:pPr>
+          </w:p>
+        </w:tc>
+        <w:tc>
+          <w:tcPr>
+            <w:tcW w:w="1529" w:type="dxa"/>
+          </w:tcPr>
+          <w:p>
+            <w:pPr>
+              <w:spacing w:before="60" w:after="60"/>
+              <w:jc w:val="center"/>
+            </w:pPr>
+          </w:p>
+        </w:tc>
+        <w:tc>
+          <w:tcPr>
+            <w:tcW w:w="1534" w:type="dxa"/>
+          </w:tcPr>
+          <w:p>
+            <w:pPr>
+              <w:spacing w:before="60" w:after="60"/>
+              <w:jc w:val="center"/>
+            </w:pPr>
+          </w:p>
+        </w:tc>
+      </w:tr>
+      <w:tr>
+        <w:tc>
+          <w:tcPr>
+            <w:tcW w:w="2783" w:type="dxa"/>
+          </w:tcPr>
+          <w:p>
+            <w:pPr>
+              <w:pStyle w:val="Listenabsatz"/>
+              <w:spacing w:before="60" w:after="60"/>
+              <w:ind w:left="0"/>
+            </w:pPr>
+            <w:r>
+              <w:t>5 - Abschluss</w:t>
+            </w:r>
+          </w:p>
+        </w:tc>
+        <w:tc>
+          <w:tcPr>
+            <w:tcW w:w="1619" w:type="dxa"/>
+          </w:tcPr>
+          <w:p>
+            <w:pPr>
+              <w:spacing w:before="60" w:after="60"/>
+            </w:pPr>
+            <w:r>
+              <w:t>Hosting</w:t>
+            </w:r>
+          </w:p>
+        </w:tc>
+        <w:tc>
+          <w:tcPr>
+            <w:tcW w:w="1595" w:type="dxa"/>
+          </w:tcPr>
+          <w:p>
+            <w:pPr>
+              <w:spacing w:before="60" w:after="60"/>
+              <w:jc w:val="center"/>
+            </w:pPr>
+          </w:p>
+        </w:tc>
+        <w:tc>
+          <w:tcPr>
+            <w:tcW w:w="1529" w:type="dxa"/>
+          </w:tcPr>
+          <w:p>
+            <w:pPr>
+              <w:spacing w:before="60" w:after="60"/>
+              <w:jc w:val="center"/>
+            </w:pPr>
+          </w:p>
+        </w:tc>
+        <w:tc>
+          <w:tcPr>
+            <w:tcW w:w="1534" w:type="dxa"/>
           </w:tcPr>
           <w:p>
             <w:pPr>
@@ -10923,29 +10777,29 @@
       <w:r>
         <w:br w:type="page"/>
       </w:r>
-      <w:bookmarkStart w:id="56" w:name="_Toc116286529"/>
-      <w:bookmarkStart w:id="57" w:name="_Toc396809845"/>
+      <w:bookmarkStart w:id="52" w:name="_Toc116286529"/>
+      <w:bookmarkStart w:id="53" w:name="_Toc396809845"/>
     </w:p>
     <w:p>
       <w:pPr>
         <w:pStyle w:val="berschrift1"/>
       </w:pPr>
-      <w:bookmarkStart w:id="58" w:name="_Toc397883001"/>
-      <w:bookmarkStart w:id="59" w:name="_Toc230788892"/>
+      <w:bookmarkStart w:id="54" w:name="_Toc397883001"/>
+      <w:bookmarkStart w:id="55" w:name="_Toc230788892"/>
       <w:r>
         <w:lastRenderedPageBreak/>
         <w:t>Projektfortschrittsbericht</w:t>
       </w:r>
-      <w:bookmarkEnd w:id="56"/>
+      <w:bookmarkEnd w:id="52"/>
       <w:r>
         <w:rPr>
           <w:rStyle w:val="Funotenzeichen"/>
         </w:rPr>
         <w:footnoteReference w:id="5"/>
       </w:r>
-      <w:bookmarkEnd w:id="57"/>
-      <w:bookmarkEnd w:id="58"/>
-      <w:bookmarkEnd w:id="59"/>
+      <w:bookmarkEnd w:id="53"/>
+      <w:bookmarkEnd w:id="54"/>
+      <w:bookmarkEnd w:id="55"/>
     </w:p>
     <w:tbl>
       <w:tblPr>
@@ -11270,7 +11124,7 @@
                           </pic:cNvPicPr>
                         </pic:nvPicPr>
                         <pic:blipFill>
-                          <a:blip r:embed="rId10">
+                          <a:blip r:embed="rId11">
                             <a:extLst>
                               <a:ext uri="{28A0092B-C50C-407E-A947-70E740481C1C}">
                                 <a14:useLocalDpi xmlns:a14="http://schemas.microsoft.com/office/drawing/2010/main" val="0"/>
@@ -11519,7 +11373,7 @@
                           </pic:cNvPicPr>
                         </pic:nvPicPr>
                         <pic:blipFill>
-                          <a:blip r:embed="rId11">
+                          <a:blip r:embed="rId12">
                             <a:extLst>
                               <a:ext uri="{28A0092B-C50C-407E-A947-70E740481C1C}">
                                 <a14:useLocalDpi xmlns:a14="http://schemas.microsoft.com/office/drawing/2010/main" val="0"/>
@@ -11705,7 +11559,111 @@
           </w:p>
           <w:p>
             <w:pPr>
-              <w:spacing w:after="120"/>
+              <w:pStyle w:val="StandardAufzhlung"/>
+              <w:numPr>
+                <w:ilvl w:val="0"/>
+                <w:numId w:val="19"/>
+              </w:numPr>
+              <w:spacing w:before="120" w:after="0"/>
+              <w:rPr>
+                <w:rFonts w:ascii="Tahoma" w:hAnsi="Tahoma" w:cs="Tahoma"/>
+                <w:b/>
+                <w:bCs/>
+                <w:sz w:val="18"/>
+              </w:rPr>
+            </w:pPr>
+            <w:r>
+              <w:rPr>
+                <w:rFonts w:ascii="Tahoma" w:hAnsi="Tahoma" w:cs="Tahoma"/>
+                <w:b/>
+                <w:bCs/>
+                <w:sz w:val="18"/>
+              </w:rPr>
+              <w:t>Frontend-Services umgesetzt</w:t>
+            </w:r>
+          </w:p>
+          <w:p>
+            <w:pPr>
+              <w:pStyle w:val="StandardAufzhlung"/>
+              <w:numPr>
+                <w:ilvl w:val="0"/>
+                <w:numId w:val="19"/>
+              </w:numPr>
+              <w:spacing w:before="120" w:after="0"/>
+              <w:rPr>
+                <w:rFonts w:ascii="Tahoma" w:hAnsi="Tahoma" w:cs="Tahoma"/>
+                <w:b/>
+                <w:bCs/>
+                <w:sz w:val="18"/>
+              </w:rPr>
+            </w:pPr>
+            <w:r>
+              <w:rPr>
+                <w:rFonts w:ascii="Tahoma" w:hAnsi="Tahoma" w:cs="Tahoma"/>
+                <w:b/>
+                <w:bCs/>
+                <w:sz w:val="18"/>
+              </w:rPr>
+              <w:t>Frontend-Provider wurden implementiert</w:t>
+            </w:r>
+          </w:p>
+          <w:p>
+            <w:pPr>
+              <w:pStyle w:val="StandardAufzhlung"/>
+              <w:numPr>
+                <w:ilvl w:val="0"/>
+                <w:numId w:val="19"/>
+              </w:numPr>
+              <w:spacing w:before="120" w:after="0"/>
+              <w:rPr>
+                <w:rFonts w:ascii="Tahoma" w:hAnsi="Tahoma" w:cs="Tahoma"/>
+                <w:b/>
+                <w:bCs/>
+                <w:sz w:val="18"/>
+              </w:rPr>
+            </w:pPr>
+            <w:r>
+              <w:rPr>
+                <w:rFonts w:ascii="Tahoma" w:hAnsi="Tahoma" w:cs="Tahoma"/>
+                <w:b/>
+                <w:bCs/>
+                <w:sz w:val="18"/>
+              </w:rPr>
+              <w:t>Auth-Page wurde implementiert</w:t>
+            </w:r>
+          </w:p>
+          <w:p>
+            <w:pPr>
+              <w:pStyle w:val="StandardAufzhlung"/>
+              <w:numPr>
+                <w:ilvl w:val="0"/>
+                <w:numId w:val="19"/>
+              </w:numPr>
+              <w:spacing w:before="120" w:after="0"/>
+              <w:rPr>
+                <w:rFonts w:ascii="Tahoma" w:hAnsi="Tahoma" w:cs="Tahoma"/>
+                <w:b/>
+                <w:sz w:val="18"/>
+              </w:rPr>
+            </w:pPr>
+            <w:r>
+              <w:rPr>
+                <w:rFonts w:ascii="Tahoma" w:hAnsi="Tahoma" w:cs="Tahoma"/>
+                <w:b/>
+                <w:bCs/>
+                <w:sz w:val="18"/>
+              </w:rPr>
+              <w:t>Dashboard wurde umgesetzt</w:t>
+            </w:r>
+          </w:p>
+          <w:p>
+            <w:pPr>
+              <w:pStyle w:val="StandardAufzhlung"/>
+              <w:tabs>
+                <w:tab w:val="clear" w:pos="360"/>
+              </w:tabs>
+              <w:spacing w:before="120" w:after="0"/>
+              <w:ind w:firstLine="0"/>
               <w:rPr>
                 <w:rFonts w:ascii="Tahoma" w:hAnsi="Tahoma" w:cs="Tahoma"/>
                 <w:b/>
@@ -11780,7 +11738,7 @@
                 <w:color w:val="70AD47" w:themeColor="accent6"/>
                 <w:sz w:val="18"/>
               </w:rPr>
-              <w:t xml:space="preserve">Bisher konnten alle Ziele umgesetzt werden. </w:t>
+              <w:t>Projektstruktur wurde aufgebaut</w:t>
             </w:r>
           </w:p>
           <w:p>
@@ -11795,7 +11753,7 @@
                 <w:rFonts w:ascii="Tahoma" w:hAnsi="Tahoma" w:cs="Tahoma"/>
                 <w:b/>
                 <w:bCs/>
-                <w:color w:val="BF8F00" w:themeColor="accent4" w:themeShade="BF"/>
+                <w:color w:val="70AD47" w:themeColor="accent6"/>
                 <w:sz w:val="18"/>
               </w:rPr>
             </w:pPr>
@@ -11804,10 +11762,98 @@
                 <w:rFonts w:ascii="Tahoma" w:hAnsi="Tahoma" w:cs="Tahoma"/>
                 <w:b/>
                 <w:bCs/>
-                <w:color w:val="BF8F00" w:themeColor="accent4" w:themeShade="BF"/>
+                <w:color w:val="70AD47" w:themeColor="accent6"/>
                 <w:sz w:val="18"/>
               </w:rPr>
-              <w:t>Tests zu Hooks und Hubs können erst bei bestehendem Frontend korrekt getestet werden. Diese sind noch ausständig</w:t>
+              <w:t>Authentication wurde umgesetzt</w:t>
+            </w:r>
+          </w:p>
+          <w:p>
+            <w:pPr>
+              <w:numPr>
+                <w:ilvl w:val="0"/>
+                <w:numId w:val="17"/>
+              </w:numPr>
+              <w:spacing w:after="60"/>
+              <w:jc w:val="both"/>
+              <w:rPr>
+                <w:rFonts w:ascii="Tahoma" w:hAnsi="Tahoma" w:cs="Tahoma"/>
+                <w:b/>
+                <w:bCs/>
+                <w:color w:val="70AD47" w:themeColor="accent6"/>
+                <w:sz w:val="18"/>
+              </w:rPr>
+            </w:pPr>
+            <w:proofErr w:type="spellStart"/>
+            <w:r>
+              <w:rPr>
+                <w:rFonts w:ascii="Tahoma" w:hAnsi="Tahoma" w:cs="Tahoma"/>
+                <w:b/>
+                <w:bCs/>
+                <w:color w:val="70AD47" w:themeColor="accent6"/>
+                <w:sz w:val="18"/>
+              </w:rPr>
+              <w:t>FrontendServices</w:t>
+            </w:r>
+            <w:proofErr w:type="spellEnd"/>
+            <w:r>
+              <w:rPr>
+                <w:rFonts w:ascii="Tahoma" w:hAnsi="Tahoma" w:cs="Tahoma"/>
+                <w:b/>
+                <w:bCs/>
+                <w:color w:val="70AD47" w:themeColor="accent6"/>
+                <w:sz w:val="18"/>
+              </w:rPr>
+              <w:t xml:space="preserve"> wurden aufgebaut und an die Authentication angepasst.</w:t>
+            </w:r>
+          </w:p>
+          <w:p>
+            <w:pPr>
+              <w:numPr>
+                <w:ilvl w:val="0"/>
+                <w:numId w:val="17"/>
+              </w:numPr>
+              <w:spacing w:after="60"/>
+              <w:jc w:val="both"/>
+              <w:rPr>
+                <w:rFonts w:ascii="Tahoma" w:hAnsi="Tahoma" w:cs="Tahoma"/>
+                <w:b/>
+                <w:bCs/>
+                <w:color w:val="70AD47" w:themeColor="accent6"/>
+                <w:sz w:val="18"/>
+              </w:rPr>
+            </w:pPr>
+            <w:r>
+              <w:rPr>
+                <w:rFonts w:ascii="Tahoma" w:hAnsi="Tahoma" w:cs="Tahoma"/>
+                <w:b/>
+                <w:bCs/>
+                <w:color w:val="70AD47" w:themeColor="accent6"/>
+                <w:sz w:val="18"/>
+              </w:rPr>
+              <w:t xml:space="preserve">Tests zu Hooks und Hubs konnten erfolgreich getestet werden. Eine </w:t>
+            </w:r>
+            <w:proofErr w:type="spellStart"/>
+            <w:r>
+              <w:rPr>
+                <w:rFonts w:ascii="Tahoma" w:hAnsi="Tahoma" w:cs="Tahoma"/>
+                <w:b/>
+                <w:bCs/>
+                <w:color w:val="70AD47" w:themeColor="accent6"/>
+                <w:sz w:val="18"/>
+              </w:rPr>
+              <w:t>Race-Condition</w:t>
+            </w:r>
+            <w:proofErr w:type="spellEnd"/>
+            <w:r>
+              <w:rPr>
+                <w:rFonts w:ascii="Tahoma" w:hAnsi="Tahoma" w:cs="Tahoma"/>
+                <w:b/>
+                <w:bCs/>
+                <w:color w:val="70AD47" w:themeColor="accent6"/>
+                <w:sz w:val="18"/>
+              </w:rPr>
+              <w:t xml:space="preserve"> musste ausgebessert werden. Hubs laufen nun korrekt und funktionieren.</w:t>
             </w:r>
           </w:p>
           <w:p>
@@ -11936,6 +11982,7 @@
                 <w:rFonts w:ascii="Tahoma" w:hAnsi="Tahoma" w:cs="Tahoma"/>
                 <w:b/>
                 <w:bCs/>
+                <w:color w:val="70AD47" w:themeColor="accent6"/>
                 <w:sz w:val="18"/>
               </w:rPr>
             </w:pPr>
@@ -11944,6 +11991,7 @@
                 <w:rFonts w:ascii="Tahoma" w:hAnsi="Tahoma" w:cs="Tahoma"/>
                 <w:b/>
                 <w:bCs/>
+                <w:color w:val="70AD47" w:themeColor="accent6"/>
                 <w:sz w:val="18"/>
               </w:rPr>
               <w:t>Die Projektstruktur steht.</w:t>
@@ -11961,6 +12009,7 @@
                 <w:rFonts w:ascii="Tahoma" w:hAnsi="Tahoma" w:cs="Tahoma"/>
                 <w:b/>
                 <w:bCs/>
+                <w:color w:val="70AD47" w:themeColor="accent6"/>
                 <w:sz w:val="18"/>
               </w:rPr>
             </w:pPr>
@@ -11969,6 +12018,7 @@
                 <w:rFonts w:ascii="Tahoma" w:hAnsi="Tahoma" w:cs="Tahoma"/>
                 <w:b/>
                 <w:bCs/>
+                <w:color w:val="70AD47" w:themeColor="accent6"/>
                 <w:sz w:val="18"/>
               </w:rPr>
               <w:t>Authentifizierung wurde umgesetzt</w:t>
@@ -11986,6 +12036,7 @@
                 <w:rFonts w:ascii="Tahoma" w:hAnsi="Tahoma" w:cs="Tahoma"/>
                 <w:b/>
                 <w:bCs/>
+                <w:color w:val="70AD47" w:themeColor="accent6"/>
                 <w:sz w:val="18"/>
               </w:rPr>
             </w:pPr>
@@ -11994,9 +12045,10 @@
                 <w:rFonts w:ascii="Tahoma" w:hAnsi="Tahoma" w:cs="Tahoma"/>
                 <w:b/>
                 <w:bCs/>
+                <w:color w:val="70AD47" w:themeColor="accent6"/>
                 <w:sz w:val="18"/>
               </w:rPr>
-              <w:t>Hubs und Hooks wurden eingerichtet</w:t>
+              <w:t>Frontend-Services wurden implementiert.</w:t>
             </w:r>
           </w:p>
           <w:p>
@@ -12011,6 +12063,7 @@
                 <w:rFonts w:ascii="Tahoma" w:hAnsi="Tahoma" w:cs="Tahoma"/>
                 <w:b/>
                 <w:bCs/>
+                <w:color w:val="70AD47" w:themeColor="accent6"/>
                 <w:sz w:val="18"/>
               </w:rPr>
             </w:pPr>
@@ -12019,37 +12072,153 @@
                 <w:rFonts w:ascii="Tahoma" w:hAnsi="Tahoma" w:cs="Tahoma"/>
                 <w:b/>
                 <w:bCs/>
+                <w:color w:val="70AD47" w:themeColor="accent6"/>
                 <w:sz w:val="18"/>
               </w:rPr>
-              <w:t>Frontend</w:t>
-            </w:r>
-            <w:r>
+              <w:t>Hubs und Hooks wurden eingerichtet</w:t>
+            </w:r>
+          </w:p>
+          <w:p>
+            <w:pPr>
+              <w:numPr>
+                <w:ilvl w:val="0"/>
+                <w:numId w:val="17"/>
+              </w:numPr>
+              <w:spacing w:after="60"/>
+              <w:jc w:val="both"/>
               <w:rPr>
                 <w:rFonts w:ascii="Tahoma" w:hAnsi="Tahoma" w:cs="Tahoma"/>
                 <w:b/>
                 <w:bCs/>
+                <w:color w:val="70AD47" w:themeColor="accent6"/>
                 <w:sz w:val="18"/>
               </w:rPr>
-              <w:t>-</w:t>
-            </w:r>
+            </w:pPr>
             <w:r>
               <w:rPr>
                 <w:rFonts w:ascii="Tahoma" w:hAnsi="Tahoma" w:cs="Tahoma"/>
                 <w:b/>
                 <w:bCs/>
+                <w:color w:val="70AD47" w:themeColor="accent6"/>
                 <w:sz w:val="18"/>
               </w:rPr>
-              <w:t>Services wurden implementiert.</w:t>
-            </w:r>
-          </w:p>
-          <w:p>
-            <w:pPr>
-              <w:pStyle w:val="Kopfzeile"/>
+              <w:t>Frontend-Provider wurden implementiert</w:t>
+            </w:r>
+          </w:p>
+          <w:p>
+            <w:pPr>
+              <w:numPr>
+                <w:ilvl w:val="0"/>
+                <w:numId w:val="17"/>
+              </w:numPr>
               <w:spacing w:after="60"/>
+              <w:jc w:val="both"/>
               <w:rPr>
                 <w:rFonts w:ascii="Tahoma" w:hAnsi="Tahoma" w:cs="Tahoma"/>
                 <w:b/>
                 <w:bCs/>
+                <w:color w:val="70AD47" w:themeColor="accent6"/>
+                <w:sz w:val="18"/>
+              </w:rPr>
+            </w:pPr>
+            <w:r>
+              <w:rPr>
+                <w:rFonts w:ascii="Tahoma" w:hAnsi="Tahoma" w:cs="Tahoma"/>
+                <w:b/>
+                <w:bCs/>
+                <w:color w:val="70AD47" w:themeColor="accent6"/>
+                <w:sz w:val="18"/>
+              </w:rPr>
+              <w:t>Auth/App Schicht wurde eingerichtet</w:t>
+            </w:r>
+          </w:p>
+          <w:p>
+            <w:pPr>
+              <w:numPr>
+                <w:ilvl w:val="0"/>
+                <w:numId w:val="17"/>
+              </w:numPr>
+              <w:spacing w:after="60"/>
+              <w:rPr>
+                <w:rFonts w:ascii="Tahoma" w:hAnsi="Tahoma" w:cs="Tahoma"/>
+                <w:b/>
+                <w:bCs/>
+                <w:color w:val="70AD47" w:themeColor="accent6"/>
+                <w:sz w:val="18"/>
+              </w:rPr>
+            </w:pPr>
+            <w:r>
+              <w:rPr>
+                <w:rFonts w:ascii="Tahoma" w:hAnsi="Tahoma" w:cs="Tahoma"/>
+                <w:b/>
+                <w:bCs/>
+                <w:color w:val="70AD47" w:themeColor="accent6"/>
+                <w:sz w:val="18"/>
+              </w:rPr>
+              <w:t>Authentication-Page wurde umgesetzt und Login/Register funktioniert.</w:t>
+            </w:r>
+          </w:p>
+          <w:p>
+            <w:pPr>
+              <w:numPr>
+                <w:ilvl w:val="0"/>
+                <w:numId w:val="17"/>
+              </w:numPr>
+              <w:spacing w:after="60"/>
+              <w:rPr>
+                <w:rFonts w:ascii="Tahoma" w:hAnsi="Tahoma" w:cs="Tahoma"/>
+                <w:b/>
+                <w:bCs/>
+                <w:color w:val="70AD47" w:themeColor="accent6"/>
+                <w:sz w:val="18"/>
+              </w:rPr>
+            </w:pPr>
+            <w:r>
+              <w:rPr>
+                <w:rFonts w:ascii="Tahoma" w:hAnsi="Tahoma" w:cs="Tahoma"/>
+                <w:b/>
+                <w:bCs/>
+                <w:color w:val="70AD47" w:themeColor="accent6"/>
+                <w:sz w:val="18"/>
+              </w:rPr>
+              <w:t>Dashboard wurde umgesetzt.</w:t>
+            </w:r>
+          </w:p>
+          <w:p>
+            <w:pPr>
+              <w:numPr>
+                <w:ilvl w:val="0"/>
+                <w:numId w:val="17"/>
+              </w:numPr>
+              <w:spacing w:after="60"/>
+              <w:rPr>
+                <w:rFonts w:ascii="Tahoma" w:hAnsi="Tahoma" w:cs="Tahoma"/>
+                <w:b/>
+                <w:bCs/>
+                <w:color w:val="70AD47" w:themeColor="accent6"/>
+                <w:sz w:val="18"/>
+              </w:rPr>
+            </w:pPr>
+            <w:r>
+              <w:rPr>
+                <w:rFonts w:ascii="Tahoma" w:hAnsi="Tahoma" w:cs="Tahoma"/>
+                <w:b/>
+                <w:bCs/>
+                <w:color w:val="70AD47" w:themeColor="accent6"/>
+                <w:sz w:val="18"/>
+              </w:rPr>
+              <w:t>Erste Feature-Site wurde aufgebaut</w:t>
+            </w:r>
+          </w:p>
+          <w:p>
+            <w:pPr>
+              <w:spacing w:after="60"/>
+              <w:ind w:left="360"/>
+              <w:rPr>
+                <w:rFonts w:ascii="Tahoma" w:hAnsi="Tahoma" w:cs="Tahoma"/>
+                <w:b/>
+                <w:bCs/>
+                <w:sz w:val="18"/>
               </w:rPr>
             </w:pPr>
           </w:p>
@@ -12153,6 +12322,7 @@
                 <w:b/>
                 <w:bCs/>
               </w:rPr>
+              <w:lastRenderedPageBreak/>
               <w:t>4) Status Termine (Zeitziele?)</w:t>
             </w:r>
           </w:p>
@@ -12181,6 +12351,16 @@
                 <w:sz w:val="18"/>
               </w:rPr>
               <w:t>Alle Zeitziele konnten eingehalten werden</w:t>
+            </w:r>
+            <w:r>
+              <w:rPr>
+                <w:rFonts w:ascii="Tahoma" w:hAnsi="Tahoma" w:cs="Tahoma"/>
+                <w:b/>
+                <w:bCs/>
+                <w:color w:val="70AD47" w:themeColor="accent6"/>
+                <w:sz w:val="18"/>
+              </w:rPr>
+              <w:t>.</w:t>
             </w:r>
           </w:p>
           <w:p>
@@ -12320,7 +12500,7 @@
                 <w:rFonts w:ascii="Tahoma" w:hAnsi="Tahoma" w:cs="Tahoma"/>
                 <w:b/>
                 <w:bCs/>
-                <w:color w:val="BF8F00" w:themeColor="accent4" w:themeShade="BF"/>
+                <w:color w:val="70AD47" w:themeColor="accent6"/>
                 <w:sz w:val="18"/>
               </w:rPr>
             </w:pPr>
@@ -12329,10 +12509,20 @@
                 <w:rFonts w:ascii="Tahoma" w:hAnsi="Tahoma" w:cs="Tahoma"/>
                 <w:b/>
                 <w:bCs/>
-                <w:color w:val="BF8F00" w:themeColor="accent4" w:themeShade="BF"/>
+                <w:color w:val="70AD47" w:themeColor="accent6"/>
                 <w:sz w:val="18"/>
               </w:rPr>
-              <w:t>Hosting ist noch nicht hundert Prozent klar. Als mögliche Hosting-Firma wird Hetzner in Erwägung gezogen.</w:t>
+              <w:t xml:space="preserve">Hosting </w:t>
+            </w:r>
+            <w:r>
+              <w:rPr>
+                <w:rFonts w:ascii="Tahoma" w:hAnsi="Tahoma" w:cs="Tahoma"/>
+                <w:b/>
+                <w:bCs/>
+                <w:color w:val="70AD47" w:themeColor="accent6"/>
+                <w:sz w:val="18"/>
+              </w:rPr>
+              <w:t>wird bei „Hetzner“ sein, da hier die gesamte Infrastruktur gehostet werden kann. -&gt; App/API/DB</w:t>
             </w:r>
           </w:p>
           <w:p>
@@ -12393,7 +12583,7 @@
                 <w:rFonts w:ascii="Tahoma" w:hAnsi="Tahoma" w:cs="Tahoma"/>
                 <w:sz w:val="18"/>
               </w:rPr>
-              <w:t>Angebote von Hosting-Agenturen/Services untersuchen</w:t>
+              <w:t>Keine Maßnahmen nötig</w:t>
             </w:r>
           </w:p>
           <w:p>
@@ -12600,7 +12790,7 @@
                 <w:rFonts w:ascii="Tahoma" w:hAnsi="Tahoma" w:cs="Tahoma"/>
                 <w:b/>
                 <w:bCs/>
-                <w:color w:val="BF8F00" w:themeColor="accent4" w:themeShade="BF"/>
+                <w:color w:val="70AD47" w:themeColor="accent6"/>
                 <w:sz w:val="18"/>
               </w:rPr>
             </w:pPr>
@@ -12609,10 +12799,10 @@
                 <w:rFonts w:ascii="Tahoma" w:hAnsi="Tahoma" w:cs="Tahoma"/>
                 <w:b/>
                 <w:bCs/>
-                <w:color w:val="BF8F00" w:themeColor="accent4" w:themeShade="BF"/>
+                <w:color w:val="70AD47" w:themeColor="accent6"/>
                 <w:sz w:val="18"/>
               </w:rPr>
-              <w:t>Dokumentation muss leicht nachgezogen und stabilisiert werden.</w:t>
+              <w:t>Dokumentation ist auf den aktuellen Stand. (Stand: 10.06.2026)</w:t>
             </w:r>
           </w:p>
           <w:p>
@@ -12673,23 +12863,7 @@
                 <w:rFonts w:ascii="Tahoma" w:hAnsi="Tahoma" w:cs="Tahoma"/>
                 <w:sz w:val="18"/>
               </w:rPr>
-              <w:t xml:space="preserve">Projektarbeit </w:t>
-            </w:r>
-            <w:proofErr w:type="gramStart"/>
-            <w:r>
-              <w:rPr>
-                <w:rFonts w:ascii="Tahoma" w:hAnsi="Tahoma" w:cs="Tahoma"/>
-                <w:sz w:val="18"/>
-              </w:rPr>
-              <w:t>einstellen</w:t>
-            </w:r>
-            <w:proofErr w:type="gramEnd"/>
-            <w:r>
-              <w:rPr>
-                <w:rFonts w:ascii="Tahoma" w:hAnsi="Tahoma" w:cs="Tahoma"/>
-                <w:sz w:val="18"/>
-              </w:rPr>
-              <w:t xml:space="preserve"> bis die Dokumentation wieder auf gleicher Basis ist.</w:t>
+              <w:t>Keine Maßnahmen nötig</w:t>
             </w:r>
           </w:p>
           <w:p>
@@ -12716,10 +12890,10 @@
       <w:r>
         <w:br w:type="page"/>
       </w:r>
-      <w:bookmarkStart w:id="60" w:name="_Toc116286530"/>
-      <w:bookmarkStart w:id="61" w:name="_Toc396809846"/>
-      <w:bookmarkStart w:id="62" w:name="_Toc397883002"/>
-      <w:bookmarkStart w:id="63" w:name="_Toc230788893"/>
+      <w:bookmarkStart w:id="56" w:name="_Toc116286530"/>
+      <w:bookmarkStart w:id="57" w:name="_Toc396809846"/>
+      <w:bookmarkStart w:id="58" w:name="_Toc397883002"/>
+      <w:bookmarkStart w:id="59" w:name="_Toc230788893"/>
       <w:r>
         <w:lastRenderedPageBreak/>
         <w:t>Projektabschluss</w:t>
@@ -12727,10 +12901,10 @@
       <w:r>
         <w:t>bericht</w:t>
       </w:r>
-      <w:bookmarkEnd w:id="60"/>
-      <w:bookmarkEnd w:id="61"/>
-      <w:bookmarkEnd w:id="62"/>
-      <w:bookmarkEnd w:id="63"/>
+      <w:bookmarkEnd w:id="56"/>
+      <w:bookmarkEnd w:id="57"/>
+      <w:bookmarkEnd w:id="58"/>
+      <w:bookmarkEnd w:id="59"/>
     </w:p>
     <w:tbl>
       <w:tblPr>
@@ -12848,7 +13022,7 @@
               <w:t>:</w:t>
             </w:r>
           </w:p>
-          <w:bookmarkStart w:id="64" w:name="Text85"/>
+          <w:bookmarkStart w:id="60" w:name="Text85"/>
           <w:p>
             <w:pPr>
               <w:spacing w:before="60" w:after="60"/>
@@ -12905,7 +13079,7 @@
               </w:rPr>
               <w:fldChar w:fldCharType="end"/>
             </w:r>
-            <w:bookmarkEnd w:id="64"/>
+            <w:bookmarkEnd w:id="60"/>
           </w:p>
         </w:tc>
       </w:tr>
@@ -13651,7 +13825,7 @@
                 </w:ffData>
               </w:fldChar>
             </w:r>
-            <w:bookmarkStart w:id="65" w:name="Text88"/>
+            <w:bookmarkStart w:id="61" w:name="Text88"/>
             <w:r>
               <w:instrText xml:space="preserve"> </w:instrText>
             </w:r>
@@ -13697,7 +13871,7 @@
             <w:r>
               <w:fldChar w:fldCharType="end"/>
             </w:r>
-            <w:bookmarkEnd w:id="65"/>
+            <w:bookmarkEnd w:id="61"/>
           </w:p>
         </w:tc>
         <w:tc>
@@ -13718,7 +13892,7 @@
                 </w:ffData>
               </w:fldChar>
             </w:r>
-            <w:bookmarkStart w:id="66" w:name="Text89"/>
+            <w:bookmarkStart w:id="62" w:name="Text89"/>
             <w:r>
               <w:instrText xml:space="preserve"> </w:instrText>
             </w:r>
@@ -13764,7 +13938,7 @@
             <w:r>
               <w:fldChar w:fldCharType="end"/>
             </w:r>
-            <w:bookmarkEnd w:id="66"/>
+            <w:bookmarkEnd w:id="62"/>
           </w:p>
         </w:tc>
         <w:tc>
@@ -13785,7 +13959,7 @@
                 </w:ffData>
               </w:fldChar>
             </w:r>
-            <w:bookmarkStart w:id="67" w:name="Text90"/>
+            <w:bookmarkStart w:id="63" w:name="Text90"/>
             <w:r>
               <w:instrText xml:space="preserve"> </w:instrText>
             </w:r>
@@ -13831,7 +14005,7 @@
             <w:r>
               <w:fldChar w:fldCharType="end"/>
             </w:r>
-            <w:bookmarkEnd w:id="67"/>
+            <w:bookmarkEnd w:id="63"/>
           </w:p>
         </w:tc>
       </w:tr>
@@ -14074,9 +14248,9 @@
     </w:tbl>
     <w:p/>
     <w:sectPr>
-      <w:headerReference w:type="default" r:id="rId12"/>
-      <w:footerReference w:type="default" r:id="rId13"/>
-      <w:headerReference w:type="first" r:id="rId14"/>
+      <w:headerReference w:type="default" r:id="rId13"/>
+      <w:footerReference w:type="default" r:id="rId14"/>
+      <w:headerReference w:type="first" r:id="rId15"/>
       <w:pgSz w:w="11906" w:h="16838"/>
       <w:pgMar w:top="1985" w:right="1418" w:bottom="1134" w:left="1418" w:header="709" w:footer="709" w:gutter="0"/>
       <w:cols w:space="708"/>
@@ -14175,7 +14349,7 @@
         <w:noProof/>
         <w:sz w:val="16"/>
       </w:rPr>
-      <w:t>09.06.2026</w:t>
+      <w:t>10.06.2026</w:t>
     </w:r>
     <w:r>
       <w:rPr>
@@ -15318,6 +15492,119 @@
     </w:lvl>
   </w:abstractNum>
   <w:abstractNum w:abstractNumId="7" w15:restartNumberingAfterBreak="0">
+    <w:nsid w:val="3909433A"/>
+    <w:multiLevelType w:val="hybridMultilevel"/>
+    <w:tmpl w:val="916C71E6"/>
+    <w:lvl w:ilvl="0" w:tplc="0C070001">
+      <w:start w:val="1"/>
+      <w:numFmt w:val="bullet"/>
+      <w:lvlText w:val=""/>
+      <w:lvlJc w:val="left"/>
+      <w:pPr>
+        <w:ind w:left="720" w:hanging="360"/>
+      </w:pPr>
+      <w:rPr>
+        <w:rFonts w:ascii="Symbol" w:hAnsi="Symbol" w:hint="default"/>
+      </w:rPr>
+    </w:lvl>
+    <w:lvl w:ilvl="1" w:tplc="0C070003" w:tentative="1">
+      <w:start w:val="1"/>
+      <w:numFmt w:val="bullet"/>
+      <w:lvlText w:val="o"/>
+      <w:lvlJc w:val="left"/>
+      <w:pPr>
+        <w:ind w:left="1440" w:hanging="360"/>
+      </w:pPr>
+      <w:rPr>
+        <w:rFonts w:ascii="Courier New" w:hAnsi="Courier New" w:cs="Courier New" w:hint="default"/>
+      </w:rPr>
+    </w:lvl>
+    <w:lvl w:ilvl="2" w:tplc="0C070005" w:tentative="1">
+      <w:start w:val="1"/>
+      <w:numFmt w:val="bullet"/>
+      <w:lvlText w:val=""/>
+      <w:lvlJc w:val="left"/>
+      <w:pPr>
+        <w:ind w:left="2160" w:hanging="360"/>
+      </w:pPr>
+      <w:rPr>
+        <w:rFonts w:ascii="Wingdings" w:hAnsi="Wingdings" w:hint="default"/>
+      </w:rPr>
+    </w:lvl>
+    <w:lvl w:ilvl="3" w:tplc="0C070001" w:tentative="1">
+      <w:start w:val="1"/>
+      <w:numFmt w:val="bullet"/>
+      <w:lvlText w:val=""/>
+      <w:lvlJc w:val="left"/>
+      <w:pPr>
+        <w:ind w:left="2880" w:hanging="360"/>
+      </w:pPr>
+      <w:rPr>
+        <w:rFonts w:ascii="Symbol" w:hAnsi="Symbol" w:hint="default"/>
+      </w:rPr>
+    </w:lvl>
+    <w:lvl w:ilvl="4" w:tplc="0C070003" w:tentative="1">
+      <w:start w:val="1"/>
+      <w:numFmt w:val="bullet"/>
+      <w:lvlText w:val="o"/>
+      <w:lvlJc w:val="left"/>
+      <w:pPr>
+        <w:ind w:left="3600" w:hanging="360"/>
+      </w:pPr>
+      <w:rPr>
+        <w:rFonts w:ascii="Courier New" w:hAnsi="Courier New" w:cs="Courier New" w:hint="default"/>
+      </w:rPr>
+    </w:lvl>
+    <w:lvl w:ilvl="5" w:tplc="0C070005" w:tentative="1">
+      <w:start w:val="1"/>
+      <w:numFmt w:val="bullet"/>
+      <w:lvlText w:val=""/>
+      <w:lvlJc w:val="left"/>
+      <w:pPr>
+        <w:ind w:left="4320" w:hanging="360"/>
+      </w:pPr>
+      <w:rPr>
+        <w:rFonts w:ascii="Wingdings" w:hAnsi="Wingdings" w:hint="default"/>
+      </w:rPr>
+    </w:lvl>
+    <w:lvl w:ilvl="6" w:tplc="0C070001" w:tentative="1">
+      <w:start w:val="1"/>
+      <w:numFmt w:val="bullet"/>
+      <w:lvlText w:val=""/>
+      <w:lvlJc w:val="left"/>
+      <w:pPr>
+        <w:ind w:left="5040" w:hanging="360"/>
+      </w:pPr>
+      <w:rPr>
+        <w:rFonts w:ascii="Symbol" w:hAnsi="Symbol" w:hint="default"/>
+      </w:rPr>
+    </w:lvl>
+    <w:lvl w:ilvl="7" w:tplc="0C070003" w:tentative="1">
+      <w:start w:val="1"/>
+      <w:numFmt w:val="bullet"/>
+      <w:lvlText w:val="o"/>
+      <w:lvlJc w:val="left"/>
+      <w:pPr>
+        <w:ind w:left="5760" w:hanging="360"/>
+      </w:pPr>
+      <w:rPr>
+        <w:rFonts w:ascii="Courier New" w:hAnsi="Courier New" w:cs="Courier New" w:hint="default"/>
+      </w:rPr>
+    </w:lvl>
+    <w:lvl w:ilvl="8" w:tplc="0C070005" w:tentative="1">
+      <w:start w:val="1"/>
+      <w:numFmt w:val="bullet"/>
+      <w:lvlText w:val=""/>
+      <w:lvlJc w:val="left"/>
+      <w:pPr>
+        <w:ind w:left="6480" w:hanging="360"/>
+      </w:pPr>
+      <w:rPr>
+        <w:rFonts w:ascii="Wingdings" w:hAnsi="Wingdings" w:hint="default"/>
+      </w:rPr>
+    </w:lvl>
+  </w:abstractNum>
+  <w:abstractNum w:abstractNumId="8" w15:restartNumberingAfterBreak="0">
     <w:nsid w:val="44C15ABE"/>
     <w:multiLevelType w:val="hybridMultilevel"/>
     <w:tmpl w:val="E6F04B14"/>
@@ -15430,7 +15717,7 @@
       </w:rPr>
     </w:lvl>
   </w:abstractNum>
-  <w:abstractNum w:abstractNumId="8" w15:restartNumberingAfterBreak="0">
+  <w:abstractNum w:abstractNumId="9" w15:restartNumberingAfterBreak="0">
     <w:nsid w:val="47037B9E"/>
     <w:multiLevelType w:val="hybridMultilevel"/>
     <w:tmpl w:val="AC42E8FC"/>
@@ -15570,7 +15857,7 @@
       </w:rPr>
     </w:lvl>
   </w:abstractNum>
-  <w:abstractNum w:abstractNumId="9" w15:restartNumberingAfterBreak="0">
+  <w:abstractNum w:abstractNumId="10" w15:restartNumberingAfterBreak="0">
     <w:nsid w:val="545A516E"/>
     <w:multiLevelType w:val="hybridMultilevel"/>
     <w:tmpl w:val="81AAF816"/>
@@ -15683,7 +15970,7 @@
       </w:rPr>
     </w:lvl>
   </w:abstractNum>
-  <w:abstractNum w:abstractNumId="10" w15:restartNumberingAfterBreak="0">
+  <w:abstractNum w:abstractNumId="11" w15:restartNumberingAfterBreak="0">
     <w:nsid w:val="548E2464"/>
     <w:multiLevelType w:val="singleLevel"/>
     <w:tmpl w:val="04070011"/>
@@ -15700,7 +15987,7 @@
       </w:pPr>
     </w:lvl>
   </w:abstractNum>
-  <w:abstractNum w:abstractNumId="11" w15:restartNumberingAfterBreak="0">
+  <w:abstractNum w:abstractNumId="12" w15:restartNumberingAfterBreak="0">
     <w:nsid w:val="59FF4988"/>
     <w:multiLevelType w:val="multilevel"/>
     <w:tmpl w:val="FD345388"/>
@@ -15795,7 +16082,7 @@
       </w:pPr>
     </w:lvl>
   </w:abstractNum>
-  <w:abstractNum w:abstractNumId="12" w15:restartNumberingAfterBreak="0">
+  <w:abstractNum w:abstractNumId="13" w15:restartNumberingAfterBreak="0">
     <w:nsid w:val="64A4391D"/>
     <w:multiLevelType w:val="hybridMultilevel"/>
     <w:tmpl w:val="B2B2D86C"/>
@@ -15908,7 +16195,7 @@
       </w:rPr>
     </w:lvl>
   </w:abstractNum>
-  <w:abstractNum w:abstractNumId="13" w15:restartNumberingAfterBreak="0">
+  <w:abstractNum w:abstractNumId="14" w15:restartNumberingAfterBreak="0">
     <w:nsid w:val="7197000B"/>
     <w:multiLevelType w:val="hybridMultilevel"/>
     <w:tmpl w:val="B170C862"/>
@@ -16021,7 +16308,7 @@
       </w:rPr>
     </w:lvl>
   </w:abstractNum>
-  <w:abstractNum w:abstractNumId="14" w15:restartNumberingAfterBreak="0">
+  <w:abstractNum w:abstractNumId="15" w15:restartNumberingAfterBreak="0">
     <w:nsid w:val="76FA199A"/>
     <w:multiLevelType w:val="hybridMultilevel"/>
     <w:tmpl w:val="EDB03844"/>
@@ -16161,7 +16448,7 @@
       </w:rPr>
     </w:lvl>
   </w:abstractNum>
-  <w:abstractNum w:abstractNumId="15" w15:restartNumberingAfterBreak="0">
+  <w:abstractNum w:abstractNumId="16" w15:restartNumberingAfterBreak="0">
     <w:nsid w:val="77D452D1"/>
     <w:multiLevelType w:val="hybridMultilevel"/>
     <w:tmpl w:val="E1AC3E4E"/>
@@ -16301,7 +16588,96 @@
       </w:rPr>
     </w:lvl>
   </w:abstractNum>
-  <w:abstractNum w:abstractNumId="16" w15:restartNumberingAfterBreak="0">
+  <w:abstractNum w:abstractNumId="17" w15:restartNumberingAfterBreak="0">
+    <w:nsid w:val="7CA7708C"/>
+    <w:multiLevelType w:val="hybridMultilevel"/>
+    <w:tmpl w:val="30B4B602"/>
+    <w:lvl w:ilvl="0" w:tplc="0C07000F">
+      <w:start w:val="1"/>
+      <w:numFmt w:val="decimal"/>
+      <w:lvlText w:val="%1."/>
+      <w:lvlJc w:val="left"/>
+      <w:pPr>
+        <w:ind w:left="720" w:hanging="360"/>
+      </w:pPr>
+      <w:rPr>
+        <w:rFonts w:hint="default"/>
+      </w:rPr>
+    </w:lvl>
+    <w:lvl w:ilvl="1" w:tplc="0C070019" w:tentative="1">
+      <w:start w:val="1"/>
+      <w:numFmt w:val="lowerLetter"/>
+      <w:lvlText w:val="%2."/>
+      <w:lvlJc w:val="left"/>
+      <w:pPr>
+        <w:ind w:left="1440" w:hanging="360"/>
+      </w:pPr>
+    </w:lvl>
+    <w:lvl w:ilvl="2" w:tplc="0C07001B" w:tentative="1">
+      <w:start w:val="1"/>
+      <w:numFmt w:val="lowerRoman"/>
+      <w:lvlText w:val="%3."/>
+      <w:lvlJc w:val="right"/>
+      <w:pPr>
+        <w:ind w:left="2160" w:hanging="180"/>
+      </w:pPr>
+    </w:lvl>
+    <w:lvl w:ilvl="3" w:tplc="0C07000F" w:tentative="1">
+      <w:start w:val="1"/>
+      <w:numFmt w:val="decimal"/>
+      <w:lvlText w:val="%4."/>
+      <w:lvlJc w:val="left"/>
+      <w:pPr>
+        <w:ind w:left="2880" w:hanging="360"/>
+      </w:pPr>
+    </w:lvl>
+    <w:lvl w:ilvl="4" w:tplc="0C070019" w:tentative="1">
+      <w:start w:val="1"/>
+      <w:numFmt w:val="lowerLetter"/>
+      <w:lvlText w:val="%5."/>
+      <w:lvlJc w:val="left"/>
+      <w:pPr>
+        <w:ind w:left="3600" w:hanging="360"/>
+      </w:pPr>
+    </w:lvl>
+    <w:lvl w:ilvl="5" w:tplc="0C07001B" w:tentative="1">
+      <w:start w:val="1"/>
+      <w:numFmt w:val="lowerRoman"/>
+      <w:lvlText w:val="%6."/>
+      <w:lvlJc w:val="right"/>
+      <w:pPr>
+        <w:ind w:left="4320" w:hanging="180"/>
+      </w:pPr>
+    </w:lvl>
+    <w:lvl w:ilvl="6" w:tplc="0C07000F" w:tentative="1">
+      <w:start w:val="1"/>
+      <w:numFmt w:val="decimal"/>
+      <w:lvlText w:val="%7."/>
+      <w:lvlJc w:val="left"/>
+      <w:pPr>
+        <w:ind w:left="5040" w:hanging="360"/>
+      </w:pPr>
+    </w:lvl>
+    <w:lvl w:ilvl="7" w:tplc="0C070019" w:tentative="1">
+      <w:start w:val="1"/>
+      <w:numFmt w:val="lowerLetter"/>
+      <w:lvlText w:val="%8."/>
+      <w:lvlJc w:val="left"/>
+      <w:pPr>
+        <w:ind w:left="5760" w:hanging="360"/>
+      </w:pPr>
+    </w:lvl>
+    <w:lvl w:ilvl="8" w:tplc="0C07001B" w:tentative="1">
+      <w:start w:val="1"/>
+      <w:numFmt w:val="lowerRoman"/>
+      <w:lvlText w:val="%9."/>
+      <w:lvlJc w:val="right"/>
+      <w:pPr>
+        <w:ind w:left="6480" w:hanging="180"/>
+      </w:pPr>
+    </w:lvl>
+  </w:abstractNum>
+  <w:abstractNum w:abstractNumId="18" w15:restartNumberingAfterBreak="0">
     <w:nsid w:val="7EEC71AF"/>
     <w:multiLevelType w:val="singleLevel"/>
     <w:tmpl w:val="1F5081C8"/>
@@ -16322,7 +16698,7 @@
     </w:lvl>
   </w:abstractNum>
   <w:num w:numId="1" w16cid:durableId="726415684">
-    <w:abstractNumId w:val="15"/>
+    <w:abstractNumId w:val="16"/>
   </w:num>
   <w:num w:numId="2" w16cid:durableId="1595671529">
     <w:abstractNumId w:val="3"/>
@@ -16334,34 +16710,34 @@
     <w:abstractNumId w:val="1"/>
   </w:num>
   <w:num w:numId="5" w16cid:durableId="427504780">
-    <w:abstractNumId w:val="14"/>
+    <w:abstractNumId w:val="15"/>
   </w:num>
   <w:num w:numId="6" w16cid:durableId="1123957201">
     <w:abstractNumId w:val="2"/>
   </w:num>
   <w:num w:numId="7" w16cid:durableId="1048337715">
-    <w:abstractNumId w:val="8"/>
+    <w:abstractNumId w:val="9"/>
   </w:num>
   <w:num w:numId="8" w16cid:durableId="2133405103">
     <w:abstractNumId w:val="4"/>
   </w:num>
   <w:num w:numId="9" w16cid:durableId="946890929">
-    <w:abstractNumId w:val="11"/>
+    <w:abstractNumId w:val="12"/>
   </w:num>
   <w:num w:numId="10" w16cid:durableId="110055634">
+    <w:abstractNumId w:val="13"/>
+  </w:num>
+  <w:num w:numId="11" w16cid:durableId="323434499">
+    <w:abstractNumId w:val="14"/>
+  </w:num>
+  <w:num w:numId="12" w16cid:durableId="910820448">
     <w:abstractNumId w:val="12"/>
   </w:num>
-  <w:num w:numId="11" w16cid:durableId="323434499">
-    <w:abstractNumId w:val="13"/>
-  </w:num>
-  <w:num w:numId="12" w16cid:durableId="910820448">
-    <w:abstractNumId w:val="11"/>
-  </w:num>
   <w:num w:numId="13" w16cid:durableId="115373554">
-    <w:abstractNumId w:val="7"/>
+    <w:abstractNumId w:val="8"/>
   </w:num>
   <w:num w:numId="14" w16cid:durableId="7610090">
-    <w:abstractNumId w:val="11"/>
+    <w:abstractNumId w:val="12"/>
   </w:num>
   <w:num w:numId="15" w16cid:durableId="316300785">
     <w:abstractNumId w:val="5"/>
@@ -16388,13 +16764,19 @@
     </w:lvlOverride>
   </w:num>
   <w:num w:numId="18" w16cid:durableId="1304582420">
-    <w:abstractNumId w:val="16"/>
+    <w:abstractNumId w:val="18"/>
   </w:num>
   <w:num w:numId="19" w16cid:durableId="831340055">
+    <w:abstractNumId w:val="11"/>
+  </w:num>
+  <w:num w:numId="20" w16cid:durableId="1912614950">
     <w:abstractNumId w:val="10"/>
   </w:num>
-  <w:num w:numId="20" w16cid:durableId="1912614950">
-    <w:abstractNumId w:val="9"/>
+  <w:num w:numId="21" w16cid:durableId="1967658939">
+    <w:abstractNumId w:val="17"/>
+  </w:num>
+  <w:num w:numId="22" w16cid:durableId="1619995558">
+    <w:abstractNumId w:val="7"/>
   </w:num>
 </w:numbering>
 </file>

</xml_diff>

<commit_message>
[LOGIC] Added utils for mapping flatDB to nodes (For file system - implemented with help of KI)
</commit_message>
<xml_diff>
--- a/0_Documents/Projekthandbuch.docx
+++ b/0_Documents/Projekthandbuch.docx
@@ -433,12 +433,12 @@
       <w:r>
         <w:fldChar w:fldCharType="separate"/>
       </w:r>
-      <w:hyperlink w:anchor="_Toc230788879" w:history="1">
+      <w:hyperlink w:anchor="_Toc231993776" w:history="1">
         <w:r>
           <w:rPr>
             <w:rStyle w:val="Hyperlink"/>
           </w:rPr>
-          <w:t>1</w:t>
+          <w:t>1.</w:t>
         </w:r>
         <w:r>
           <w:rPr>
@@ -473,7 +473,7 @@
           <w:rPr>
             <w:webHidden/>
           </w:rPr>
-          <w:instrText xml:space="preserve"> PAGEREF _Toc230788879 \h </w:instrText>
+          <w:instrText xml:space="preserve"> PAGEREF _Toc231993776 \h </w:instrText>
         </w:r>
         <w:r>
           <w:rPr>
@@ -512,12 +512,12 @@
           <w14:ligatures w14:val="standardContextual"/>
         </w:rPr>
       </w:pPr>
-      <w:hyperlink w:anchor="_Toc230788880" w:history="1">
+      <w:hyperlink w:anchor="_Toc231993777" w:history="1">
         <w:r>
           <w:rPr>
             <w:rStyle w:val="Hyperlink"/>
           </w:rPr>
-          <w:t>2</w:t>
+          <w:t>2.</w:t>
         </w:r>
         <w:r>
           <w:rPr>
@@ -552,7 +552,7 @@
           <w:rPr>
             <w:webHidden/>
           </w:rPr>
-          <w:instrText xml:space="preserve"> PAGEREF _Toc230788880 \h </w:instrText>
+          <w:instrText xml:space="preserve"> PAGEREF _Toc231993777 \h </w:instrText>
         </w:r>
         <w:r>
           <w:rPr>
@@ -569,7 +569,7 @@
           <w:rPr>
             <w:webHidden/>
           </w:rPr>
-          <w:t>4</w:t>
+          <w:t>5</w:t>
         </w:r>
         <w:r>
           <w:rPr>
@@ -591,12 +591,12 @@
           <w14:ligatures w14:val="standardContextual"/>
         </w:rPr>
       </w:pPr>
-      <w:hyperlink w:anchor="_Toc230788881" w:history="1">
+      <w:hyperlink w:anchor="_Toc231993778" w:history="1">
         <w:r>
           <w:rPr>
             <w:rStyle w:val="Hyperlink"/>
           </w:rPr>
-          <w:t>3</w:t>
+          <w:t>3.</w:t>
         </w:r>
         <w:r>
           <w:rPr>
@@ -631,7 +631,7 @@
           <w:rPr>
             <w:webHidden/>
           </w:rPr>
-          <w:instrText xml:space="preserve"> PAGEREF _Toc230788881 \h </w:instrText>
+          <w:instrText xml:space="preserve"> PAGEREF _Toc231993778 \h </w:instrText>
         </w:r>
         <w:r>
           <w:rPr>
@@ -648,7 +648,7 @@
           <w:rPr>
             <w:webHidden/>
           </w:rPr>
-          <w:t>5</w:t>
+          <w:t>6</w:t>
         </w:r>
         <w:r>
           <w:rPr>
@@ -670,12 +670,12 @@
           <w14:ligatures w14:val="standardContextual"/>
         </w:rPr>
       </w:pPr>
-      <w:hyperlink w:anchor="_Toc230788882" w:history="1">
+      <w:hyperlink w:anchor="_Toc231993779" w:history="1">
         <w:r>
           <w:rPr>
             <w:rStyle w:val="Hyperlink"/>
           </w:rPr>
-          <w:t>4</w:t>
+          <w:t>4.</w:t>
         </w:r>
         <w:r>
           <w:rPr>
@@ -710,7 +710,7 @@
           <w:rPr>
             <w:webHidden/>
           </w:rPr>
-          <w:instrText xml:space="preserve"> PAGEREF _Toc230788882 \h </w:instrText>
+          <w:instrText xml:space="preserve"> PAGEREF _Toc231993779 \h </w:instrText>
         </w:r>
         <w:r>
           <w:rPr>
@@ -727,7 +727,7 @@
           <w:rPr>
             <w:webHidden/>
           </w:rPr>
-          <w:t>6</w:t>
+          <w:t>7</w:t>
         </w:r>
         <w:r>
           <w:rPr>
@@ -749,12 +749,12 @@
           <w14:ligatures w14:val="standardContextual"/>
         </w:rPr>
       </w:pPr>
-      <w:hyperlink w:anchor="_Toc230788883" w:history="1">
+      <w:hyperlink w:anchor="_Toc231993780" w:history="1">
         <w:r>
           <w:rPr>
             <w:rStyle w:val="Hyperlink"/>
           </w:rPr>
-          <w:t>5</w:t>
+          <w:t>5.</w:t>
         </w:r>
         <w:r>
           <w:rPr>
@@ -789,7 +789,7 @@
           <w:rPr>
             <w:webHidden/>
           </w:rPr>
-          <w:instrText xml:space="preserve"> PAGEREF _Toc230788883 \h </w:instrText>
+          <w:instrText xml:space="preserve"> PAGEREF _Toc231993780 \h </w:instrText>
         </w:r>
         <w:r>
           <w:rPr>
@@ -806,7 +806,7 @@
           <w:rPr>
             <w:webHidden/>
           </w:rPr>
-          <w:t>7</w:t>
+          <w:t>8</w:t>
         </w:r>
         <w:r>
           <w:rPr>
@@ -828,12 +828,12 @@
           <w14:ligatures w14:val="standardContextual"/>
         </w:rPr>
       </w:pPr>
-      <w:hyperlink w:anchor="_Toc230788884" w:history="1">
+      <w:hyperlink w:anchor="_Toc231993781" w:history="1">
         <w:r>
           <w:rPr>
             <w:rStyle w:val="Hyperlink"/>
           </w:rPr>
-          <w:t>6</w:t>
+          <w:t>6.</w:t>
         </w:r>
         <w:r>
           <w:rPr>
@@ -868,7 +868,7 @@
           <w:rPr>
             <w:webHidden/>
           </w:rPr>
-          <w:instrText xml:space="preserve"> PAGEREF _Toc230788884 \h </w:instrText>
+          <w:instrText xml:space="preserve"> PAGEREF _Toc231993781 \h </w:instrText>
         </w:r>
         <w:r>
           <w:rPr>
@@ -885,7 +885,7 @@
           <w:rPr>
             <w:webHidden/>
           </w:rPr>
-          <w:t>8</w:t>
+          <w:t>9</w:t>
         </w:r>
         <w:r>
           <w:rPr>
@@ -907,12 +907,12 @@
           <w14:ligatures w14:val="standardContextual"/>
         </w:rPr>
       </w:pPr>
-      <w:hyperlink w:anchor="_Toc230788885" w:history="1">
+      <w:hyperlink w:anchor="_Toc231993782" w:history="1">
         <w:r>
           <w:rPr>
             <w:rStyle w:val="Hyperlink"/>
           </w:rPr>
-          <w:t>7</w:t>
+          <w:t>7.</w:t>
         </w:r>
         <w:r>
           <w:rPr>
@@ -947,7 +947,7 @@
           <w:rPr>
             <w:webHidden/>
           </w:rPr>
-          <w:instrText xml:space="preserve"> PAGEREF _Toc230788885 \h </w:instrText>
+          <w:instrText xml:space="preserve"> PAGEREF _Toc231993782 \h </w:instrText>
         </w:r>
         <w:r>
           <w:rPr>
@@ -964,7 +964,7 @@
           <w:rPr>
             <w:webHidden/>
           </w:rPr>
-          <w:t>9</w:t>
+          <w:t>10</w:t>
         </w:r>
         <w:r>
           <w:rPr>
@@ -986,12 +986,12 @@
           <w14:ligatures w14:val="standardContextual"/>
         </w:rPr>
       </w:pPr>
-      <w:hyperlink w:anchor="_Toc230788886" w:history="1">
+      <w:hyperlink w:anchor="_Toc231993783" w:history="1">
         <w:r>
           <w:rPr>
             <w:rStyle w:val="Hyperlink"/>
           </w:rPr>
-          <w:t>8</w:t>
+          <w:t>8.</w:t>
         </w:r>
         <w:r>
           <w:rPr>
@@ -1026,7 +1026,7 @@
           <w:rPr>
             <w:webHidden/>
           </w:rPr>
-          <w:instrText xml:space="preserve"> PAGEREF _Toc230788886 \h </w:instrText>
+          <w:instrText xml:space="preserve"> PAGEREF _Toc231993783 \h </w:instrText>
         </w:r>
         <w:r>
           <w:rPr>
@@ -1043,7 +1043,7 @@
           <w:rPr>
             <w:webHidden/>
           </w:rPr>
-          <w:t>10</w:t>
+          <w:t>11</w:t>
         </w:r>
         <w:r>
           <w:rPr>
@@ -1065,12 +1065,12 @@
           <w14:ligatures w14:val="standardContextual"/>
         </w:rPr>
       </w:pPr>
-      <w:hyperlink w:anchor="_Toc230788887" w:history="1">
+      <w:hyperlink w:anchor="_Toc231993784" w:history="1">
         <w:r>
           <w:rPr>
             <w:rStyle w:val="Hyperlink"/>
           </w:rPr>
-          <w:t>9</w:t>
+          <w:t>9.</w:t>
         </w:r>
         <w:r>
           <w:rPr>
@@ -1105,69 +1105,7 @@
           <w:rPr>
             <w:webHidden/>
           </w:rPr>
-          <w:instrText xml:space="preserve"> PAGEREF _Toc230788887 \h </w:instrText>
-        </w:r>
-        <w:r>
-          <w:rPr>
-            <w:webHidden/>
-          </w:rPr>
-        </w:r>
-        <w:r>
-          <w:rPr>
-            <w:webHidden/>
-          </w:rPr>
-          <w:fldChar w:fldCharType="separate"/>
-        </w:r>
-        <w:r>
-          <w:rPr>
-            <w:webHidden/>
-          </w:rPr>
-          <w:t>12</w:t>
-        </w:r>
-        <w:r>
-          <w:rPr>
-            <w:webHidden/>
-          </w:rPr>
-          <w:fldChar w:fldCharType="end"/>
-        </w:r>
-      </w:hyperlink>
-    </w:p>
-    <w:p>
-      <w:pPr>
-        <w:pStyle w:val="Verzeichnis1"/>
-        <w:rPr>
-          <w:rFonts w:asciiTheme="minorHAnsi" w:eastAsiaTheme="minorEastAsia" w:hAnsiTheme="minorHAnsi" w:cstheme="minorBidi"/>
-          <w:kern w:val="2"/>
-          <w:sz w:val="24"/>
-          <w:szCs w:val="24"/>
-          <w:lang w:val="de-AT" w:eastAsia="de-AT"/>
-          <w14:ligatures w14:val="standardContextual"/>
-        </w:rPr>
-      </w:pPr>
-      <w:hyperlink w:anchor="_Toc230788888" w:history="1">
-        <w:r>
-          <w:rPr>
-            <w:rStyle w:val="Hyperlink"/>
-          </w:rPr>
-          <w:t>AP-Spezifikation / AP Beschreibung</w:t>
-        </w:r>
-        <w:r>
-          <w:rPr>
-            <w:webHidden/>
-          </w:rPr>
-          <w:tab/>
-        </w:r>
-        <w:r>
-          <w:rPr>
-            <w:webHidden/>
-          </w:rPr>
-          <w:fldChar w:fldCharType="begin"/>
-        </w:r>
-        <w:r>
-          <w:rPr>
-            <w:webHidden/>
-          </w:rPr>
-          <w:instrText xml:space="preserve"> PAGEREF _Toc230788888 \h </w:instrText>
+          <w:instrText xml:space="preserve"> PAGEREF _Toc231993784 \h </w:instrText>
         </w:r>
         <w:r>
           <w:rPr>
@@ -1206,12 +1144,91 @@
           <w14:ligatures w14:val="standardContextual"/>
         </w:rPr>
       </w:pPr>
-      <w:hyperlink w:anchor="_Toc230788889" w:history="1">
+      <w:hyperlink w:anchor="_Toc231993785" w:history="1">
         <w:r>
           <w:rPr>
             <w:rStyle w:val="Hyperlink"/>
           </w:rPr>
-          <w:t>10</w:t>
+          <w:t>10.</w:t>
+        </w:r>
+        <w:r>
+          <w:rPr>
+            <w:rFonts w:asciiTheme="minorHAnsi" w:eastAsiaTheme="minorEastAsia" w:hAnsiTheme="minorHAnsi" w:cstheme="minorBidi"/>
+            <w:kern w:val="2"/>
+            <w:sz w:val="24"/>
+            <w:szCs w:val="24"/>
+            <w:lang w:val="de-AT" w:eastAsia="de-AT"/>
+            <w14:ligatures w14:val="standardContextual"/>
+          </w:rPr>
+          <w:tab/>
+        </w:r>
+        <w:r>
+          <w:rPr>
+            <w:rStyle w:val="Hyperlink"/>
+          </w:rPr>
+          <w:t>AP-Spezifikation / AP Beschreibung</w:t>
+        </w:r>
+        <w:r>
+          <w:rPr>
+            <w:webHidden/>
+          </w:rPr>
+          <w:tab/>
+        </w:r>
+        <w:r>
+          <w:rPr>
+            <w:webHidden/>
+          </w:rPr>
+          <w:fldChar w:fldCharType="begin"/>
+        </w:r>
+        <w:r>
+          <w:rPr>
+            <w:webHidden/>
+          </w:rPr>
+          <w:instrText xml:space="preserve"> PAGEREF _Toc231993785 \h </w:instrText>
+        </w:r>
+        <w:r>
+          <w:rPr>
+            <w:webHidden/>
+          </w:rPr>
+        </w:r>
+        <w:r>
+          <w:rPr>
+            <w:webHidden/>
+          </w:rPr>
+          <w:fldChar w:fldCharType="separate"/>
+        </w:r>
+        <w:r>
+          <w:rPr>
+            <w:webHidden/>
+          </w:rPr>
+          <w:t>14</w:t>
+        </w:r>
+        <w:r>
+          <w:rPr>
+            <w:webHidden/>
+          </w:rPr>
+          <w:fldChar w:fldCharType="end"/>
+        </w:r>
+      </w:hyperlink>
+    </w:p>
+    <w:p>
+      <w:pPr>
+        <w:pStyle w:val="Verzeichnis1"/>
+        <w:rPr>
+          <w:rFonts w:asciiTheme="minorHAnsi" w:eastAsiaTheme="minorEastAsia" w:hAnsiTheme="minorHAnsi" w:cstheme="minorBidi"/>
+          <w:kern w:val="2"/>
+          <w:sz w:val="24"/>
+          <w:szCs w:val="24"/>
+          <w:lang w:val="de-AT" w:eastAsia="de-AT"/>
+          <w14:ligatures w14:val="standardContextual"/>
+        </w:rPr>
+      </w:pPr>
+      <w:hyperlink w:anchor="_Toc231993786" w:history="1">
+        <w:r>
+          <w:rPr>
+            <w:rStyle w:val="Hyperlink"/>
+          </w:rPr>
+          <w:t>11.</w:t>
         </w:r>
         <w:r>
           <w:rPr>
@@ -1246,86 +1263,7 @@
           <w:rPr>
             <w:webHidden/>
           </w:rPr>
-          <w:instrText xml:space="preserve"> PAGEREF _Toc230788889 \h </w:instrText>
-        </w:r>
-        <w:r>
-          <w:rPr>
-            <w:webHidden/>
-          </w:rPr>
-        </w:r>
-        <w:r>
-          <w:rPr>
-            <w:webHidden/>
-          </w:rPr>
-          <w:fldChar w:fldCharType="separate"/>
-        </w:r>
-        <w:r>
-          <w:rPr>
-            <w:webHidden/>
-          </w:rPr>
-          <w:t>14</w:t>
-        </w:r>
-        <w:r>
-          <w:rPr>
-            <w:webHidden/>
-          </w:rPr>
-          <w:fldChar w:fldCharType="end"/>
-        </w:r>
-      </w:hyperlink>
-    </w:p>
-    <w:p>
-      <w:pPr>
-        <w:pStyle w:val="Verzeichnis1"/>
-        <w:rPr>
-          <w:rFonts w:asciiTheme="minorHAnsi" w:eastAsiaTheme="minorEastAsia" w:hAnsiTheme="minorHAnsi" w:cstheme="minorBidi"/>
-          <w:kern w:val="2"/>
-          <w:sz w:val="24"/>
-          <w:szCs w:val="24"/>
-          <w:lang w:val="de-AT" w:eastAsia="de-AT"/>
-          <w14:ligatures w14:val="standardContextual"/>
-        </w:rPr>
-      </w:pPr>
-      <w:hyperlink w:anchor="_Toc230788890" w:history="1">
-        <w:r>
-          <w:rPr>
-            <w:rStyle w:val="Hyperlink"/>
-          </w:rPr>
-          <w:t>11</w:t>
-        </w:r>
-        <w:r>
-          <w:rPr>
-            <w:rFonts w:asciiTheme="minorHAnsi" w:eastAsiaTheme="minorEastAsia" w:hAnsiTheme="minorHAnsi" w:cstheme="minorBidi"/>
-            <w:kern w:val="2"/>
-            <w:sz w:val="24"/>
-            <w:szCs w:val="24"/>
-            <w:lang w:val="de-AT" w:eastAsia="de-AT"/>
-            <w14:ligatures w14:val="standardContextual"/>
-          </w:rPr>
-          <w:tab/>
-        </w:r>
-        <w:r>
-          <w:rPr>
-            <w:rStyle w:val="Hyperlink"/>
-          </w:rPr>
-          <w:t>Projektterminplan</w:t>
-        </w:r>
-        <w:r>
-          <w:rPr>
-            <w:webHidden/>
-          </w:rPr>
-          <w:tab/>
-        </w:r>
-        <w:r>
-          <w:rPr>
-            <w:webHidden/>
-          </w:rPr>
-          <w:fldChar w:fldCharType="begin"/>
-        </w:r>
-        <w:r>
-          <w:rPr>
-            <w:webHidden/>
-          </w:rPr>
-          <w:instrText xml:space="preserve"> PAGEREF _Toc230788890 \h </w:instrText>
+          <w:instrText xml:space="preserve"> PAGEREF _Toc231993786 \h </w:instrText>
         </w:r>
         <w:r>
           <w:rPr>
@@ -1364,12 +1302,12 @@
           <w14:ligatures w14:val="standardContextual"/>
         </w:rPr>
       </w:pPr>
-      <w:hyperlink w:anchor="_Toc230788891" w:history="1">
+      <w:hyperlink w:anchor="_Toc231993787" w:history="1">
         <w:r>
           <w:rPr>
             <w:rStyle w:val="Hyperlink"/>
           </w:rPr>
-          <w:t>12</w:t>
+          <w:t>12.</w:t>
         </w:r>
         <w:r>
           <w:rPr>
@@ -1404,7 +1342,7 @@
           <w:rPr>
             <w:webHidden/>
           </w:rPr>
-          <w:instrText xml:space="preserve"> PAGEREF _Toc230788891 \h </w:instrText>
+          <w:instrText xml:space="preserve"> PAGEREF _Toc231993787 \h </w:instrText>
         </w:r>
         <w:r>
           <w:rPr>
@@ -1443,12 +1381,12 @@
           <w14:ligatures w14:val="standardContextual"/>
         </w:rPr>
       </w:pPr>
-      <w:hyperlink w:anchor="_Toc230788892" w:history="1">
+      <w:hyperlink w:anchor="_Toc231993788" w:history="1">
         <w:r>
           <w:rPr>
             <w:rStyle w:val="Hyperlink"/>
           </w:rPr>
-          <w:t>13</w:t>
+          <w:t>14.</w:t>
         </w:r>
         <w:r>
           <w:rPr>
@@ -1483,7 +1421,7 @@
           <w:rPr>
             <w:webHidden/>
           </w:rPr>
-          <w:instrText xml:space="preserve"> PAGEREF _Toc230788892 \h </w:instrText>
+          <w:instrText xml:space="preserve"> PAGEREF _Toc231993788 \h </w:instrText>
         </w:r>
         <w:r>
           <w:rPr>
@@ -1522,7 +1460,24 @@
           <w14:ligatures w14:val="standardContextual"/>
         </w:rPr>
       </w:pPr>
-      <w:hyperlink w:anchor="_Toc230788893" w:history="1">
+      <w:hyperlink w:anchor="_Toc231993789" w:history="1">
+        <w:r>
+          <w:rPr>
+            <w:rStyle w:val="Hyperlink"/>
+          </w:rPr>
+          <w:t>15.</w:t>
+        </w:r>
+        <w:r>
+          <w:rPr>
+            <w:rFonts w:asciiTheme="minorHAnsi" w:eastAsiaTheme="minorEastAsia" w:hAnsiTheme="minorHAnsi" w:cstheme="minorBidi"/>
+            <w:kern w:val="2"/>
+            <w:sz w:val="24"/>
+            <w:szCs w:val="24"/>
+            <w:lang w:val="de-AT" w:eastAsia="de-AT"/>
+            <w14:ligatures w14:val="standardContextual"/>
+          </w:rPr>
+          <w:tab/>
+        </w:r>
         <w:r>
           <w:rPr>
             <w:rStyle w:val="Hyperlink"/>
@@ -1545,7 +1500,7 @@
           <w:rPr>
             <w:webHidden/>
           </w:rPr>
-          <w:instrText xml:space="preserve"> PAGEREF _Toc230788893 \h </w:instrText>
+          <w:instrText xml:space="preserve"> PAGEREF _Toc231993789 \h </w:instrText>
         </w:r>
         <w:r>
           <w:rPr>
@@ -1562,7 +1517,7 @@
           <w:rPr>
             <w:webHidden/>
           </w:rPr>
-          <w:t>18</w:t>
+          <w:t>19</w:t>
         </w:r>
         <w:r>
           <w:rPr>
@@ -1596,7 +1551,7 @@
       <w:bookmarkStart w:id="0" w:name="_Toc116286518"/>
       <w:bookmarkStart w:id="1" w:name="_Toc396809833"/>
       <w:bookmarkStart w:id="2" w:name="_Toc397882988"/>
-      <w:bookmarkStart w:id="3" w:name="_Toc230788879"/>
+      <w:bookmarkStart w:id="3" w:name="_Toc231993776"/>
       <w:r>
         <w:lastRenderedPageBreak/>
         <w:t>Änderungsverzeichnis</w:t>
@@ -2449,170 +2404,31 @@
             <w:pPr>
               <w:spacing w:before="60" w:after="60"/>
             </w:pPr>
-            <w:proofErr w:type="spellStart"/>
-            <w:r>
-              <w:t>Created</w:t>
-            </w:r>
-            <w:proofErr w:type="spellEnd"/>
-            <w:r>
-              <w:t xml:space="preserve"> </w:t>
-            </w:r>
-            <w:proofErr w:type="spellStart"/>
-            <w:r>
-              <w:t>public</w:t>
-            </w:r>
-            <w:proofErr w:type="spellEnd"/>
-            <w:r>
-              <w:t xml:space="preserve"> container-</w:t>
-            </w:r>
-            <w:proofErr w:type="spellStart"/>
-            <w:r>
-              <w:t>component</w:t>
-            </w:r>
-            <w:proofErr w:type="spellEnd"/>
-            <w:r>
-              <w:t xml:space="preserve"> „Sidebar“.</w:t>
-            </w:r>
-          </w:p>
-          <w:p>
-            <w:pPr>
-              <w:spacing w:before="60" w:after="60"/>
-            </w:pPr>
-            <w:proofErr w:type="spellStart"/>
-            <w:r>
-              <w:t>Created</w:t>
-            </w:r>
-            <w:proofErr w:type="spellEnd"/>
-            <w:r>
-              <w:t xml:space="preserve"> </w:t>
-            </w:r>
-            <w:proofErr w:type="spellStart"/>
-            <w:r>
-              <w:t>page</w:t>
-            </w:r>
-            <w:proofErr w:type="spellEnd"/>
-            <w:r>
-              <w:t xml:space="preserve"> </w:t>
-            </w:r>
-            <w:proofErr w:type="spellStart"/>
-            <w:r>
-              <w:t>for</w:t>
-            </w:r>
-            <w:proofErr w:type="spellEnd"/>
-            <w:r>
-              <w:t xml:space="preserve"> Todos and </w:t>
-            </w:r>
-            <w:proofErr w:type="spellStart"/>
-            <w:r>
-              <w:t>implemented</w:t>
-            </w:r>
-            <w:proofErr w:type="spellEnd"/>
-            <w:r>
-              <w:t xml:space="preserve"> </w:t>
-            </w:r>
-            <w:proofErr w:type="spellStart"/>
-            <w:r>
-              <w:t>logic</w:t>
-            </w:r>
-            <w:proofErr w:type="spellEnd"/>
-            <w:r>
-              <w:t xml:space="preserve"> </w:t>
-            </w:r>
-            <w:proofErr w:type="spellStart"/>
-            <w:r>
-              <w:t>including</w:t>
-            </w:r>
-            <w:proofErr w:type="spellEnd"/>
-            <w:r>
-              <w:t xml:space="preserve"> Hooks </w:t>
-            </w:r>
-            <w:proofErr w:type="spellStart"/>
-            <w:r>
-              <w:t>for</w:t>
-            </w:r>
-            <w:proofErr w:type="spellEnd"/>
-            <w:r>
-              <w:t xml:space="preserve"> Hubs. </w:t>
+            <w:r>
+              <w:t>Created public container-component „Sidebar“.</w:t>
+            </w:r>
+          </w:p>
+          <w:p>
+            <w:pPr>
+              <w:spacing w:before="60" w:after="60"/>
+            </w:pPr>
+            <w:r>
+              <w:t xml:space="preserve">Created page for Todos and implemented logic including Hooks for Hubs. </w:t>
             </w:r>
             <w:r>
               <w:br/>
-            </w:r>
-            <w:proofErr w:type="spellStart"/>
-            <w:r>
-              <w:t>Implemented</w:t>
-            </w:r>
-            <w:proofErr w:type="spellEnd"/>
-            <w:r>
-              <w:t xml:space="preserve"> Sidebar-</w:t>
-            </w:r>
-            <w:proofErr w:type="spellStart"/>
-            <w:r>
-              <w:t>component</w:t>
-            </w:r>
-            <w:proofErr w:type="spellEnd"/>
-            <w:r>
-              <w:t xml:space="preserve"> (Todo-Collection) </w:t>
-            </w:r>
-            <w:proofErr w:type="spellStart"/>
-            <w:r>
-              <w:t>for</w:t>
-            </w:r>
-            <w:proofErr w:type="spellEnd"/>
-            <w:r>
-              <w:t xml:space="preserve"> Todos and </w:t>
-            </w:r>
-            <w:proofErr w:type="spellStart"/>
-            <w:r>
-              <w:t>wired</w:t>
-            </w:r>
-            <w:proofErr w:type="spellEnd"/>
-            <w:r>
-              <w:t xml:space="preserve"> </w:t>
-            </w:r>
-            <w:proofErr w:type="spellStart"/>
-            <w:r>
-              <w:t>logic</w:t>
-            </w:r>
-            <w:proofErr w:type="spellEnd"/>
-            <w:r>
-              <w:t>.</w:t>
-            </w:r>
-          </w:p>
-          <w:p>
-            <w:pPr>
-              <w:spacing w:before="60" w:after="60"/>
-            </w:pPr>
-            <w:proofErr w:type="spellStart"/>
+              <w:t>Implemented Sidebar-component (Todo-Collection) for Todos and wired logic.</w:t>
+            </w:r>
+          </w:p>
+          <w:p>
+            <w:pPr>
+              <w:spacing w:before="60" w:after="60"/>
+            </w:pPr>
             <w:r>
               <w:t>Added</w:t>
             </w:r>
-            <w:proofErr w:type="spellEnd"/>
-            <w:r>
-              <w:t xml:space="preserve"> </w:t>
-            </w:r>
-            <w:proofErr w:type="spellStart"/>
-            <w:r>
-              <w:t>component</w:t>
-            </w:r>
-            <w:proofErr w:type="spellEnd"/>
-            <w:r>
-              <w:t xml:space="preserve"> </w:t>
-            </w:r>
-            <w:proofErr w:type="spellStart"/>
-            <w:r>
-              <w:t>TodoBoard</w:t>
-            </w:r>
-            <w:proofErr w:type="spellEnd"/>
-            <w:r>
-              <w:t xml:space="preserve"> </w:t>
-            </w:r>
-            <w:proofErr w:type="spellStart"/>
-            <w:r>
-              <w:t>for</w:t>
-            </w:r>
-            <w:proofErr w:type="spellEnd"/>
-            <w:r>
-              <w:t xml:space="preserve"> Todos.</w:t>
+            <w:r>
+              <w:t xml:space="preserve"> component TodoBoard for Todos.</w:t>
             </w:r>
           </w:p>
         </w:tc>
@@ -2670,68 +2486,23 @@
               <w:spacing w:before="60" w:after="60"/>
             </w:pPr>
             <w:r>
-              <w:t>Feature-Seite „Events“ gestartet. Sidebar-</w:t>
-            </w:r>
-            <w:proofErr w:type="spellStart"/>
-            <w:r>
-              <w:t>component</w:t>
-            </w:r>
-            <w:proofErr w:type="spellEnd"/>
-            <w:r>
-              <w:t xml:space="preserve"> implementiert. Kalender mit </w:t>
-            </w:r>
-            <w:proofErr w:type="spellStart"/>
-            <w:r>
-              <w:t>Grid</w:t>
-            </w:r>
-            <w:proofErr w:type="spellEnd"/>
-            <w:r>
-              <w:t xml:space="preserve"> für </w:t>
-            </w:r>
-            <w:proofErr w:type="spellStart"/>
-            <w:r>
-              <w:t>Daycells</w:t>
-            </w:r>
-            <w:proofErr w:type="spellEnd"/>
-            <w:r>
-              <w:t xml:space="preserve"> aufgebaut. </w:t>
-            </w:r>
-          </w:p>
-          <w:p>
-            <w:pPr>
-              <w:spacing w:before="60" w:after="60"/>
-            </w:pPr>
-            <w:r>
-              <w:t>Kalender mit Logik erweitert (</w:t>
-            </w:r>
-            <w:proofErr w:type="spellStart"/>
-            <w:r>
-              <w:t>Paging</w:t>
-            </w:r>
-            <w:proofErr w:type="spellEnd"/>
-            <w:r>
-              <w:t xml:space="preserve"> und Offset Cells inklusive </w:t>
-            </w:r>
-            <w:proofErr w:type="spellStart"/>
-            <w:r>
-              <w:t>DayCellCount-Berrechnung</w:t>
-            </w:r>
-            <w:proofErr w:type="spellEnd"/>
-            <w:r>
-              <w:t>)</w:t>
-            </w:r>
-          </w:p>
-          <w:p>
-            <w:pPr>
-              <w:spacing w:before="60" w:after="60"/>
-            </w:pPr>
-            <w:proofErr w:type="spellStart"/>
-            <w:r>
-              <w:t>EventModal</w:t>
-            </w:r>
-            <w:proofErr w:type="spellEnd"/>
-            <w:r>
-              <w:t xml:space="preserve"> implementiert. (Detailansicht eines Tages und dessen Einträge)</w:t>
+              <w:t xml:space="preserve">Feature-Seite „Events“ gestartet. Sidebar-component implementiert. Kalender mit Grid für Daycells aufgebaut. </w:t>
+            </w:r>
+          </w:p>
+          <w:p>
+            <w:pPr>
+              <w:spacing w:before="60" w:after="60"/>
+            </w:pPr>
+            <w:r>
+              <w:t>Kalender mit Logik erweitert (Paging und Offset Cells inklusive DayCellCount-Berrechnung)</w:t>
+            </w:r>
+          </w:p>
+          <w:p>
+            <w:pPr>
+              <w:spacing w:before="60" w:after="60"/>
+            </w:pPr>
+            <w:r>
+              <w:t>EventModal implementiert. (Detailansicht eines Tages und dessen Einträge)</w:t>
             </w:r>
           </w:p>
         </w:tc>
@@ -2787,120 +2558,31 @@
             <w:pPr>
               <w:spacing w:before="60" w:after="60"/>
             </w:pPr>
-            <w:proofErr w:type="spellStart"/>
-            <w:r>
-              <w:t>Implemented</w:t>
-            </w:r>
-            <w:proofErr w:type="spellEnd"/>
-            <w:r>
-              <w:t xml:space="preserve"> Navigation „</w:t>
-            </w:r>
-            <w:proofErr w:type="spellStart"/>
-            <w:r>
-              <w:t>SpaceSwitcher</w:t>
-            </w:r>
-            <w:proofErr w:type="spellEnd"/>
-            <w:r>
-              <w:t xml:space="preserve">“ </w:t>
-            </w:r>
-            <w:proofErr w:type="spellStart"/>
-            <w:r>
-              <w:t>to</w:t>
-            </w:r>
-            <w:proofErr w:type="spellEnd"/>
-            <w:r>
-              <w:t xml:space="preserve"> switch </w:t>
-            </w:r>
-            <w:proofErr w:type="spellStart"/>
-            <w:r>
-              <w:t>between</w:t>
-            </w:r>
-            <w:proofErr w:type="spellEnd"/>
-            <w:r>
-              <w:t xml:space="preserve"> different </w:t>
-            </w:r>
-            <w:proofErr w:type="spellStart"/>
-            <w:r>
-              <w:t>spaces</w:t>
-            </w:r>
-            <w:proofErr w:type="spellEnd"/>
-            <w:r>
-              <w:t>.</w:t>
-            </w:r>
-          </w:p>
-          <w:p>
-            <w:pPr>
-              <w:spacing w:before="60" w:after="60"/>
-            </w:pPr>
-            <w:proofErr w:type="spellStart"/>
-            <w:r>
-              <w:t>Implemented</w:t>
-            </w:r>
-            <w:proofErr w:type="spellEnd"/>
-            <w:r>
-              <w:t xml:space="preserve"> Navigation „</w:t>
-            </w:r>
-            <w:proofErr w:type="spellStart"/>
-            <w:r>
-              <w:t>FeatureNavigation</w:t>
-            </w:r>
-            <w:proofErr w:type="spellEnd"/>
-            <w:r>
-              <w:t xml:space="preserve">“ </w:t>
-            </w:r>
-            <w:proofErr w:type="spellStart"/>
-            <w:r>
-              <w:t>to</w:t>
-            </w:r>
-            <w:proofErr w:type="spellEnd"/>
-            <w:r>
-              <w:t xml:space="preserve"> switch </w:t>
-            </w:r>
-            <w:proofErr w:type="spellStart"/>
-            <w:r>
-              <w:t>between</w:t>
-            </w:r>
-            <w:proofErr w:type="spellEnd"/>
-            <w:r>
-              <w:t xml:space="preserve"> </w:t>
-            </w:r>
-            <w:proofErr w:type="spellStart"/>
-            <w:r>
-              <w:t>features</w:t>
-            </w:r>
-            <w:proofErr w:type="spellEnd"/>
-            <w:r>
-              <w:t xml:space="preserve"> in </w:t>
-            </w:r>
-            <w:proofErr w:type="spellStart"/>
-            <w:r>
-              <w:t>the</w:t>
-            </w:r>
-            <w:proofErr w:type="spellEnd"/>
-            <w:r>
-              <w:t xml:space="preserve"> </w:t>
-            </w:r>
-            <w:proofErr w:type="spellStart"/>
-            <w:r>
-              <w:t>current</w:t>
-            </w:r>
-            <w:proofErr w:type="spellEnd"/>
-            <w:r>
-              <w:t xml:space="preserve"> </w:t>
-            </w:r>
-            <w:proofErr w:type="spellStart"/>
-            <w:r>
-              <w:t>space</w:t>
-            </w:r>
-            <w:proofErr w:type="spellEnd"/>
-            <w:r>
-              <w:t>.</w:t>
-            </w:r>
-          </w:p>
-          <w:p>
-            <w:pPr>
-              <w:spacing w:before="60" w:after="60"/>
-            </w:pPr>
+            <w:r>
+              <w:t>Implemented Navigation „SpaceSwitcher“ to switch between different spaces.</w:t>
+            </w:r>
+          </w:p>
+          <w:p>
+            <w:pPr>
+              <w:spacing w:before="60" w:after="60"/>
+            </w:pPr>
+            <w:r>
+              <w:t>Implemented Navigation „FeatureNavigation“ to switch between features in the current space.</w:t>
+            </w:r>
+          </w:p>
+          <w:p>
+            <w:pPr>
+              <w:spacing w:before="60" w:after="60"/>
+            </w:pPr>
+            <w:r>
+              <w:t xml:space="preserve">Übersetzer-Util </w:t>
+            </w:r>
+            <w:r>
+              <w:t>mit KI ausgearbeitet</w:t>
+            </w:r>
+            <w:r>
+              <w:t xml:space="preserve"> -&gt; FlatDB auf Nodes (Für File-System in der App)</w:t>
+            </w:r>
           </w:p>
         </w:tc>
         <w:tc>
@@ -3033,8 +2715,7 @@
       </w:r>
       <w:bookmarkStart w:id="4" w:name="_Toc396809834"/>
       <w:bookmarkStart w:id="5" w:name="_Toc397882989"/>
-      <w:bookmarkStart w:id="6" w:name="_Toc230788880"/>
-      <w:bookmarkStart w:id="7" w:name="_Toc116286519"/>
+      <w:bookmarkStart w:id="6" w:name="_Toc231993777"/>
       <w:r>
         <w:lastRenderedPageBreak/>
         <w:t>Teamregeln</w:t>
@@ -3446,15 +3127,14 @@
       <w:pPr>
         <w:pStyle w:val="berschrift1"/>
       </w:pPr>
-      <w:bookmarkStart w:id="8" w:name="_Toc397882990"/>
-      <w:bookmarkStart w:id="9" w:name="_Toc230788881"/>
-      <w:bookmarkStart w:id="10" w:name="_Toc396809835"/>
+      <w:bookmarkStart w:id="7" w:name="_Toc397882990"/>
+      <w:bookmarkStart w:id="8" w:name="_Toc231993778"/>
       <w:r>
         <w:lastRenderedPageBreak/>
         <w:t>Zielfindung</w:t>
       </w:r>
+      <w:bookmarkEnd w:id="7"/>
       <w:bookmarkEnd w:id="8"/>
-      <w:bookmarkEnd w:id="9"/>
     </w:p>
     <w:p>
       <w:r>
@@ -4247,21 +3927,21 @@
       <w:pPr>
         <w:pStyle w:val="berschrift1"/>
       </w:pPr>
-      <w:bookmarkStart w:id="11" w:name="_Toc116286528"/>
-      <w:bookmarkStart w:id="12" w:name="_Toc396809844"/>
-      <w:bookmarkStart w:id="13" w:name="_Toc397882991"/>
-      <w:bookmarkStart w:id="14" w:name="_Toc230788882"/>
+      <w:bookmarkStart w:id="9" w:name="_Toc116286528"/>
+      <w:bookmarkStart w:id="10" w:name="_Toc396809844"/>
+      <w:bookmarkStart w:id="11" w:name="_Toc397882991"/>
+      <w:bookmarkStart w:id="12" w:name="_Toc231993779"/>
       <w:r>
         <w:lastRenderedPageBreak/>
         <w:t>Projektrisiken</w:t>
       </w:r>
-      <w:bookmarkStart w:id="15" w:name="_Toc116286520"/>
-      <w:bookmarkStart w:id="16" w:name="_Toc396809836"/>
-      <w:bookmarkStart w:id="17" w:name="_Toc397882992"/>
+      <w:bookmarkStart w:id="13" w:name="_Toc116286520"/>
+      <w:bookmarkStart w:id="14" w:name="_Toc396809836"/>
+      <w:bookmarkStart w:id="15" w:name="_Toc397882992"/>
+      <w:bookmarkEnd w:id="9"/>
+      <w:bookmarkEnd w:id="10"/>
       <w:bookmarkEnd w:id="11"/>
       <w:bookmarkEnd w:id="12"/>
-      <w:bookmarkEnd w:id="13"/>
-      <w:bookmarkEnd w:id="14"/>
     </w:p>
     <w:p>
       <w:pPr>
@@ -4314,14 +3994,14 @@
       <w:pPr>
         <w:pStyle w:val="berschrift1"/>
       </w:pPr>
-      <w:bookmarkStart w:id="18" w:name="_Toc230788883"/>
+      <w:bookmarkStart w:id="16" w:name="_Toc231993780"/>
       <w:r>
         <w:t>Projektzieleplan</w:t>
       </w:r>
+      <w:bookmarkEnd w:id="13"/>
+      <w:bookmarkEnd w:id="14"/>
       <w:bookmarkEnd w:id="15"/>
       <w:bookmarkEnd w:id="16"/>
-      <w:bookmarkEnd w:id="17"/>
-      <w:bookmarkEnd w:id="18"/>
     </w:p>
     <w:tbl>
       <w:tblPr>
@@ -4469,7 +4149,7 @@
                 </w:ffData>
               </w:fldChar>
             </w:r>
-            <w:bookmarkStart w:id="19" w:name="Text54"/>
+            <w:bookmarkStart w:id="17" w:name="Text54"/>
             <w:r>
               <w:rPr>
                 <w:b/>
@@ -4519,7 +4199,7 @@
               </w:rPr>
               <w:fldChar w:fldCharType="end"/>
             </w:r>
-            <w:bookmarkEnd w:id="19"/>
+            <w:bookmarkEnd w:id="17"/>
           </w:p>
         </w:tc>
       </w:tr>
@@ -4781,24 +4461,24 @@
       <w:r>
         <w:br w:type="page"/>
       </w:r>
-      <w:bookmarkStart w:id="20" w:name="_Toc116286521"/>
-      <w:bookmarkStart w:id="21" w:name="_Toc396809837"/>
-      <w:bookmarkStart w:id="22" w:name="_Toc397882993"/>
-      <w:bookmarkStart w:id="23" w:name="_Toc230788884"/>
+      <w:bookmarkStart w:id="18" w:name="_Toc116286521"/>
+      <w:bookmarkStart w:id="19" w:name="_Toc396809837"/>
+      <w:bookmarkStart w:id="20" w:name="_Toc397882993"/>
+      <w:bookmarkStart w:id="21" w:name="_Toc231993781"/>
       <w:r>
         <w:lastRenderedPageBreak/>
         <w:t>Projektkontext</w:t>
       </w:r>
-      <w:bookmarkEnd w:id="20"/>
+      <w:bookmarkEnd w:id="18"/>
       <w:r>
         <w:rPr>
           <w:rStyle w:val="Funotenzeichen"/>
         </w:rPr>
         <w:footnoteReference w:id="2"/>
       </w:r>
+      <w:bookmarkEnd w:id="19"/>
+      <w:bookmarkEnd w:id="20"/>
       <w:bookmarkEnd w:id="21"/>
-      <w:bookmarkEnd w:id="22"/>
-      <w:bookmarkEnd w:id="23"/>
     </w:p>
     <w:tbl>
       <w:tblPr>
@@ -4998,19 +4678,9 @@
               </w:numPr>
               <w:spacing w:before="60" w:after="60"/>
             </w:pPr>
-            <w:proofErr w:type="gramStart"/>
-            <w:r>
-              <w:t>Keine Ahnung</w:t>
-            </w:r>
-            <w:proofErr w:type="gramEnd"/>
-            <w:r>
-              <w:t xml:space="preserve"> was ich hier </w:t>
-            </w:r>
-            <w:proofErr w:type="gramStart"/>
-            <w:r>
-              <w:t>schreiben sollte</w:t>
-            </w:r>
-            <w:proofErr w:type="gramEnd"/>
+            <w:r>
+              <w:t>Keine Ahnung was ich hier schreiben sollte</w:t>
+            </w:r>
           </w:p>
         </w:tc>
         <w:tc>
@@ -5489,14 +5159,14 @@
         </w:rPr>
         <w:br w:type="page"/>
       </w:r>
-      <w:bookmarkStart w:id="24" w:name="_Toc397882994"/>
-      <w:bookmarkStart w:id="25" w:name="_Toc230788885"/>
+      <w:bookmarkStart w:id="22" w:name="_Toc397882994"/>
+      <w:bookmarkStart w:id="23" w:name="_Toc231993782"/>
       <w:r>
         <w:lastRenderedPageBreak/>
         <w:t>Projektorganisation</w:t>
       </w:r>
-      <w:bookmarkEnd w:id="24"/>
-      <w:bookmarkEnd w:id="25"/>
+      <w:bookmarkEnd w:id="22"/>
+      <w:bookmarkEnd w:id="23"/>
     </w:p>
     <w:tbl>
       <w:tblPr>
@@ -5539,6 +5209,8 @@
                 <w:bCs/>
               </w:rPr>
             </w:pPr>
+            <w:bookmarkStart w:id="24" w:name="_Toc116286519"/>
+            <w:bookmarkStart w:id="25" w:name="_Toc396809835"/>
             <w:r>
               <w:rPr>
                 <w:b/>
@@ -5652,19 +5324,9 @@
               </w:numPr>
               <w:spacing w:before="60" w:after="60"/>
             </w:pPr>
-            <w:proofErr w:type="gramStart"/>
-            <w:r>
-              <w:t>Will</w:t>
-            </w:r>
-            <w:proofErr w:type="gramEnd"/>
-            <w:r>
-              <w:t xml:space="preserve"> dass ich das Projekt </w:t>
-            </w:r>
-            <w:proofErr w:type="gramStart"/>
-            <w:r>
-              <w:t>mache</w:t>
-            </w:r>
-            <w:proofErr w:type="gramEnd"/>
+            <w:r>
+              <w:t>Will dass ich das Projekt mache</w:t>
+            </w:r>
           </w:p>
         </w:tc>
         <w:tc>
@@ -5676,13 +5338,8 @@
               <w:spacing w:before="60" w:after="60"/>
               <w:jc w:val="center"/>
             </w:pPr>
-            <w:proofErr w:type="spellStart"/>
-            <w:r>
-              <w:t>Landesberufschule</w:t>
-            </w:r>
-            <w:proofErr w:type="spellEnd"/>
-            <w:r>
-              <w:t xml:space="preserve"> 4</w:t>
+            <w:r>
+              <w:t>Landesberufschule 4</w:t>
             </w:r>
           </w:p>
         </w:tc>
@@ -6321,23 +5978,13 @@
                                   <w:szCs w:val="20"/>
                                 </w:rPr>
                               </w:pPr>
-                              <w:proofErr w:type="spellStart"/>
                               <w:r>
                                 <w:rPr>
                                   <w:rFonts w:cs="Arial"/>
                                   <w:color w:val="000000"/>
                                   <w:szCs w:val="20"/>
                                 </w:rPr>
-                                <w:t>Landesberufschule</w:t>
-                              </w:r>
-                              <w:proofErr w:type="spellEnd"/>
-                              <w:r>
-                                <w:rPr>
-                                  <w:rFonts w:cs="Arial"/>
-                                  <w:color w:val="000000"/>
-                                  <w:szCs w:val="20"/>
-                                </w:rPr>
-                                <w:t xml:space="preserve"> 4 </w:t>
+                                <w:t xml:space="preserve">Landesberufschule 4 </w:t>
                               </w:r>
                             </w:p>
                           </w:txbxContent>
@@ -6643,23 +6290,13 @@
                             <w:szCs w:val="20"/>
                           </w:rPr>
                         </w:pPr>
-                        <w:proofErr w:type="spellStart"/>
                         <w:r>
                           <w:rPr>
                             <w:rFonts w:cs="Arial"/>
                             <w:color w:val="000000"/>
                             <w:szCs w:val="20"/>
                           </w:rPr>
-                          <w:t>Landesberufschule</w:t>
-                        </w:r>
-                        <w:proofErr w:type="spellEnd"/>
-                        <w:r>
-                          <w:rPr>
-                            <w:rFonts w:cs="Arial"/>
-                            <w:color w:val="000000"/>
-                            <w:szCs w:val="20"/>
-                          </w:rPr>
-                          <w:t xml:space="preserve"> 4 </w:t>
+                          <w:t xml:space="preserve">Landesberufschule 4 </w:t>
                         </w:r>
                       </w:p>
                     </w:txbxContent>
@@ -6760,9 +6397,9 @@
       <w:r>
         <w:br w:type="page"/>
       </w:r>
-      <w:bookmarkStart w:id="26" w:name="_Toc230788886"/>
-      <w:bookmarkEnd w:id="7"/>
-      <w:bookmarkEnd w:id="10"/>
+      <w:bookmarkStart w:id="26" w:name="_Toc231993783"/>
+      <w:bookmarkEnd w:id="24"/>
+      <w:bookmarkEnd w:id="25"/>
       <w:r>
         <w:lastRenderedPageBreak/>
         <w:t>Projektauftrag</w:t>
@@ -7034,13 +6671,8 @@
             <w:r>
               <w:t xml:space="preserve">: </w:t>
             </w:r>
-            <w:proofErr w:type="spellStart"/>
-            <w:r>
-              <w:t>Landesberufschule</w:t>
-            </w:r>
-            <w:proofErr w:type="spellEnd"/>
-            <w:r>
-              <w:t xml:space="preserve"> 4</w:t>
+            <w:r>
+              <w:t>Landesberufschule 4</w:t>
             </w:r>
           </w:p>
         </w:tc>
@@ -8554,7 +8186,7 @@
       <w:bookmarkStart w:id="35" w:name="_Toc116286523"/>
       <w:bookmarkStart w:id="36" w:name="_Toc396809839"/>
       <w:bookmarkStart w:id="37" w:name="_Toc397882996"/>
-      <w:bookmarkStart w:id="38" w:name="_Toc230788887"/>
+      <w:bookmarkStart w:id="38" w:name="_Toc231993784"/>
       <w:r>
         <w:lastRenderedPageBreak/>
         <w:t>Projektstrukturplan (PSP)</w:t>
@@ -8674,11 +8306,6 @@
     <w:p>
       <w:pPr>
         <w:pStyle w:val="berschrift1"/>
-        <w:numPr>
-          <w:ilvl w:val="0"/>
-          <w:numId w:val="0"/>
-        </w:numPr>
-        <w:ind w:left="432"/>
       </w:pPr>
       <w:r>
         <w:br w:type="page"/>
@@ -8686,7 +8313,7 @@
       <w:bookmarkStart w:id="39" w:name="_Toc116286524"/>
       <w:bookmarkStart w:id="40" w:name="_Toc396809840"/>
       <w:bookmarkStart w:id="41" w:name="_Toc397882997"/>
-      <w:bookmarkStart w:id="42" w:name="_Toc230788888"/>
+      <w:bookmarkStart w:id="42" w:name="_Toc231993785"/>
       <w:r>
         <w:lastRenderedPageBreak/>
         <w:t>AP-Spezifikation / AP Beschreibung</w:t>
@@ -8813,13 +8440,8 @@
             <w:pPr>
               <w:spacing w:before="60" w:after="60"/>
             </w:pPr>
-            <w:proofErr w:type="gramStart"/>
-            <w:r>
-              <w:t>AP Inhalte</w:t>
-            </w:r>
-            <w:proofErr w:type="gramEnd"/>
-            <w:r>
-              <w:t xml:space="preserve"> / Ergebnisse:</w:t>
+            <w:r>
+              <w:t>AP Inhalte / Ergebnisse:</w:t>
             </w:r>
           </w:p>
         </w:tc>
@@ -9061,13 +8683,8 @@
             <w:pPr>
               <w:spacing w:before="60" w:after="60"/>
             </w:pPr>
-            <w:proofErr w:type="gramStart"/>
-            <w:r>
-              <w:t>AP Inhalte</w:t>
-            </w:r>
-            <w:proofErr w:type="gramEnd"/>
-            <w:r>
-              <w:t xml:space="preserve"> / Ergebnisse:</w:t>
+            <w:r>
+              <w:t>AP Inhalte / Ergebnisse:</w:t>
             </w:r>
           </w:p>
         </w:tc>
@@ -9115,13 +8732,8 @@
               <w:spacing w:before="60" w:after="60"/>
             </w:pPr>
             <w:r>
-              <w:t>Umsetzung von Authentifizierung mittels JWT/Https-</w:t>
-            </w:r>
-            <w:proofErr w:type="spellStart"/>
-            <w:r>
-              <w:t>only</w:t>
-            </w:r>
-            <w:proofErr w:type="spellEnd"/>
+              <w:t>Umsetzung von Authentifizierung mittels JWT/Https-only</w:t>
+            </w:r>
           </w:p>
           <w:p>
             <w:pPr>
@@ -9385,13 +8997,8 @@
             <w:pPr>
               <w:spacing w:before="60" w:after="60"/>
             </w:pPr>
-            <w:proofErr w:type="gramStart"/>
-            <w:r>
-              <w:t>AP Inhalte</w:t>
-            </w:r>
-            <w:proofErr w:type="gramEnd"/>
-            <w:r>
-              <w:t xml:space="preserve"> / Ergebnisse:</w:t>
+            <w:r>
+              <w:t>AP Inhalte / Ergebnisse:</w:t>
             </w:r>
           </w:p>
         </w:tc>
@@ -9432,15 +9039,7 @@
               <w:spacing w:before="60" w:after="60"/>
             </w:pPr>
             <w:r>
-              <w:t xml:space="preserve">Tests zu Hubs und Hooks können erst sicher getestet werden, wenn ein Feature im Frontend gebaut </w:t>
-            </w:r>
-            <w:proofErr w:type="gramStart"/>
-            <w:r>
-              <w:t>ist</w:t>
-            </w:r>
-            <w:proofErr w:type="gramEnd"/>
-            <w:r>
-              <w:t xml:space="preserve"> </w:t>
+              <w:t xml:space="preserve">Tests zu Hubs und Hooks können erst sicher getestet werden, wenn ein Feature im Frontend gebaut ist </w:t>
             </w:r>
           </w:p>
         </w:tc>
@@ -9616,7 +9215,7 @@
       <w:bookmarkStart w:id="44" w:name="_Toc116286525"/>
       <w:bookmarkStart w:id="45" w:name="_Toc396809841"/>
       <w:bookmarkStart w:id="46" w:name="_Toc397882998"/>
-      <w:bookmarkStart w:id="47" w:name="_Toc230788889"/>
+      <w:bookmarkStart w:id="47" w:name="_Toc231993786"/>
       <w:r>
         <w:lastRenderedPageBreak/>
         <w:t>Projektmeilensteinplan</w:t>
@@ -10098,6 +9697,7 @@
       <w:r>
         <w:rPr>
           <w:i/>
+          <w:noProof/>
         </w:rPr>
         <w:drawing>
           <wp:inline distT="0" distB="0" distL="0" distR="0" wp14:anchorId="371C9D87" wp14:editId="5F476F41">
@@ -10147,10 +9747,6 @@
     <w:p>
       <w:pPr>
         <w:pStyle w:val="berschrift1"/>
-        <w:numPr>
-          <w:ilvl w:val="0"/>
-          <w:numId w:val="0"/>
-        </w:numPr>
       </w:pPr>
       <w:r>
         <w:br w:type="page"/>
@@ -10158,7 +9754,7 @@
       <w:bookmarkStart w:id="48" w:name="_Toc116286527"/>
       <w:bookmarkStart w:id="49" w:name="_Toc396809843"/>
       <w:bookmarkStart w:id="50" w:name="_Toc397883000"/>
-      <w:bookmarkStart w:id="51" w:name="_Toc230788891"/>
+      <w:bookmarkStart w:id="51" w:name="_Toc231993787"/>
       <w:r>
         <w:lastRenderedPageBreak/>
         <w:t>Projektkostenplan / Zeiterfassung</w:t>
@@ -10769,10 +10365,6 @@
     <w:p>
       <w:pPr>
         <w:pStyle w:val="berschrift1"/>
-        <w:numPr>
-          <w:ilvl w:val="0"/>
-          <w:numId w:val="0"/>
-        </w:numPr>
       </w:pPr>
       <w:r>
         <w:br w:type="page"/>
@@ -10785,7 +10377,7 @@
         <w:pStyle w:val="berschrift1"/>
       </w:pPr>
       <w:bookmarkStart w:id="54" w:name="_Toc397883001"/>
-      <w:bookmarkStart w:id="55" w:name="_Toc230788892"/>
+      <w:bookmarkStart w:id="55" w:name="_Toc231993788"/>
       <w:r>
         <w:lastRenderedPageBreak/>
         <w:t>Projektfortschrittsbericht</w:t>
@@ -11784,7 +11376,6 @@
                 <w:sz w:val="18"/>
               </w:rPr>
             </w:pPr>
-            <w:proofErr w:type="spellStart"/>
             <w:r>
               <w:rPr>
                 <w:rFonts w:ascii="Tahoma" w:hAnsi="Tahoma" w:cs="Tahoma"/>
@@ -11793,18 +11384,7 @@
                 <w:color w:val="70AD47" w:themeColor="accent6"/>
                 <w:sz w:val="18"/>
               </w:rPr>
-              <w:t>FrontendServices</w:t>
-            </w:r>
-            <w:proofErr w:type="spellEnd"/>
-            <w:r>
-              <w:rPr>
-                <w:rFonts w:ascii="Tahoma" w:hAnsi="Tahoma" w:cs="Tahoma"/>
-                <w:b/>
-                <w:bCs/>
-                <w:color w:val="70AD47" w:themeColor="accent6"/>
-                <w:sz w:val="18"/>
-              </w:rPr>
-              <w:t xml:space="preserve"> wurden aufgebaut und an die Authentication angepasst.</w:t>
+              <w:t>FrontendServices wurden aufgebaut und an die Authentication angepasst.</w:t>
             </w:r>
           </w:p>
           <w:p>
@@ -11831,29 +11411,7 @@
                 <w:color w:val="70AD47" w:themeColor="accent6"/>
                 <w:sz w:val="18"/>
               </w:rPr>
-              <w:t xml:space="preserve">Tests zu Hooks und Hubs konnten erfolgreich getestet werden. Eine </w:t>
-            </w:r>
-            <w:proofErr w:type="spellStart"/>
-            <w:r>
-              <w:rPr>
-                <w:rFonts w:ascii="Tahoma" w:hAnsi="Tahoma" w:cs="Tahoma"/>
-                <w:b/>
-                <w:bCs/>
-                <w:color w:val="70AD47" w:themeColor="accent6"/>
-                <w:sz w:val="18"/>
-              </w:rPr>
-              <w:t>Race-Condition</w:t>
-            </w:r>
-            <w:proofErr w:type="spellEnd"/>
-            <w:r>
-              <w:rPr>
-                <w:rFonts w:ascii="Tahoma" w:hAnsi="Tahoma" w:cs="Tahoma"/>
-                <w:b/>
-                <w:bCs/>
-                <w:color w:val="70AD47" w:themeColor="accent6"/>
-                <w:sz w:val="18"/>
-              </w:rPr>
-              <w:t xml:space="preserve"> musste ausgebessert werden. Hubs laufen nun korrekt und funktionieren.</w:t>
+              <w:t>Tests zu Hooks und Hubs konnten erfolgreich getestet werden. Eine Race-Condition musste ausgebessert werden. Hubs laufen nun korrekt und funktionieren.</w:t>
             </w:r>
           </w:p>
           <w:p>
@@ -12882,10 +12440,6 @@
     <w:p>
       <w:pPr>
         <w:pStyle w:val="berschrift1"/>
-        <w:numPr>
-          <w:ilvl w:val="0"/>
-          <w:numId w:val="0"/>
-        </w:numPr>
       </w:pPr>
       <w:r>
         <w:br w:type="page"/>
@@ -12893,7 +12447,7 @@
       <w:bookmarkStart w:id="56" w:name="_Toc116286530"/>
       <w:bookmarkStart w:id="57" w:name="_Toc396809846"/>
       <w:bookmarkStart w:id="58" w:name="_Toc397883002"/>
-      <w:bookmarkStart w:id="59" w:name="_Toc230788893"/>
+      <w:bookmarkStart w:id="59" w:name="_Toc231993789"/>
       <w:r>
         <w:lastRenderedPageBreak/>
         <w:t>Projektabschluss</w:t>
@@ -13314,23 +12868,13 @@
                 <w:lang w:val="en-GB"/>
               </w:rPr>
             </w:pPr>
-            <w:proofErr w:type="spellStart"/>
             <w:r>
               <w:rPr>
                 <w:b/>
                 <w:bCs/>
                 <w:lang w:val="en-GB"/>
               </w:rPr>
-              <w:t>Teamarbeit</w:t>
-            </w:r>
-            <w:proofErr w:type="spellEnd"/>
-            <w:r>
-              <w:rPr>
-                <w:b/>
-                <w:bCs/>
-                <w:lang w:val="en-GB"/>
-              </w:rPr>
-              <w:t>:</w:t>
+              <w:t>Teamarbeit:</w:t>
             </w:r>
           </w:p>
           <w:p>
@@ -13590,25 +13134,7 @@
                 <w:bCs/>
                 <w:lang w:val="de-AT"/>
               </w:rPr>
-              <w:t xml:space="preserve"> Lernerfahrungen („</w:t>
-            </w:r>
-            <w:proofErr w:type="spellStart"/>
-            <w:r>
-              <w:rPr>
-                <w:b/>
-                <w:bCs/>
-                <w:lang w:val="de-AT"/>
-              </w:rPr>
-              <w:t>Learnings</w:t>
-            </w:r>
-            <w:proofErr w:type="spellEnd"/>
-            <w:r>
-              <w:rPr>
-                <w:b/>
-                <w:bCs/>
-                <w:lang w:val="de-AT"/>
-              </w:rPr>
-              <w:t>“):</w:t>
+              <w:t xml:space="preserve"> Lernerfahrungen („Learnings“):</w:t>
             </w:r>
           </w:p>
           <w:p>
@@ -14469,15 +13995,7 @@
       </w:r>
       <w:r>
         <w:tab/>
-        <w:t xml:space="preserve">Die </w:t>
-      </w:r>
-      <w:proofErr w:type="spellStart"/>
-      <w:r>
-        <w:t>MindMapping</w:t>
-      </w:r>
-      <w:proofErr w:type="spellEnd"/>
-      <w:r>
-        <w:t xml:space="preserve"> Methode eignet sich besonders gut für die </w:t>
+        <w:t xml:space="preserve">Die MindMapping Methode eignet sich besonders gut für die </w:t>
       </w:r>
       <w:r>
         <w:rPr>
@@ -15605,6 +15123,96 @@
     </w:lvl>
   </w:abstractNum>
   <w:abstractNum w:abstractNumId="8" w15:restartNumberingAfterBreak="0">
+    <w:nsid w:val="3AD36C6D"/>
+    <w:multiLevelType w:val="hybridMultilevel"/>
+    <w:tmpl w:val="04CEB4A4"/>
+    <w:lvl w:ilvl="0" w:tplc="8834B472">
+      <w:start w:val="1"/>
+      <w:numFmt w:val="decimal"/>
+      <w:pStyle w:val="berschrift1"/>
+      <w:lvlText w:val="%1."/>
+      <w:lvlJc w:val="left"/>
+      <w:pPr>
+        <w:ind w:left="720" w:hanging="360"/>
+      </w:pPr>
+      <w:rPr>
+        <w:rFonts w:hint="default"/>
+      </w:rPr>
+    </w:lvl>
+    <w:lvl w:ilvl="1" w:tplc="0C070019" w:tentative="1">
+      <w:start w:val="1"/>
+      <w:numFmt w:val="lowerLetter"/>
+      <w:lvlText w:val="%2."/>
+      <w:lvlJc w:val="left"/>
+      <w:pPr>
+        <w:ind w:left="1440" w:hanging="360"/>
+      </w:pPr>
+    </w:lvl>
+    <w:lvl w:ilvl="2" w:tplc="0C07001B" w:tentative="1">
+      <w:start w:val="1"/>
+      <w:numFmt w:val="lowerRoman"/>
+      <w:lvlText w:val="%3."/>
+      <w:lvlJc w:val="right"/>
+      <w:pPr>
+        <w:ind w:left="2160" w:hanging="180"/>
+      </w:pPr>
+    </w:lvl>
+    <w:lvl w:ilvl="3" w:tplc="0C07000F" w:tentative="1">
+      <w:start w:val="1"/>
+      <w:numFmt w:val="decimal"/>
+      <w:lvlText w:val="%4."/>
+      <w:lvlJc w:val="left"/>
+      <w:pPr>
+        <w:ind w:left="2880" w:hanging="360"/>
+      </w:pPr>
+    </w:lvl>
+    <w:lvl w:ilvl="4" w:tplc="0C070019" w:tentative="1">
+      <w:start w:val="1"/>
+      <w:numFmt w:val="lowerLetter"/>
+      <w:lvlText w:val="%5."/>
+      <w:lvlJc w:val="left"/>
+      <w:pPr>
+        <w:ind w:left="3600" w:hanging="360"/>
+      </w:pPr>
+    </w:lvl>
+    <w:lvl w:ilvl="5" w:tplc="0C07001B" w:tentative="1">
+      <w:start w:val="1"/>
+      <w:numFmt w:val="lowerRoman"/>
+      <w:lvlText w:val="%6."/>
+      <w:lvlJc w:val="right"/>
+      <w:pPr>
+        <w:ind w:left="4320" w:hanging="180"/>
+      </w:pPr>
+    </w:lvl>
+    <w:lvl w:ilvl="6" w:tplc="0C07000F" w:tentative="1">
+      <w:start w:val="1"/>
+      <w:numFmt w:val="decimal"/>
+      <w:lvlText w:val="%7."/>
+      <w:lvlJc w:val="left"/>
+      <w:pPr>
+        <w:ind w:left="5040" w:hanging="360"/>
+      </w:pPr>
+    </w:lvl>
+    <w:lvl w:ilvl="7" w:tplc="0C070019" w:tentative="1">
+      <w:start w:val="1"/>
+      <w:numFmt w:val="lowerLetter"/>
+      <w:lvlText w:val="%8."/>
+      <w:lvlJc w:val="left"/>
+      <w:pPr>
+        <w:ind w:left="5760" w:hanging="360"/>
+      </w:pPr>
+    </w:lvl>
+    <w:lvl w:ilvl="8" w:tplc="0C07001B" w:tentative="1">
+      <w:start w:val="1"/>
+      <w:numFmt w:val="lowerRoman"/>
+      <w:lvlText w:val="%9."/>
+      <w:lvlJc w:val="right"/>
+      <w:pPr>
+        <w:ind w:left="6480" w:hanging="180"/>
+      </w:pPr>
+    </w:lvl>
+  </w:abstractNum>
+  <w:abstractNum w:abstractNumId="9" w15:restartNumberingAfterBreak="0">
     <w:nsid w:val="44C15ABE"/>
     <w:multiLevelType w:val="hybridMultilevel"/>
     <w:tmpl w:val="E6F04B14"/>
@@ -15717,7 +15325,7 @@
       </w:rPr>
     </w:lvl>
   </w:abstractNum>
-  <w:abstractNum w:abstractNumId="9" w15:restartNumberingAfterBreak="0">
+  <w:abstractNum w:abstractNumId="10" w15:restartNumberingAfterBreak="0">
     <w:nsid w:val="47037B9E"/>
     <w:multiLevelType w:val="hybridMultilevel"/>
     <w:tmpl w:val="AC42E8FC"/>
@@ -15857,7 +15465,7 @@
       </w:rPr>
     </w:lvl>
   </w:abstractNum>
-  <w:abstractNum w:abstractNumId="10" w15:restartNumberingAfterBreak="0">
+  <w:abstractNum w:abstractNumId="11" w15:restartNumberingAfterBreak="0">
     <w:nsid w:val="545A516E"/>
     <w:multiLevelType w:val="hybridMultilevel"/>
     <w:tmpl w:val="81AAF816"/>
@@ -15970,7 +15578,7 @@
       </w:rPr>
     </w:lvl>
   </w:abstractNum>
-  <w:abstractNum w:abstractNumId="11" w15:restartNumberingAfterBreak="0">
+  <w:abstractNum w:abstractNumId="12" w15:restartNumberingAfterBreak="0">
     <w:nsid w:val="548E2464"/>
     <w:multiLevelType w:val="singleLevel"/>
     <w:tmpl w:val="04070011"/>
@@ -15987,14 +15595,13 @@
       </w:pPr>
     </w:lvl>
   </w:abstractNum>
-  <w:abstractNum w:abstractNumId="12" w15:restartNumberingAfterBreak="0">
+  <w:abstractNum w:abstractNumId="13" w15:restartNumberingAfterBreak="0">
     <w:nsid w:val="59FF4988"/>
     <w:multiLevelType w:val="multilevel"/>
     <w:tmpl w:val="FD345388"/>
     <w:lvl w:ilvl="0">
       <w:start w:val="1"/>
       <w:numFmt w:val="decimal"/>
-      <w:pStyle w:val="berschrift1"/>
       <w:lvlText w:val="%1"/>
       <w:lvlJc w:val="left"/>
       <w:pPr>
@@ -16082,7 +15689,7 @@
       </w:pPr>
     </w:lvl>
   </w:abstractNum>
-  <w:abstractNum w:abstractNumId="13" w15:restartNumberingAfterBreak="0">
+  <w:abstractNum w:abstractNumId="14" w15:restartNumberingAfterBreak="0">
     <w:nsid w:val="64A4391D"/>
     <w:multiLevelType w:val="hybridMultilevel"/>
     <w:tmpl w:val="B2B2D86C"/>
@@ -16195,7 +15802,7 @@
       </w:rPr>
     </w:lvl>
   </w:abstractNum>
-  <w:abstractNum w:abstractNumId="14" w15:restartNumberingAfterBreak="0">
+  <w:abstractNum w:abstractNumId="15" w15:restartNumberingAfterBreak="0">
     <w:nsid w:val="7197000B"/>
     <w:multiLevelType w:val="hybridMultilevel"/>
     <w:tmpl w:val="B170C862"/>
@@ -16308,7 +15915,7 @@
       </w:rPr>
     </w:lvl>
   </w:abstractNum>
-  <w:abstractNum w:abstractNumId="15" w15:restartNumberingAfterBreak="0">
+  <w:abstractNum w:abstractNumId="16" w15:restartNumberingAfterBreak="0">
     <w:nsid w:val="76FA199A"/>
     <w:multiLevelType w:val="hybridMultilevel"/>
     <w:tmpl w:val="EDB03844"/>
@@ -16448,7 +16055,7 @@
       </w:rPr>
     </w:lvl>
   </w:abstractNum>
-  <w:abstractNum w:abstractNumId="16" w15:restartNumberingAfterBreak="0">
+  <w:abstractNum w:abstractNumId="17" w15:restartNumberingAfterBreak="0">
     <w:nsid w:val="77D452D1"/>
     <w:multiLevelType w:val="hybridMultilevel"/>
     <w:tmpl w:val="E1AC3E4E"/>
@@ -16588,7 +16195,7 @@
       </w:rPr>
     </w:lvl>
   </w:abstractNum>
-  <w:abstractNum w:abstractNumId="17" w15:restartNumberingAfterBreak="0">
+  <w:abstractNum w:abstractNumId="18" w15:restartNumberingAfterBreak="0">
     <w:nsid w:val="7CA7708C"/>
     <w:multiLevelType w:val="hybridMultilevel"/>
     <w:tmpl w:val="30B4B602"/>
@@ -16677,7 +16284,7 @@
       </w:pPr>
     </w:lvl>
   </w:abstractNum>
-  <w:abstractNum w:abstractNumId="18" w15:restartNumberingAfterBreak="0">
+  <w:abstractNum w:abstractNumId="19" w15:restartNumberingAfterBreak="0">
     <w:nsid w:val="7EEC71AF"/>
     <w:multiLevelType w:val="singleLevel"/>
     <w:tmpl w:val="1F5081C8"/>
@@ -16698,7 +16305,7 @@
     </w:lvl>
   </w:abstractNum>
   <w:num w:numId="1" w16cid:durableId="726415684">
-    <w:abstractNumId w:val="16"/>
+    <w:abstractNumId w:val="17"/>
   </w:num>
   <w:num w:numId="2" w16cid:durableId="1595671529">
     <w:abstractNumId w:val="3"/>
@@ -16710,34 +16317,34 @@
     <w:abstractNumId w:val="1"/>
   </w:num>
   <w:num w:numId="5" w16cid:durableId="427504780">
-    <w:abstractNumId w:val="15"/>
+    <w:abstractNumId w:val="16"/>
   </w:num>
   <w:num w:numId="6" w16cid:durableId="1123957201">
     <w:abstractNumId w:val="2"/>
   </w:num>
   <w:num w:numId="7" w16cid:durableId="1048337715">
-    <w:abstractNumId w:val="9"/>
+    <w:abstractNumId w:val="10"/>
   </w:num>
   <w:num w:numId="8" w16cid:durableId="2133405103">
     <w:abstractNumId w:val="4"/>
   </w:num>
   <w:num w:numId="9" w16cid:durableId="946890929">
-    <w:abstractNumId w:val="12"/>
+    <w:abstractNumId w:val="13"/>
   </w:num>
   <w:num w:numId="10" w16cid:durableId="110055634">
+    <w:abstractNumId w:val="14"/>
+  </w:num>
+  <w:num w:numId="11" w16cid:durableId="323434499">
+    <w:abstractNumId w:val="15"/>
+  </w:num>
+  <w:num w:numId="12" w16cid:durableId="910820448">
     <w:abstractNumId w:val="13"/>
   </w:num>
-  <w:num w:numId="11" w16cid:durableId="323434499">
-    <w:abstractNumId w:val="14"/>
-  </w:num>
-  <w:num w:numId="12" w16cid:durableId="910820448">
-    <w:abstractNumId w:val="12"/>
-  </w:num>
   <w:num w:numId="13" w16cid:durableId="115373554">
-    <w:abstractNumId w:val="8"/>
+    <w:abstractNumId w:val="9"/>
   </w:num>
   <w:num w:numId="14" w16cid:durableId="7610090">
-    <w:abstractNumId w:val="12"/>
+    <w:abstractNumId w:val="13"/>
   </w:num>
   <w:num w:numId="15" w16cid:durableId="316300785">
     <w:abstractNumId w:val="5"/>
@@ -16764,19 +16371,26 @@
     </w:lvlOverride>
   </w:num>
   <w:num w:numId="18" w16cid:durableId="1304582420">
-    <w:abstractNumId w:val="18"/>
+    <w:abstractNumId w:val="19"/>
   </w:num>
   <w:num w:numId="19" w16cid:durableId="831340055">
+    <w:abstractNumId w:val="12"/>
+  </w:num>
+  <w:num w:numId="20" w16cid:durableId="1912614950">
     <w:abstractNumId w:val="11"/>
   </w:num>
-  <w:num w:numId="20" w16cid:durableId="1912614950">
-    <w:abstractNumId w:val="10"/>
-  </w:num>
   <w:num w:numId="21" w16cid:durableId="1967658939">
-    <w:abstractNumId w:val="17"/>
+    <w:abstractNumId w:val="18"/>
   </w:num>
   <w:num w:numId="22" w16cid:durableId="1619995558">
     <w:abstractNumId w:val="7"/>
+  </w:num>
+  <w:num w:numId="23" w16cid:durableId="1493568029">
+    <w:abstractNumId w:val="8"/>
+  </w:num>
+  <w:num w:numId="24" w16cid:durableId="522744494">
+    <w:abstractNumId w:val="8"/>
+    <w:lvlOverride w:ilvl="0"/>
   </w:num>
 </w:numbering>
 </file>
@@ -17186,13 +16800,14 @@
     <w:next w:val="Standard"/>
     <w:autoRedefine/>
     <w:qFormat/>
-    <w:rsid w:val="00F46E05"/>
+    <w:rsid w:val="00C320C0"/>
     <w:pPr>
       <w:keepNext/>
       <w:numPr>
-        <w:numId w:val="9"/>
+        <w:numId w:val="23"/>
       </w:numPr>
       <w:spacing w:after="360"/>
+      <w:ind w:left="426"/>
       <w:outlineLvl w:val="0"/>
     </w:pPr>
     <w:rPr>

</xml_diff>

<commit_message>
[FIX] Fixed issue in Notes (FileView). Deleting selected elements through fileTree resulted in shoing wrong infomessage in FileView.
</commit_message>
<xml_diff>
--- a/0_Documents/Projekthandbuch.docx
+++ b/0_Documents/Projekthandbuch.docx
@@ -183,7 +183,6 @@
         </w:rPr>
         <w:tab/>
       </w:r>
-      <w:proofErr w:type="spellStart"/>
       <w:r>
         <w:rPr>
           <w:b/>
@@ -193,7 +192,6 @@
         </w:rPr>
         <w:t>Lumify</w:t>
       </w:r>
-      <w:proofErr w:type="spellEnd"/>
     </w:p>
     <w:p>
       <w:pPr>
@@ -1846,11 +1844,9 @@
               </w:numPr>
               <w:spacing w:before="60" w:after="60"/>
             </w:pPr>
-            <w:proofErr w:type="spellStart"/>
             <w:r>
               <w:t>Friendship</w:t>
             </w:r>
-            <w:proofErr w:type="spellEnd"/>
             <w:r>
               <w:t>-</w:t>
             </w:r>
@@ -1924,11 +1920,9 @@
               </w:numPr>
               <w:spacing w:before="60" w:after="60"/>
             </w:pPr>
-            <w:proofErr w:type="spellStart"/>
             <w:r>
               <w:t>Friendship</w:t>
             </w:r>
-            <w:proofErr w:type="spellEnd"/>
             <w:r>
               <w:t>-</w:t>
             </w:r>
@@ -2003,15 +1997,7 @@
             </w:r>
             <w:r>
               <w:br/>
-              <w:t xml:space="preserve">Hooks zu den Hubs im Frontend implementiert. </w:t>
-            </w:r>
-            <w:proofErr w:type="spellStart"/>
-            <w:r>
-              <w:t>ChatController</w:t>
-            </w:r>
-            <w:proofErr w:type="spellEnd"/>
-            <w:r>
-              <w:t xml:space="preserve"> implementiert.</w:t>
+              <w:t>Hooks zu den Hubs im Frontend implementiert. ChatController implementiert.</w:t>
             </w:r>
           </w:p>
         </w:tc>
@@ -2078,14 +2064,7 @@
             </w:r>
             <w:r>
               <w:br/>
-            </w:r>
-            <w:proofErr w:type="spellStart"/>
-            <w:r>
-              <w:t>WorkspaceController</w:t>
-            </w:r>
-            <w:proofErr w:type="spellEnd"/>
-            <w:r>
-              <w:t xml:space="preserve"> erstellt und Endpoints implementiert.</w:t>
+              <w:t>WorkspaceController erstellt und Endpoints implementiert.</w:t>
             </w:r>
           </w:p>
         </w:tc>
@@ -2159,11 +2138,9 @@
               <w:spacing w:before="60" w:after="60"/>
               <w:ind w:left="369"/>
             </w:pPr>
-            <w:proofErr w:type="spellStart"/>
             <w:r>
               <w:t>AccountModal</w:t>
             </w:r>
-            <w:proofErr w:type="spellEnd"/>
             <w:r>
               <w:t>-</w:t>
             </w:r>
@@ -2182,15 +2159,7 @@
               <w:ind w:left="369"/>
             </w:pPr>
             <w:r>
-              <w:t xml:space="preserve">Shell für Komponente </w:t>
-            </w:r>
-            <w:proofErr w:type="spellStart"/>
-            <w:r>
-              <w:t>AccountModal</w:t>
-            </w:r>
-            <w:proofErr w:type="spellEnd"/>
-            <w:r>
-              <w:t xml:space="preserve"> erstellt.</w:t>
+              <w:t>Shell für Komponente AccountModal erstellt.</w:t>
             </w:r>
           </w:p>
           <w:p>
@@ -2314,13 +2283,8 @@
               <w:spacing w:before="60" w:after="60"/>
               <w:ind w:left="369"/>
             </w:pPr>
-            <w:proofErr w:type="spellStart"/>
-            <w:r>
-              <w:t>AccountModal</w:t>
-            </w:r>
-            <w:proofErr w:type="spellEnd"/>
-            <w:r>
-              <w:t>-Komponente erstellt.</w:t>
+            <w:r>
+              <w:t>AccountModal-Komponente erstellt.</w:t>
             </w:r>
           </w:p>
           <w:p>
@@ -2416,11 +2380,9 @@
               <w:spacing w:before="60" w:after="60"/>
               <w:ind w:left="369"/>
             </w:pPr>
-            <w:proofErr w:type="spellStart"/>
             <w:r>
               <w:t>Recents</w:t>
             </w:r>
-            <w:proofErr w:type="spellEnd"/>
             <w:r>
               <w:t>-</w:t>
             </w:r>
@@ -2638,11 +2600,9 @@
             <w:r>
               <w:t>„</w:t>
             </w:r>
-            <w:proofErr w:type="spellStart"/>
             <w:r>
               <w:t>TodoBoard</w:t>
             </w:r>
-            <w:proofErr w:type="spellEnd"/>
             <w:r>
               <w:t>“ implementiert</w:t>
             </w:r>
@@ -2653,16 +2613,11 @@
               <w:t>ü</w:t>
             </w:r>
             <w:r>
-              <w:t xml:space="preserve">r </w:t>
-            </w:r>
-            <w:proofErr w:type="spellStart"/>
-            <w:r>
-              <w:t>Todo</w:t>
+              <w:t>r Todo</w:t>
             </w:r>
             <w:r>
               <w:t>listen</w:t>
             </w:r>
-            <w:proofErr w:type="spellEnd"/>
             <w:r>
               <w:t>.</w:t>
             </w:r>
@@ -3017,61 +2972,11 @@
               <w:spacing w:before="60" w:after="60"/>
               <w:ind w:left="369"/>
             </w:pPr>
-            <w:proofErr w:type="spellStart"/>
-            <w:r>
-              <w:t>Configured</w:t>
-            </w:r>
-            <w:proofErr w:type="spellEnd"/>
-            <w:r>
-              <w:t xml:space="preserve"> </w:t>
-            </w:r>
-            <w:proofErr w:type="spellStart"/>
-            <w:r>
-              <w:t>behaviour</w:t>
-            </w:r>
-            <w:proofErr w:type="spellEnd"/>
-            <w:r>
-              <w:t xml:space="preserve"> of </w:t>
-            </w:r>
-            <w:proofErr w:type="spellStart"/>
-            <w:r>
-              <w:t>clicks</w:t>
-            </w:r>
-            <w:proofErr w:type="spellEnd"/>
-            <w:r>
-              <w:t xml:space="preserve"> (</w:t>
-            </w:r>
-            <w:proofErr w:type="spellStart"/>
-            <w:r>
-              <w:t>To</w:t>
-            </w:r>
-            <w:proofErr w:type="spellEnd"/>
-            <w:r>
-              <w:t xml:space="preserve"> fit </w:t>
-            </w:r>
-            <w:proofErr w:type="spellStart"/>
-            <w:r>
-              <w:t>known</w:t>
-            </w:r>
-            <w:proofErr w:type="spellEnd"/>
-            <w:r>
-              <w:t xml:space="preserve"> </w:t>
-            </w:r>
-            <w:proofErr w:type="spellStart"/>
-            <w:r>
-              <w:t>behaviour</w:t>
-            </w:r>
-            <w:proofErr w:type="spellEnd"/>
-            <w:r>
-              <w:t xml:space="preserve"> of </w:t>
-            </w:r>
-            <w:proofErr w:type="spellStart"/>
-            <w:r>
-              <w:t>standard</w:t>
-            </w:r>
-            <w:proofErr w:type="spellEnd"/>
-            <w:r>
-              <w:t xml:space="preserve"> Windows-Explorer)</w:t>
+            <w:r>
+              <w:t>Verhalten der Klicks verbessert</w:t>
+            </w:r>
+            <w:r>
+              <w:t xml:space="preserve"> (To fit known behaviour of standard Windows-Explorer)</w:t>
             </w:r>
           </w:p>
           <w:p>
@@ -3104,15 +3009,7 @@
               <w:t>,</w:t>
             </w:r>
             <w:r>
-              <w:t xml:space="preserve"> wenn kein </w:t>
-            </w:r>
-            <w:proofErr w:type="spellStart"/>
-            <w:r>
-              <w:t>expand</w:t>
-            </w:r>
-            <w:proofErr w:type="spellEnd"/>
-            <w:r>
-              <w:t xml:space="preserve"> im TreeView möglich ist (Kein Ordnerinhalt)</w:t>
+              <w:t xml:space="preserve"> wenn kein expand im TreeView möglich ist (Kein Ordnerinhalt)</w:t>
             </w:r>
           </w:p>
           <w:p>
@@ -3224,7 +3121,168 @@
           </w:p>
         </w:tc>
       </w:tr>
+      <w:tr>
+        <w:tc>
+          <w:tcPr>
+            <w:tcW w:w="1389" w:type="dxa"/>
+          </w:tcPr>
+          <w:p>
+            <w:pPr>
+              <w:spacing w:before="60" w:after="60"/>
+              <w:jc w:val="center"/>
+            </w:pPr>
+            <w:r>
+              <w:t>0.2.1</w:t>
+            </w:r>
+          </w:p>
+        </w:tc>
+        <w:tc>
+          <w:tcPr>
+            <w:tcW w:w="1392" w:type="dxa"/>
+          </w:tcPr>
+          <w:p>
+            <w:pPr>
+              <w:spacing w:before="60" w:after="60"/>
+              <w:jc w:val="center"/>
+            </w:pPr>
+            <w:r>
+              <w:t>17.06.2026</w:t>
+            </w:r>
+          </w:p>
+        </w:tc>
+        <w:tc>
+          <w:tcPr>
+            <w:tcW w:w="4852" w:type="dxa"/>
+          </w:tcPr>
+          <w:p>
+            <w:pPr>
+              <w:pStyle w:val="Listenabsatz"/>
+              <w:numPr>
+                <w:ilvl w:val="0"/>
+                <w:numId w:val="25"/>
+              </w:numPr>
+              <w:spacing w:before="60" w:after="60"/>
+              <w:ind w:left="369"/>
+            </w:pPr>
+            <w:r>
+              <w:t>Testprojekt</w:t>
+            </w:r>
+            <w:r>
+              <w:t xml:space="preserve"> f</w:t>
+            </w:r>
+            <w:r>
+              <w:t>ü</w:t>
+            </w:r>
+            <w:r>
+              <w:t>r unit-tests</w:t>
+            </w:r>
+            <w:r>
+              <w:t xml:space="preserve"> erstellt.</w:t>
+            </w:r>
+          </w:p>
+          <w:p>
+            <w:pPr>
+              <w:pStyle w:val="Listenabsatz"/>
+              <w:numPr>
+                <w:ilvl w:val="0"/>
+                <w:numId w:val="25"/>
+              </w:numPr>
+              <w:spacing w:before="60" w:after="60"/>
+              <w:ind w:left="369"/>
+            </w:pPr>
+            <w:r>
+              <w:t>Unit</w:t>
+            </w:r>
+            <w:r>
+              <w:t>-tests f</w:t>
+            </w:r>
+            <w:r>
+              <w:t>ü</w:t>
+            </w:r>
+            <w:r>
+              <w:t>r TodoList</w:t>
+            </w:r>
+            <w:r>
+              <w:t>s</w:t>
+            </w:r>
+            <w:r>
+              <w:t xml:space="preserve">Controller </w:t>
+            </w:r>
+            <w:r>
+              <w:t xml:space="preserve">und </w:t>
+            </w:r>
+            <w:r>
+              <w:t xml:space="preserve"> NotesController</w:t>
+            </w:r>
+            <w:r>
+              <w:t xml:space="preserve"> implementiert.</w:t>
+            </w:r>
+          </w:p>
+          <w:p>
+            <w:pPr>
+              <w:spacing w:before="60" w:after="60"/>
+            </w:pPr>
+          </w:p>
+          <w:p>
+            <w:pPr>
+              <w:spacing w:before="60" w:after="60"/>
+            </w:pPr>
+            <w:r>
+              <w:t>Fixes:</w:t>
+            </w:r>
+          </w:p>
+          <w:p>
+            <w:pPr>
+              <w:pStyle w:val="Listenabsatz"/>
+              <w:numPr>
+                <w:ilvl w:val="0"/>
+                <w:numId w:val="38"/>
+              </w:numPr>
+              <w:spacing w:before="60" w:after="60"/>
+              <w:ind w:left="369"/>
+            </w:pPr>
+            <w:r>
+              <w:t>Weitere Fixes am FriendsPanel. -&gt; Freund annehmen oder ablehnen refresht nun auch die NotificationBubble</w:t>
+            </w:r>
+          </w:p>
+          <w:p>
+            <w:pPr>
+              <w:pStyle w:val="Listenabsatz"/>
+              <w:numPr>
+                <w:ilvl w:val="0"/>
+                <w:numId w:val="38"/>
+              </w:numPr>
+              <w:spacing w:before="60" w:after="60"/>
+              <w:ind w:left="369"/>
+            </w:pPr>
+            <w:r>
+              <w:t>Fixed blur not showing on WorkspaceCard.</w:t>
+            </w:r>
+          </w:p>
+        </w:tc>
+        <w:tc>
+          <w:tcPr>
+            <w:tcW w:w="1427" w:type="dxa"/>
+          </w:tcPr>
+          <w:p>
+            <w:pPr>
+              <w:spacing w:before="60" w:after="60"/>
+              <w:jc w:val="center"/>
+            </w:pPr>
+            <w:r>
+              <w:t>Christian Riepl</w:t>
+            </w:r>
+          </w:p>
+        </w:tc>
+      </w:tr>
     </w:tbl>
+    <w:p/>
+    <w:p/>
+    <w:p/>
+    <w:p/>
+    <w:p/>
+    <w:p/>
+    <w:p/>
     <w:p/>
     <w:p/>
     <w:p/>
@@ -5188,29 +5246,7 @@
                 <w:szCs w:val="21"/>
                 <w:shd w:val="clear" w:color="auto" w:fill="FFFFFF"/>
               </w:rPr>
-              <w:t xml:space="preserve">Auf dieses fehlende Tool baut </w:t>
-            </w:r>
-            <w:proofErr w:type="spellStart"/>
-            <w:r>
-              <w:rPr>
-                <w:rFonts w:cs="Arial"/>
-                <w:i/>
-                <w:color w:val="3C3C3C"/>
-                <w:szCs w:val="21"/>
-                <w:shd w:val="clear" w:color="auto" w:fill="FFFFFF"/>
-              </w:rPr>
-              <w:t>Lumify</w:t>
-            </w:r>
-            <w:proofErr w:type="spellEnd"/>
-            <w:r>
-              <w:rPr>
-                <w:rFonts w:cs="Arial"/>
-                <w:i/>
-                <w:color w:val="3C3C3C"/>
-                <w:szCs w:val="21"/>
-                <w:shd w:val="clear" w:color="auto" w:fill="FFFFFF"/>
-              </w:rPr>
-              <w:t xml:space="preserve"> auf. Es soll diese Lücke füllen</w:t>
+              <w:t>Auf dieses fehlende Tool baut Lumify auf. Es soll diese Lücke füllen</w:t>
             </w:r>
           </w:p>
         </w:tc>
@@ -5324,19 +5360,9 @@
               </w:numPr>
               <w:spacing w:before="60" w:after="60"/>
             </w:pPr>
-            <w:proofErr w:type="gramStart"/>
-            <w:r>
-              <w:t>Keine Ahnung</w:t>
-            </w:r>
-            <w:proofErr w:type="gramEnd"/>
-            <w:r>
-              <w:t xml:space="preserve"> was ich hier </w:t>
-            </w:r>
-            <w:proofErr w:type="gramStart"/>
-            <w:r>
-              <w:t>schreiben sollte</w:t>
-            </w:r>
-            <w:proofErr w:type="gramEnd"/>
+            <w:r>
+              <w:t>Keine Ahnung was ich hier schreiben sollte</w:t>
+            </w:r>
           </w:p>
         </w:tc>
         <w:tc>
@@ -5980,19 +6006,9 @@
               </w:numPr>
               <w:spacing w:before="60" w:after="60"/>
             </w:pPr>
-            <w:proofErr w:type="gramStart"/>
-            <w:r>
-              <w:t>Will</w:t>
-            </w:r>
-            <w:proofErr w:type="gramEnd"/>
-            <w:r>
-              <w:t xml:space="preserve"> dass ich das Projekt </w:t>
-            </w:r>
-            <w:proofErr w:type="gramStart"/>
-            <w:r>
-              <w:t>mache</w:t>
-            </w:r>
-            <w:proofErr w:type="gramEnd"/>
+            <w:r>
+              <w:t>Will dass ich das Projekt mache</w:t>
+            </w:r>
           </w:p>
         </w:tc>
         <w:tc>
@@ -6004,13 +6020,8 @@
               <w:spacing w:before="60" w:after="60"/>
               <w:jc w:val="center"/>
             </w:pPr>
-            <w:proofErr w:type="spellStart"/>
-            <w:r>
-              <w:t>Landesberufschule</w:t>
-            </w:r>
-            <w:proofErr w:type="spellEnd"/>
-            <w:r>
-              <w:t xml:space="preserve"> 4</w:t>
+            <w:r>
+              <w:t>Landesberufschule 4</w:t>
             </w:r>
           </w:p>
         </w:tc>
@@ -6649,23 +6660,13 @@
                                   <w:szCs w:val="20"/>
                                 </w:rPr>
                               </w:pPr>
-                              <w:proofErr w:type="spellStart"/>
                               <w:r>
                                 <w:rPr>
                                   <w:rFonts w:cs="Arial"/>
                                   <w:color w:val="000000"/>
                                   <w:szCs w:val="20"/>
                                 </w:rPr>
-                                <w:t>Landesberufschule</w:t>
-                              </w:r>
-                              <w:proofErr w:type="spellEnd"/>
-                              <w:r>
-                                <w:rPr>
-                                  <w:rFonts w:cs="Arial"/>
-                                  <w:color w:val="000000"/>
-                                  <w:szCs w:val="20"/>
-                                </w:rPr>
-                                <w:t xml:space="preserve"> 4 </w:t>
+                                <w:t xml:space="preserve">Landesberufschule 4 </w:t>
                               </w:r>
                             </w:p>
                           </w:txbxContent>
@@ -6971,23 +6972,13 @@
                             <w:szCs w:val="20"/>
                           </w:rPr>
                         </w:pPr>
-                        <w:proofErr w:type="spellStart"/>
                         <w:r>
                           <w:rPr>
                             <w:rFonts w:cs="Arial"/>
                             <w:color w:val="000000"/>
                             <w:szCs w:val="20"/>
                           </w:rPr>
-                          <w:t>Landesberufschule</w:t>
-                        </w:r>
-                        <w:proofErr w:type="spellEnd"/>
-                        <w:r>
-                          <w:rPr>
-                            <w:rFonts w:cs="Arial"/>
-                            <w:color w:val="000000"/>
-                            <w:szCs w:val="20"/>
-                          </w:rPr>
-                          <w:t xml:space="preserve"> 4 </w:t>
+                          <w:t xml:space="preserve">Landesberufschule 4 </w:t>
                         </w:r>
                       </w:p>
                     </w:txbxContent>
@@ -7177,16 +7168,8 @@
               <w:rPr>
                 <w:b/>
               </w:rPr>
-              <w:t xml:space="preserve"> </w:t>
-            </w:r>
-            <w:proofErr w:type="spellStart"/>
-            <w:r>
-              <w:rPr>
-                <w:b/>
-              </w:rPr>
-              <w:t>Lumify</w:t>
-            </w:r>
-            <w:proofErr w:type="spellEnd"/>
+              <w:t xml:space="preserve"> Lumify</w:t>
+            </w:r>
           </w:p>
         </w:tc>
         <w:tc>
@@ -7370,13 +7353,8 @@
             <w:r>
               <w:t xml:space="preserve">: </w:t>
             </w:r>
-            <w:proofErr w:type="spellStart"/>
-            <w:r>
-              <w:t>Landesberufschule</w:t>
-            </w:r>
-            <w:proofErr w:type="spellEnd"/>
-            <w:r>
-              <w:t xml:space="preserve"> 4</w:t>
+            <w:r>
+              <w:t>Landesberufschule 4</w:t>
             </w:r>
           </w:p>
         </w:tc>
@@ -7558,29 +7536,7 @@
                 <w:szCs w:val="21"/>
                 <w:shd w:val="clear" w:color="auto" w:fill="FFFFFF"/>
               </w:rPr>
-              <w:t xml:space="preserve">Auf dieses fehlende Tool baut </w:t>
-            </w:r>
-            <w:proofErr w:type="spellStart"/>
-            <w:r>
-              <w:rPr>
-                <w:rFonts w:cs="Arial"/>
-                <w:i/>
-                <w:color w:val="3C3C3C"/>
-                <w:szCs w:val="21"/>
-                <w:shd w:val="clear" w:color="auto" w:fill="FFFFFF"/>
-              </w:rPr>
-              <w:t>Lumify</w:t>
-            </w:r>
-            <w:proofErr w:type="spellEnd"/>
-            <w:r>
-              <w:rPr>
-                <w:rFonts w:cs="Arial"/>
-                <w:i/>
-                <w:color w:val="3C3C3C"/>
-                <w:szCs w:val="21"/>
-                <w:shd w:val="clear" w:color="auto" w:fill="FFFFFF"/>
-              </w:rPr>
-              <w:t xml:space="preserve"> auf. Es soll diese Lücke füllen</w:t>
+              <w:t>Auf dieses fehlende Tool baut Lumify auf. Es soll diese Lücke füllen</w:t>
             </w:r>
           </w:p>
         </w:tc>
@@ -8077,13 +8033,8 @@
             </w:pPr>
             <w:r>
               <w:lastRenderedPageBreak/>
-              <w:t xml:space="preserve">Frontendbasis schaffen mit Authentication, </w:t>
-            </w:r>
-            <w:proofErr w:type="spellStart"/>
-            <w:r>
-              <w:t>Friendship</w:t>
-            </w:r>
-            <w:proofErr w:type="spellEnd"/>
+              <w:t>Frontendbasis schaffen mit Authentication, Friendship</w:t>
+            </w:r>
             <w:r>
               <w:t>-</w:t>
             </w:r>
@@ -8548,15 +8499,7 @@
               </w:rPr>
             </w:pPr>
             <w:r>
-              <w:t xml:space="preserve">Fortlaufendes Server-Hosting für </w:t>
-            </w:r>
-            <w:proofErr w:type="spellStart"/>
-            <w:r>
-              <w:t>WebApp</w:t>
-            </w:r>
-            <w:proofErr w:type="spellEnd"/>
-            <w:r>
-              <w:t>, Datenbank und Domain</w:t>
+              <w:t>Fortlaufendes Server-Hosting für WebApp, Datenbank und Domain</w:t>
             </w:r>
           </w:p>
         </w:tc>
@@ -9179,13 +9122,8 @@
             <w:pPr>
               <w:spacing w:before="60" w:after="60"/>
             </w:pPr>
-            <w:proofErr w:type="gramStart"/>
-            <w:r>
-              <w:t>AP Inhalte</w:t>
-            </w:r>
-            <w:proofErr w:type="gramEnd"/>
-            <w:r>
-              <w:t xml:space="preserve"> / Ergebnisse:</w:t>
+            <w:r>
+              <w:t>AP Inhalte / Ergebnisse:</w:t>
             </w:r>
           </w:p>
         </w:tc>
@@ -9427,13 +9365,8 @@
             <w:pPr>
               <w:spacing w:before="60" w:after="60"/>
             </w:pPr>
-            <w:proofErr w:type="gramStart"/>
-            <w:r>
-              <w:t>AP Inhalte</w:t>
-            </w:r>
-            <w:proofErr w:type="gramEnd"/>
-            <w:r>
-              <w:t xml:space="preserve"> / Ergebnisse:</w:t>
+            <w:r>
+              <w:t>AP Inhalte / Ergebnisse:</w:t>
             </w:r>
           </w:p>
         </w:tc>
@@ -9481,13 +9414,8 @@
               <w:spacing w:before="60" w:after="60"/>
             </w:pPr>
             <w:r>
-              <w:t>Umsetzung von Authentifizierung mittels JWT/Https-</w:t>
-            </w:r>
-            <w:proofErr w:type="spellStart"/>
-            <w:r>
-              <w:t>only</w:t>
-            </w:r>
-            <w:proofErr w:type="spellEnd"/>
+              <w:t>Umsetzung von Authentifizierung mittels JWT/Https-only</w:t>
+            </w:r>
           </w:p>
           <w:p>
             <w:pPr>
@@ -9751,13 +9679,8 @@
             <w:pPr>
               <w:spacing w:before="60" w:after="60"/>
             </w:pPr>
-            <w:proofErr w:type="gramStart"/>
-            <w:r>
-              <w:t>AP Inhalte</w:t>
-            </w:r>
-            <w:proofErr w:type="gramEnd"/>
-            <w:r>
-              <w:t xml:space="preserve"> / Ergebnisse:</w:t>
+            <w:r>
+              <w:t>AP Inhalte / Ergebnisse:</w:t>
             </w:r>
           </w:p>
         </w:tc>
@@ -9798,15 +9721,7 @@
               <w:spacing w:before="60" w:after="60"/>
             </w:pPr>
             <w:r>
-              <w:t xml:space="preserve">Tests zu Hubs und Hooks können erst sicher getestet werden, wenn ein Feature im Frontend gebaut </w:t>
-            </w:r>
-            <w:proofErr w:type="gramStart"/>
-            <w:r>
-              <w:t>ist</w:t>
-            </w:r>
-            <w:proofErr w:type="gramEnd"/>
-            <w:r>
-              <w:t xml:space="preserve"> </w:t>
+              <w:t xml:space="preserve">Tests zu Hubs und Hooks können erst sicher getestet werden, wenn ein Feature im Frontend gebaut ist </w:t>
             </w:r>
           </w:p>
         </w:tc>
@@ -11375,19 +11290,8 @@
                 <w:bCs/>
                 <w:sz w:val="18"/>
               </w:rPr>
-              <w:t xml:space="preserve"> </w:t>
-            </w:r>
-            <w:proofErr w:type="spellStart"/>
-            <w:r>
-              <w:rPr>
-                <w:rFonts w:ascii="Tahoma" w:hAnsi="Tahoma" w:cs="Tahoma"/>
-                <w:b/>
-                <w:bCs/>
-                <w:sz w:val="18"/>
-              </w:rPr>
-              <w:t>Lumify</w:t>
-            </w:r>
-            <w:proofErr w:type="spellEnd"/>
+              <w:t xml:space="preserve"> Lumify</w:t>
+            </w:r>
           </w:p>
           <w:p>
             <w:pPr>
@@ -12154,7 +12058,6 @@
                 <w:sz w:val="18"/>
               </w:rPr>
             </w:pPr>
-            <w:proofErr w:type="spellStart"/>
             <w:r>
               <w:rPr>
                 <w:rFonts w:ascii="Tahoma" w:hAnsi="Tahoma" w:cs="Tahoma"/>
@@ -12163,18 +12066,7 @@
                 <w:color w:val="70AD47" w:themeColor="accent6"/>
                 <w:sz w:val="18"/>
               </w:rPr>
-              <w:t>FrontendServices</w:t>
-            </w:r>
-            <w:proofErr w:type="spellEnd"/>
-            <w:r>
-              <w:rPr>
-                <w:rFonts w:ascii="Tahoma" w:hAnsi="Tahoma" w:cs="Tahoma"/>
-                <w:b/>
-                <w:bCs/>
-                <w:color w:val="70AD47" w:themeColor="accent6"/>
-                <w:sz w:val="18"/>
-              </w:rPr>
-              <w:t xml:space="preserve"> wurden aufgebaut und an die Authentication angepasst.</w:t>
+              <w:t>FrontendServices wurden aufgebaut und an die Authentication angepasst.</w:t>
             </w:r>
           </w:p>
           <w:p>
@@ -12201,29 +12093,7 @@
                 <w:color w:val="70AD47" w:themeColor="accent6"/>
                 <w:sz w:val="18"/>
               </w:rPr>
-              <w:t xml:space="preserve">Tests zu Hooks und Hubs konnten erfolgreich getestet werden. Eine </w:t>
-            </w:r>
-            <w:proofErr w:type="spellStart"/>
-            <w:r>
-              <w:rPr>
-                <w:rFonts w:ascii="Tahoma" w:hAnsi="Tahoma" w:cs="Tahoma"/>
-                <w:b/>
-                <w:bCs/>
-                <w:color w:val="70AD47" w:themeColor="accent6"/>
-                <w:sz w:val="18"/>
-              </w:rPr>
-              <w:t>Race-Condition</w:t>
-            </w:r>
-            <w:proofErr w:type="spellEnd"/>
-            <w:r>
-              <w:rPr>
-                <w:rFonts w:ascii="Tahoma" w:hAnsi="Tahoma" w:cs="Tahoma"/>
-                <w:b/>
-                <w:bCs/>
-                <w:color w:val="70AD47" w:themeColor="accent6"/>
-                <w:sz w:val="18"/>
-              </w:rPr>
-              <w:t xml:space="preserve"> musste ausgebessert werden. Hubs laufen nun korrekt und funktionieren.</w:t>
+              <w:t>Tests zu Hooks und Hubs konnten erfolgreich getestet werden. Eine Race-Condition musste ausgebessert werden. Hubs laufen nun korrekt und funktionieren.</w:t>
             </w:r>
           </w:p>
           <w:p>
@@ -13680,23 +13550,13 @@
                 <w:lang w:val="en-GB"/>
               </w:rPr>
             </w:pPr>
-            <w:proofErr w:type="spellStart"/>
             <w:r>
               <w:rPr>
                 <w:b/>
                 <w:bCs/>
                 <w:lang w:val="en-GB"/>
               </w:rPr>
-              <w:t>Teamarbeit</w:t>
-            </w:r>
-            <w:proofErr w:type="spellEnd"/>
-            <w:r>
-              <w:rPr>
-                <w:b/>
-                <w:bCs/>
-                <w:lang w:val="en-GB"/>
-              </w:rPr>
-              <w:t>:</w:t>
+              <w:t>Teamarbeit:</w:t>
             </w:r>
           </w:p>
           <w:p>
@@ -13956,25 +13816,7 @@
                 <w:bCs/>
                 <w:lang w:val="de-AT"/>
               </w:rPr>
-              <w:t xml:space="preserve"> Lernerfahrungen („</w:t>
-            </w:r>
-            <w:proofErr w:type="spellStart"/>
-            <w:r>
-              <w:rPr>
-                <w:b/>
-                <w:bCs/>
-                <w:lang w:val="de-AT"/>
-              </w:rPr>
-              <w:t>Learnings</w:t>
-            </w:r>
-            <w:proofErr w:type="spellEnd"/>
-            <w:r>
-              <w:rPr>
-                <w:b/>
-                <w:bCs/>
-                <w:lang w:val="de-AT"/>
-              </w:rPr>
-              <w:t>“):</w:t>
+              <w:t xml:space="preserve"> Lernerfahrungen („Learnings“):</w:t>
             </w:r>
           </w:p>
           <w:p>
@@ -14715,7 +14557,7 @@
         <w:noProof/>
         <w:sz w:val="16"/>
       </w:rPr>
-      <w:t>11.06.2026</w:t>
+      <w:t>17.06.2026</w:t>
     </w:r>
     <w:r>
       <w:rPr>
@@ -14815,15 +14657,7 @@
       </w:r>
       <w:r>
         <w:tab/>
-        <w:t xml:space="preserve">Beispiel </w:t>
-      </w:r>
-      <w:proofErr w:type="spellStart"/>
-      <w:r>
-        <w:t>Versionierungs</w:t>
-      </w:r>
-      <w:proofErr w:type="spellEnd"/>
-      <w:r>
-        <w:t>-Systematik: Arbeitsversionen 0.1, 0.2 etc. | Hauptversionen 1.0, 2.0 etc.</w:t>
+        <w:t>Beispiel Versionierungs-Systematik: Arbeitsversionen 0.1, 0.2 etc. | Hauptversionen 1.0, 2.0 etc.</w:t>
       </w:r>
     </w:p>
   </w:footnote>
@@ -14843,15 +14677,7 @@
       </w:r>
       <w:r>
         <w:tab/>
-        <w:t xml:space="preserve">Die </w:t>
-      </w:r>
-      <w:proofErr w:type="spellStart"/>
-      <w:r>
-        <w:t>MindMapping</w:t>
-      </w:r>
-      <w:proofErr w:type="spellEnd"/>
-      <w:r>
-        <w:t xml:space="preserve"> Methode eignet sich besonders gut für die </w:t>
+        <w:t xml:space="preserve">Die MindMapping Methode eignet sich besonders gut für die </w:t>
       </w:r>
       <w:r>
         <w:rPr>
@@ -14860,15 +14686,7 @@
         <w:t xml:space="preserve">systematische, intensive und umfassende Auseinandersetzung </w:t>
       </w:r>
       <w:r>
-        <w:t xml:space="preserve">mit dem zeitlichen, sachlichen und sozialen Projektkontext sowie der zu Grunde liegenden Ausgangssituation / Problemstellung beim Kunden. Kostenlose Tools sind beispielsweise XMind oder </w:t>
-      </w:r>
-      <w:proofErr w:type="spellStart"/>
-      <w:r>
-        <w:t>Freemind</w:t>
-      </w:r>
-      <w:proofErr w:type="spellEnd"/>
-      <w:r>
-        <w:t xml:space="preserve">. </w:t>
+        <w:t xml:space="preserve">mit dem zeitlichen, sachlichen und sozialen Projektkontext sowie der zu Grunde liegenden Ausgangssituation / Problemstellung beim Kunden. Kostenlose Tools sind beispielsweise XMind oder Freemind. </w:t>
       </w:r>
     </w:p>
   </w:footnote>
@@ -14936,15 +14754,7 @@
       </w:r>
       <w:r>
         <w:tab/>
-        <w:t xml:space="preserve">Projektfortschrittsberichte werden in der Regel </w:t>
-      </w:r>
-      <w:proofErr w:type="spellStart"/>
-      <w:r>
-        <w:t>wöchtentlich</w:t>
-      </w:r>
-      <w:proofErr w:type="spellEnd"/>
-      <w:r>
-        <w:t xml:space="preserve"> </w:t>
+        <w:t xml:space="preserve">Projektfortschrittsberichte werden in der Regel wöchtentlich </w:t>
       </w:r>
       <w:r>
         <w:t>verfasst und an die betreuende</w:t>
@@ -16560,6 +16370,119 @@
     </w:lvl>
   </w:abstractNum>
   <w:abstractNum w:abstractNumId="13" w15:restartNumberingAfterBreak="0">
+    <w:nsid w:val="2FE94459"/>
+    <w:multiLevelType w:val="hybridMultilevel"/>
+    <w:tmpl w:val="8F7E667A"/>
+    <w:lvl w:ilvl="0" w:tplc="0C070001">
+      <w:start w:val="1"/>
+      <w:numFmt w:val="bullet"/>
+      <w:lvlText w:val=""/>
+      <w:lvlJc w:val="left"/>
+      <w:pPr>
+        <w:ind w:left="720" w:hanging="360"/>
+      </w:pPr>
+      <w:rPr>
+        <w:rFonts w:ascii="Symbol" w:hAnsi="Symbol" w:hint="default"/>
+      </w:rPr>
+    </w:lvl>
+    <w:lvl w:ilvl="1" w:tplc="0C070003" w:tentative="1">
+      <w:start w:val="1"/>
+      <w:numFmt w:val="bullet"/>
+      <w:lvlText w:val="o"/>
+      <w:lvlJc w:val="left"/>
+      <w:pPr>
+        <w:ind w:left="1440" w:hanging="360"/>
+      </w:pPr>
+      <w:rPr>
+        <w:rFonts w:ascii="Courier New" w:hAnsi="Courier New" w:cs="Courier New" w:hint="default"/>
+      </w:rPr>
+    </w:lvl>
+    <w:lvl w:ilvl="2" w:tplc="0C070005" w:tentative="1">
+      <w:start w:val="1"/>
+      <w:numFmt w:val="bullet"/>
+      <w:lvlText w:val=""/>
+      <w:lvlJc w:val="left"/>
+      <w:pPr>
+        <w:ind w:left="2160" w:hanging="360"/>
+      </w:pPr>
+      <w:rPr>
+        <w:rFonts w:ascii="Wingdings" w:hAnsi="Wingdings" w:hint="default"/>
+      </w:rPr>
+    </w:lvl>
+    <w:lvl w:ilvl="3" w:tplc="0C070001" w:tentative="1">
+      <w:start w:val="1"/>
+      <w:numFmt w:val="bullet"/>
+      <w:lvlText w:val=""/>
+      <w:lvlJc w:val="left"/>
+      <w:pPr>
+        <w:ind w:left="2880" w:hanging="360"/>
+      </w:pPr>
+      <w:rPr>
+        <w:rFonts w:ascii="Symbol" w:hAnsi="Symbol" w:hint="default"/>
+      </w:rPr>
+    </w:lvl>
+    <w:lvl w:ilvl="4" w:tplc="0C070003" w:tentative="1">
+      <w:start w:val="1"/>
+      <w:numFmt w:val="bullet"/>
+      <w:lvlText w:val="o"/>
+      <w:lvlJc w:val="left"/>
+      <w:pPr>
+        <w:ind w:left="3600" w:hanging="360"/>
+      </w:pPr>
+      <w:rPr>
+        <w:rFonts w:ascii="Courier New" w:hAnsi="Courier New" w:cs="Courier New" w:hint="default"/>
+      </w:rPr>
+    </w:lvl>
+    <w:lvl w:ilvl="5" w:tplc="0C070005" w:tentative="1">
+      <w:start w:val="1"/>
+      <w:numFmt w:val="bullet"/>
+      <w:lvlText w:val=""/>
+      <w:lvlJc w:val="left"/>
+      <w:pPr>
+        <w:ind w:left="4320" w:hanging="360"/>
+      </w:pPr>
+      <w:rPr>
+        <w:rFonts w:ascii="Wingdings" w:hAnsi="Wingdings" w:hint="default"/>
+      </w:rPr>
+    </w:lvl>
+    <w:lvl w:ilvl="6" w:tplc="0C070001" w:tentative="1">
+      <w:start w:val="1"/>
+      <w:numFmt w:val="bullet"/>
+      <w:lvlText w:val=""/>
+      <w:lvlJc w:val="left"/>
+      <w:pPr>
+        <w:ind w:left="5040" w:hanging="360"/>
+      </w:pPr>
+      <w:rPr>
+        <w:rFonts w:ascii="Symbol" w:hAnsi="Symbol" w:hint="default"/>
+      </w:rPr>
+    </w:lvl>
+    <w:lvl w:ilvl="7" w:tplc="0C070003" w:tentative="1">
+      <w:start w:val="1"/>
+      <w:numFmt w:val="bullet"/>
+      <w:lvlText w:val="o"/>
+      <w:lvlJc w:val="left"/>
+      <w:pPr>
+        <w:ind w:left="5760" w:hanging="360"/>
+      </w:pPr>
+      <w:rPr>
+        <w:rFonts w:ascii="Courier New" w:hAnsi="Courier New" w:cs="Courier New" w:hint="default"/>
+      </w:rPr>
+    </w:lvl>
+    <w:lvl w:ilvl="8" w:tplc="0C070005" w:tentative="1">
+      <w:start w:val="1"/>
+      <w:numFmt w:val="bullet"/>
+      <w:lvlText w:val=""/>
+      <w:lvlJc w:val="left"/>
+      <w:pPr>
+        <w:ind w:left="6480" w:hanging="360"/>
+      </w:pPr>
+      <w:rPr>
+        <w:rFonts w:ascii="Wingdings" w:hAnsi="Wingdings" w:hint="default"/>
+      </w:rPr>
+    </w:lvl>
+  </w:abstractNum>
+  <w:abstractNum w:abstractNumId="14" w15:restartNumberingAfterBreak="0">
     <w:nsid w:val="34334A80"/>
     <w:multiLevelType w:val="hybridMultilevel"/>
     <w:tmpl w:val="2132058A"/>
@@ -16672,7 +16595,7 @@
       </w:rPr>
     </w:lvl>
   </w:abstractNum>
-  <w:abstractNum w:abstractNumId="14" w15:restartNumberingAfterBreak="0">
+  <w:abstractNum w:abstractNumId="15" w15:restartNumberingAfterBreak="0">
     <w:nsid w:val="3909433A"/>
     <w:multiLevelType w:val="hybridMultilevel"/>
     <w:tmpl w:val="916C71E6"/>
@@ -16785,7 +16708,7 @@
       </w:rPr>
     </w:lvl>
   </w:abstractNum>
-  <w:abstractNum w:abstractNumId="15" w15:restartNumberingAfterBreak="0">
+  <w:abstractNum w:abstractNumId="16" w15:restartNumberingAfterBreak="0">
     <w:nsid w:val="3AD00A74"/>
     <w:multiLevelType w:val="hybridMultilevel"/>
     <w:tmpl w:val="54E08598"/>
@@ -16898,7 +16821,7 @@
       </w:rPr>
     </w:lvl>
   </w:abstractNum>
-  <w:abstractNum w:abstractNumId="16" w15:restartNumberingAfterBreak="0">
+  <w:abstractNum w:abstractNumId="17" w15:restartNumberingAfterBreak="0">
     <w:nsid w:val="3AD36C6D"/>
     <w:multiLevelType w:val="hybridMultilevel"/>
     <w:tmpl w:val="04CEB4A4"/>
@@ -16988,7 +16911,7 @@
       </w:pPr>
     </w:lvl>
   </w:abstractNum>
-  <w:abstractNum w:abstractNumId="17" w15:restartNumberingAfterBreak="0">
+  <w:abstractNum w:abstractNumId="18" w15:restartNumberingAfterBreak="0">
     <w:nsid w:val="40F828D0"/>
     <w:multiLevelType w:val="hybridMultilevel"/>
     <w:tmpl w:val="D3AC0938"/>
@@ -17101,7 +17024,7 @@
       </w:rPr>
     </w:lvl>
   </w:abstractNum>
-  <w:abstractNum w:abstractNumId="18" w15:restartNumberingAfterBreak="0">
+  <w:abstractNum w:abstractNumId="19" w15:restartNumberingAfterBreak="0">
     <w:nsid w:val="44C15ABE"/>
     <w:multiLevelType w:val="hybridMultilevel"/>
     <w:tmpl w:val="E6F04B14"/>
@@ -17214,7 +17137,7 @@
       </w:rPr>
     </w:lvl>
   </w:abstractNum>
-  <w:abstractNum w:abstractNumId="19" w15:restartNumberingAfterBreak="0">
+  <w:abstractNum w:abstractNumId="20" w15:restartNumberingAfterBreak="0">
     <w:nsid w:val="47037B9E"/>
     <w:multiLevelType w:val="hybridMultilevel"/>
     <w:tmpl w:val="AC42E8FC"/>
@@ -17354,7 +17277,7 @@
       </w:rPr>
     </w:lvl>
   </w:abstractNum>
-  <w:abstractNum w:abstractNumId="20" w15:restartNumberingAfterBreak="0">
+  <w:abstractNum w:abstractNumId="21" w15:restartNumberingAfterBreak="0">
     <w:nsid w:val="5312111F"/>
     <w:multiLevelType w:val="hybridMultilevel"/>
     <w:tmpl w:val="24E23386"/>
@@ -17467,7 +17390,7 @@
       </w:rPr>
     </w:lvl>
   </w:abstractNum>
-  <w:abstractNum w:abstractNumId="21" w15:restartNumberingAfterBreak="0">
+  <w:abstractNum w:abstractNumId="22" w15:restartNumberingAfterBreak="0">
     <w:nsid w:val="532E4ADE"/>
     <w:multiLevelType w:val="hybridMultilevel"/>
     <w:tmpl w:val="FBF44E0E"/>
@@ -17580,7 +17503,7 @@
       </w:rPr>
     </w:lvl>
   </w:abstractNum>
-  <w:abstractNum w:abstractNumId="22" w15:restartNumberingAfterBreak="0">
+  <w:abstractNum w:abstractNumId="23" w15:restartNumberingAfterBreak="0">
     <w:nsid w:val="545A516E"/>
     <w:multiLevelType w:val="hybridMultilevel"/>
     <w:tmpl w:val="81AAF816"/>
@@ -17693,7 +17616,7 @@
       </w:rPr>
     </w:lvl>
   </w:abstractNum>
-  <w:abstractNum w:abstractNumId="23" w15:restartNumberingAfterBreak="0">
+  <w:abstractNum w:abstractNumId="24" w15:restartNumberingAfterBreak="0">
     <w:nsid w:val="548E2464"/>
     <w:multiLevelType w:val="singleLevel"/>
     <w:tmpl w:val="04070011"/>
@@ -17710,7 +17633,7 @@
       </w:pPr>
     </w:lvl>
   </w:abstractNum>
-  <w:abstractNum w:abstractNumId="24" w15:restartNumberingAfterBreak="0">
+  <w:abstractNum w:abstractNumId="25" w15:restartNumberingAfterBreak="0">
     <w:nsid w:val="59FF4988"/>
     <w:multiLevelType w:val="multilevel"/>
     <w:tmpl w:val="FD345388"/>
@@ -17804,7 +17727,7 @@
       </w:pPr>
     </w:lvl>
   </w:abstractNum>
-  <w:abstractNum w:abstractNumId="25" w15:restartNumberingAfterBreak="0">
+  <w:abstractNum w:abstractNumId="26" w15:restartNumberingAfterBreak="0">
     <w:nsid w:val="62435ECE"/>
     <w:multiLevelType w:val="hybridMultilevel"/>
     <w:tmpl w:val="2334C4F8"/>
@@ -17917,7 +17840,7 @@
       </w:rPr>
     </w:lvl>
   </w:abstractNum>
-  <w:abstractNum w:abstractNumId="26" w15:restartNumberingAfterBreak="0">
+  <w:abstractNum w:abstractNumId="27" w15:restartNumberingAfterBreak="0">
     <w:nsid w:val="64A4391D"/>
     <w:multiLevelType w:val="hybridMultilevel"/>
     <w:tmpl w:val="B2B2D86C"/>
@@ -18030,7 +17953,7 @@
       </w:rPr>
     </w:lvl>
   </w:abstractNum>
-  <w:abstractNum w:abstractNumId="27" w15:restartNumberingAfterBreak="0">
+  <w:abstractNum w:abstractNumId="28" w15:restartNumberingAfterBreak="0">
     <w:nsid w:val="67A74FF7"/>
     <w:multiLevelType w:val="hybridMultilevel"/>
     <w:tmpl w:val="1CEE45F6"/>
@@ -18143,7 +18066,7 @@
       </w:rPr>
     </w:lvl>
   </w:abstractNum>
-  <w:abstractNum w:abstractNumId="28" w15:restartNumberingAfterBreak="0">
+  <w:abstractNum w:abstractNumId="29" w15:restartNumberingAfterBreak="0">
     <w:nsid w:val="7197000B"/>
     <w:multiLevelType w:val="hybridMultilevel"/>
     <w:tmpl w:val="B170C862"/>
@@ -18256,7 +18179,7 @@
       </w:rPr>
     </w:lvl>
   </w:abstractNum>
-  <w:abstractNum w:abstractNumId="29" w15:restartNumberingAfterBreak="0">
+  <w:abstractNum w:abstractNumId="30" w15:restartNumberingAfterBreak="0">
     <w:nsid w:val="76FA199A"/>
     <w:multiLevelType w:val="hybridMultilevel"/>
     <w:tmpl w:val="EDB03844"/>
@@ -18396,7 +18319,7 @@
       </w:rPr>
     </w:lvl>
   </w:abstractNum>
-  <w:abstractNum w:abstractNumId="30" w15:restartNumberingAfterBreak="0">
+  <w:abstractNum w:abstractNumId="31" w15:restartNumberingAfterBreak="0">
     <w:nsid w:val="77D452D1"/>
     <w:multiLevelType w:val="hybridMultilevel"/>
     <w:tmpl w:val="E1AC3E4E"/>
@@ -18536,7 +18459,7 @@
       </w:rPr>
     </w:lvl>
   </w:abstractNum>
-  <w:abstractNum w:abstractNumId="31" w15:restartNumberingAfterBreak="0">
+  <w:abstractNum w:abstractNumId="32" w15:restartNumberingAfterBreak="0">
     <w:nsid w:val="7CA7708C"/>
     <w:multiLevelType w:val="hybridMultilevel"/>
     <w:tmpl w:val="30B4B602"/>
@@ -18625,7 +18548,7 @@
       </w:pPr>
     </w:lvl>
   </w:abstractNum>
-  <w:abstractNum w:abstractNumId="32" w15:restartNumberingAfterBreak="0">
+  <w:abstractNum w:abstractNumId="33" w15:restartNumberingAfterBreak="0">
     <w:nsid w:val="7EEC71AF"/>
     <w:multiLevelType w:val="singleLevel"/>
     <w:tmpl w:val="1F5081C8"/>
@@ -18646,7 +18569,7 @@
     </w:lvl>
   </w:abstractNum>
   <w:num w:numId="1" w16cid:durableId="726415684">
-    <w:abstractNumId w:val="30"/>
+    <w:abstractNumId w:val="31"/>
   </w:num>
   <w:num w:numId="2" w16cid:durableId="1595671529">
     <w:abstractNumId w:val="5"/>
@@ -18658,34 +18581,34 @@
     <w:abstractNumId w:val="1"/>
   </w:num>
   <w:num w:numId="5" w16cid:durableId="427504780">
-    <w:abstractNumId w:val="29"/>
+    <w:abstractNumId w:val="30"/>
   </w:num>
   <w:num w:numId="6" w16cid:durableId="1123957201">
     <w:abstractNumId w:val="3"/>
   </w:num>
   <w:num w:numId="7" w16cid:durableId="1048337715">
-    <w:abstractNumId w:val="19"/>
+    <w:abstractNumId w:val="20"/>
   </w:num>
   <w:num w:numId="8" w16cid:durableId="2133405103">
     <w:abstractNumId w:val="6"/>
   </w:num>
   <w:num w:numId="9" w16cid:durableId="946890929">
-    <w:abstractNumId w:val="24"/>
+    <w:abstractNumId w:val="25"/>
   </w:num>
   <w:num w:numId="10" w16cid:durableId="110055634">
-    <w:abstractNumId w:val="26"/>
+    <w:abstractNumId w:val="27"/>
   </w:num>
   <w:num w:numId="11" w16cid:durableId="323434499">
-    <w:abstractNumId w:val="28"/>
+    <w:abstractNumId w:val="29"/>
   </w:num>
   <w:num w:numId="12" w16cid:durableId="910820448">
-    <w:abstractNumId w:val="24"/>
+    <w:abstractNumId w:val="25"/>
   </w:num>
   <w:num w:numId="13" w16cid:durableId="115373554">
-    <w:abstractNumId w:val="18"/>
+    <w:abstractNumId w:val="19"/>
   </w:num>
   <w:num w:numId="14" w16cid:durableId="7610090">
-    <w:abstractNumId w:val="24"/>
+    <w:abstractNumId w:val="25"/>
   </w:num>
   <w:num w:numId="15" w16cid:durableId="316300785">
     <w:abstractNumId w:val="9"/>
@@ -18712,34 +18635,34 @@
     </w:lvlOverride>
   </w:num>
   <w:num w:numId="18" w16cid:durableId="1304582420">
+    <w:abstractNumId w:val="33"/>
+  </w:num>
+  <w:num w:numId="19" w16cid:durableId="831340055">
+    <w:abstractNumId w:val="24"/>
+  </w:num>
+  <w:num w:numId="20" w16cid:durableId="1912614950">
+    <w:abstractNumId w:val="23"/>
+  </w:num>
+  <w:num w:numId="21" w16cid:durableId="1967658939">
     <w:abstractNumId w:val="32"/>
   </w:num>
-  <w:num w:numId="19" w16cid:durableId="831340055">
-    <w:abstractNumId w:val="23"/>
-  </w:num>
-  <w:num w:numId="20" w16cid:durableId="1912614950">
-    <w:abstractNumId w:val="22"/>
-  </w:num>
-  <w:num w:numId="21" w16cid:durableId="1967658939">
-    <w:abstractNumId w:val="31"/>
-  </w:num>
   <w:num w:numId="22" w16cid:durableId="1619995558">
-    <w:abstractNumId w:val="14"/>
+    <w:abstractNumId w:val="15"/>
   </w:num>
   <w:num w:numId="23" w16cid:durableId="1493568029">
-    <w:abstractNumId w:val="16"/>
+    <w:abstractNumId w:val="17"/>
   </w:num>
   <w:num w:numId="24" w16cid:durableId="522744494">
-    <w:abstractNumId w:val="16"/>
+    <w:abstractNumId w:val="17"/>
   </w:num>
   <w:num w:numId="25" w16cid:durableId="1873103754">
     <w:abstractNumId w:val="8"/>
   </w:num>
   <w:num w:numId="26" w16cid:durableId="1373771057">
-    <w:abstractNumId w:val="15"/>
+    <w:abstractNumId w:val="16"/>
   </w:num>
   <w:num w:numId="27" w16cid:durableId="1360206513">
-    <w:abstractNumId w:val="17"/>
+    <w:abstractNumId w:val="18"/>
   </w:num>
   <w:num w:numId="28" w16cid:durableId="1332029582">
     <w:abstractNumId w:val="7"/>
@@ -18751,25 +18674,28 @@
     <w:abstractNumId w:val="2"/>
   </w:num>
   <w:num w:numId="31" w16cid:durableId="2032342455">
-    <w:abstractNumId w:val="21"/>
+    <w:abstractNumId w:val="22"/>
   </w:num>
   <w:num w:numId="32" w16cid:durableId="1889994150">
-    <w:abstractNumId w:val="27"/>
+    <w:abstractNumId w:val="28"/>
   </w:num>
   <w:num w:numId="33" w16cid:durableId="127937236">
-    <w:abstractNumId w:val="20"/>
+    <w:abstractNumId w:val="21"/>
   </w:num>
   <w:num w:numId="34" w16cid:durableId="677269543">
     <w:abstractNumId w:val="11"/>
   </w:num>
   <w:num w:numId="35" w16cid:durableId="1506162544">
-    <w:abstractNumId w:val="13"/>
+    <w:abstractNumId w:val="14"/>
   </w:num>
   <w:num w:numId="36" w16cid:durableId="1568302690">
-    <w:abstractNumId w:val="25"/>
+    <w:abstractNumId w:val="26"/>
   </w:num>
   <w:num w:numId="37" w16cid:durableId="1723407836">
     <w:abstractNumId w:val="12"/>
+  </w:num>
+  <w:num w:numId="38" w16cid:durableId="1146819482">
+    <w:abstractNumId w:val="13"/>
   </w:num>
 </w:numbering>
 </file>

</xml_diff>

<commit_message>
[LOGIC] Implemented Unit-tests for: "UserController".
</commit_message>
<xml_diff>
--- a/0_Documents/Projekthandbuch.docx
+++ b/0_Documents/Projekthandbuch.docx
@@ -3212,10 +3212,30 @@
               <w:t xml:space="preserve">und </w:t>
             </w:r>
             <w:r>
-              <w:t xml:space="preserve"> NotesController</w:t>
+              <w:t xml:space="preserve"> </w:t>
+            </w:r>
+            <w:r>
+              <w:t>Events</w:t>
+            </w:r>
+            <w:r>
+              <w:t>Controller</w:t>
             </w:r>
             <w:r>
               <w:t xml:space="preserve"> implementiert.</w:t>
+            </w:r>
+          </w:p>
+          <w:p>
+            <w:pPr>
+              <w:pStyle w:val="Listenabsatz"/>
+              <w:numPr>
+                <w:ilvl w:val="0"/>
+                <w:numId w:val="25"/>
+              </w:numPr>
+              <w:spacing w:before="60" w:after="60"/>
+              <w:ind w:left="369"/>
+            </w:pPr>
+            <w:r>
+              <w:t>Unit-Test für NotesController generiert.</w:t>
             </w:r>
           </w:p>
           <w:p>

</xml_diff>

<commit_message>
[LOGIC] Implemented ThemeProvider. Worked out first version of second theme.
</commit_message>
<xml_diff>
--- a/0_Documents/Projekthandbuch.docx
+++ b/0_Documents/Projekthandbuch.docx
@@ -1844,9 +1844,11 @@
               </w:numPr>
               <w:spacing w:before="60" w:after="60"/>
             </w:pPr>
+            <w:proofErr w:type="spellStart"/>
             <w:r>
               <w:t>Friendship</w:t>
             </w:r>
+            <w:proofErr w:type="spellEnd"/>
             <w:r>
               <w:t>-</w:t>
             </w:r>
@@ -1920,9 +1922,11 @@
               </w:numPr>
               <w:spacing w:before="60" w:after="60"/>
             </w:pPr>
+            <w:proofErr w:type="spellStart"/>
             <w:r>
               <w:t>Friendship</w:t>
             </w:r>
+            <w:proofErr w:type="spellEnd"/>
             <w:r>
               <w:t>-</w:t>
             </w:r>
@@ -1997,7 +2001,15 @@
             </w:r>
             <w:r>
               <w:br/>
-              <w:t>Hooks zu den Hubs im Frontend implementiert. ChatController implementiert.</w:t>
+              <w:t xml:space="preserve">Hooks zu den Hubs im Frontend implementiert. </w:t>
+            </w:r>
+            <w:proofErr w:type="spellStart"/>
+            <w:r>
+              <w:t>ChatController</w:t>
+            </w:r>
+            <w:proofErr w:type="spellEnd"/>
+            <w:r>
+              <w:t xml:space="preserve"> implementiert.</w:t>
             </w:r>
           </w:p>
         </w:tc>
@@ -2064,7 +2076,14 @@
             </w:r>
             <w:r>
               <w:br/>
-              <w:t>WorkspaceController erstellt und Endpoints implementiert.</w:t>
+            </w:r>
+            <w:proofErr w:type="spellStart"/>
+            <w:r>
+              <w:t>WorkspaceController</w:t>
+            </w:r>
+            <w:proofErr w:type="spellEnd"/>
+            <w:r>
+              <w:t xml:space="preserve"> erstellt und Endpoints implementiert.</w:t>
             </w:r>
           </w:p>
         </w:tc>
@@ -2138,9 +2157,11 @@
               <w:spacing w:before="60" w:after="60"/>
               <w:ind w:left="369"/>
             </w:pPr>
+            <w:proofErr w:type="spellStart"/>
             <w:r>
               <w:t>AccountModal</w:t>
             </w:r>
+            <w:proofErr w:type="spellEnd"/>
             <w:r>
               <w:t>-</w:t>
             </w:r>
@@ -2159,7 +2180,15 @@
               <w:ind w:left="369"/>
             </w:pPr>
             <w:r>
-              <w:t>Shell für Komponente AccountModal erstellt.</w:t>
+              <w:t xml:space="preserve">Shell für Komponente </w:t>
+            </w:r>
+            <w:proofErr w:type="spellStart"/>
+            <w:r>
+              <w:t>AccountModal</w:t>
+            </w:r>
+            <w:proofErr w:type="spellEnd"/>
+            <w:r>
+              <w:t xml:space="preserve"> erstellt.</w:t>
             </w:r>
           </w:p>
           <w:p>
@@ -2283,8 +2312,13 @@
               <w:spacing w:before="60" w:after="60"/>
               <w:ind w:left="369"/>
             </w:pPr>
-            <w:r>
-              <w:t>AccountModal-Komponente erstellt.</w:t>
+            <w:proofErr w:type="spellStart"/>
+            <w:r>
+              <w:t>AccountModal</w:t>
+            </w:r>
+            <w:proofErr w:type="spellEnd"/>
+            <w:r>
+              <w:t>-Komponente erstellt.</w:t>
             </w:r>
           </w:p>
           <w:p>
@@ -2380,9 +2414,11 @@
               <w:spacing w:before="60" w:after="60"/>
               <w:ind w:left="369"/>
             </w:pPr>
+            <w:proofErr w:type="spellStart"/>
             <w:r>
               <w:t>Recents</w:t>
             </w:r>
+            <w:proofErr w:type="spellEnd"/>
             <w:r>
               <w:t>-</w:t>
             </w:r>
@@ -2600,9 +2636,11 @@
             <w:r>
               <w:t>„</w:t>
             </w:r>
+            <w:proofErr w:type="spellStart"/>
             <w:r>
               <w:t>TodoBoard</w:t>
             </w:r>
+            <w:proofErr w:type="spellEnd"/>
             <w:r>
               <w:t>“ implementiert</w:t>
             </w:r>
@@ -2613,11 +2651,16 @@
               <w:t>ü</w:t>
             </w:r>
             <w:r>
-              <w:t>r Todo</w:t>
+              <w:t xml:space="preserve">r </w:t>
+            </w:r>
+            <w:proofErr w:type="spellStart"/>
+            <w:r>
+              <w:t>Todo</w:t>
             </w:r>
             <w:r>
               <w:t>listen</w:t>
             </w:r>
+            <w:proofErr w:type="spellEnd"/>
             <w:r>
               <w:t>.</w:t>
             </w:r>
@@ -2976,7 +3019,31 @@
               <w:t>Verhalten der Klicks verbessert</w:t>
             </w:r>
             <w:r>
-              <w:t xml:space="preserve"> (To fit known behaviour of standard Windows-Explorer)</w:t>
+              <w:t xml:space="preserve"> (</w:t>
+            </w:r>
+            <w:proofErr w:type="spellStart"/>
+            <w:r>
+              <w:t>To</w:t>
+            </w:r>
+            <w:proofErr w:type="spellEnd"/>
+            <w:r>
+              <w:t xml:space="preserve"> fit </w:t>
+            </w:r>
+            <w:proofErr w:type="spellStart"/>
+            <w:r>
+              <w:t>known</w:t>
+            </w:r>
+            <w:proofErr w:type="spellEnd"/>
+            <w:r>
+              <w:t xml:space="preserve"> behaviour of </w:t>
+            </w:r>
+            <w:proofErr w:type="spellStart"/>
+            <w:r>
+              <w:t>standard</w:t>
+            </w:r>
+            <w:proofErr w:type="spellEnd"/>
+            <w:r>
+              <w:t xml:space="preserve"> Windows-Explorer)</w:t>
             </w:r>
           </w:p>
           <w:p>
@@ -3214,12 +3281,14 @@
             <w:r>
               <w:t xml:space="preserve"> </w:t>
             </w:r>
+            <w:proofErr w:type="spellStart"/>
             <w:r>
               <w:t>Events</w:t>
             </w:r>
             <w:r>
               <w:t>Controller</w:t>
             </w:r>
+            <w:proofErr w:type="spellEnd"/>
             <w:r>
               <w:t xml:space="preserve"> implementiert.</w:t>
             </w:r>
@@ -3276,7 +3345,31 @@
               <w:ind w:left="369"/>
             </w:pPr>
             <w:r>
-              <w:t>Fixed blur not showing on WorkspaceCard.</w:t>
+              <w:t xml:space="preserve">Fixed </w:t>
+            </w:r>
+            <w:proofErr w:type="spellStart"/>
+            <w:r>
+              <w:t>blur</w:t>
+            </w:r>
+            <w:proofErr w:type="spellEnd"/>
+            <w:r>
+              <w:t xml:space="preserve"> not </w:t>
+            </w:r>
+            <w:proofErr w:type="spellStart"/>
+            <w:r>
+              <w:t>showing</w:t>
+            </w:r>
+            <w:proofErr w:type="spellEnd"/>
+            <w:r>
+              <w:t xml:space="preserve"> on </w:t>
+            </w:r>
+            <w:proofErr w:type="spellStart"/>
+            <w:r>
+              <w:t>WorkspaceCard</w:t>
+            </w:r>
+            <w:proofErr w:type="spellEnd"/>
+            <w:r>
+              <w:t>.</w:t>
             </w:r>
           </w:p>
         </w:tc>
@@ -3292,18 +3385,172 @@
             <w:r>
               <w:t>Christian Riepl</w:t>
             </w:r>
+          </w:p>
+        </w:tc>
+      </w:tr>
+      <w:tr>
+        <w:tc>
+          <w:tcPr>
+            <w:tcW w:w="1389" w:type="dxa"/>
+          </w:tcPr>
+          <w:p>
+            <w:pPr>
+              <w:spacing w:before="60" w:after="60"/>
+              <w:jc w:val="center"/>
+            </w:pPr>
+            <w:r>
+              <w:t>0.2.2</w:t>
+            </w:r>
+          </w:p>
+        </w:tc>
+        <w:tc>
+          <w:tcPr>
+            <w:tcW w:w="1392" w:type="dxa"/>
+          </w:tcPr>
+          <w:p>
+            <w:pPr>
+              <w:spacing w:before="60" w:after="60"/>
+              <w:jc w:val="center"/>
+            </w:pPr>
+            <w:r>
+              <w:t>18.06.2026</w:t>
+            </w:r>
+          </w:p>
+        </w:tc>
+        <w:tc>
+          <w:tcPr>
+            <w:tcW w:w="4852" w:type="dxa"/>
+          </w:tcPr>
+          <w:p>
+            <w:pPr>
+              <w:pStyle w:val="Listenabsatz"/>
+              <w:numPr>
+                <w:ilvl w:val="0"/>
+                <w:numId w:val="25"/>
+              </w:numPr>
+              <w:spacing w:before="60" w:after="60"/>
+              <w:ind w:left="369"/>
+            </w:pPr>
+            <w:r>
+              <w:t xml:space="preserve">Unit-Tests erstellt für </w:t>
+            </w:r>
+            <w:proofErr w:type="spellStart"/>
+            <w:r>
+              <w:t>UserController</w:t>
+            </w:r>
+            <w:proofErr w:type="spellEnd"/>
+            <w:r>
+              <w:t xml:space="preserve"> und </w:t>
+            </w:r>
+            <w:proofErr w:type="spellStart"/>
+            <w:r>
+              <w:t>AccountController</w:t>
+            </w:r>
+            <w:proofErr w:type="spellEnd"/>
+            <w:r>
+              <w:t>.</w:t>
+            </w:r>
+          </w:p>
+          <w:p>
+            <w:pPr>
+              <w:pStyle w:val="Listenabsatz"/>
+              <w:numPr>
+                <w:ilvl w:val="0"/>
+                <w:numId w:val="25"/>
+              </w:numPr>
+              <w:spacing w:before="60" w:after="60"/>
+              <w:ind w:left="369"/>
+            </w:pPr>
+            <w:r>
+              <w:t xml:space="preserve">Datenbank angepasst für </w:t>
+            </w:r>
+            <w:proofErr w:type="spellStart"/>
+            <w:r>
+              <w:t>ResetPassword</w:t>
+            </w:r>
+            <w:proofErr w:type="spellEnd"/>
+            <w:r>
+              <w:t>-Funktionalität.</w:t>
+            </w:r>
+          </w:p>
+          <w:p>
+            <w:pPr>
+              <w:pStyle w:val="Listenabsatz"/>
+              <w:numPr>
+                <w:ilvl w:val="0"/>
+                <w:numId w:val="25"/>
+              </w:numPr>
+              <w:spacing w:before="60" w:after="60"/>
+              <w:ind w:left="369"/>
+            </w:pPr>
+            <w:proofErr w:type="spellStart"/>
+            <w:r>
+              <w:t>Endpoint</w:t>
+            </w:r>
+            <w:proofErr w:type="spellEnd"/>
+            <w:r>
+              <w:t xml:space="preserve"> für </w:t>
+            </w:r>
+            <w:proofErr w:type="spellStart"/>
+            <w:r>
+              <w:t>ResetPassword</w:t>
+            </w:r>
+            <w:proofErr w:type="spellEnd"/>
+            <w:r>
+              <w:t xml:space="preserve"> implementiert.</w:t>
+            </w:r>
+          </w:p>
+          <w:p>
+            <w:pPr>
+              <w:pStyle w:val="Listenabsatz"/>
+              <w:numPr>
+                <w:ilvl w:val="0"/>
+                <w:numId w:val="25"/>
+              </w:numPr>
+              <w:spacing w:before="60" w:after="60"/>
+              <w:ind w:left="369"/>
+            </w:pPr>
+            <w:proofErr w:type="spellStart"/>
+            <w:proofErr w:type="gramStart"/>
+            <w:r>
+              <w:t>Email</w:t>
+            </w:r>
+            <w:proofErr w:type="spellEnd"/>
+            <w:proofErr w:type="gramEnd"/>
+            <w:r>
+              <w:t xml:space="preserve">-Service eingerichtet für </w:t>
+            </w:r>
+            <w:proofErr w:type="spellStart"/>
+            <w:r>
+              <w:t>ResetPassword</w:t>
+            </w:r>
+            <w:proofErr w:type="spellEnd"/>
+            <w:r>
+              <w:t>-Funktionalität. (</w:t>
+            </w:r>
+            <w:proofErr w:type="spellStart"/>
+            <w:r>
+              <w:t>MailKit</w:t>
+            </w:r>
+            <w:proofErr w:type="spellEnd"/>
+            <w:r>
+              <w:t>)</w:t>
+            </w:r>
+          </w:p>
+        </w:tc>
+        <w:tc>
+          <w:tcPr>
+            <w:tcW w:w="1427" w:type="dxa"/>
+          </w:tcPr>
+          <w:p>
+            <w:pPr>
+              <w:spacing w:before="60" w:after="60"/>
+              <w:jc w:val="center"/>
+            </w:pPr>
           </w:p>
         </w:tc>
       </w:tr>
     </w:tbl>
-    <w:p/>
-    <w:p/>
-    <w:p/>
-    <w:p/>
-    <w:p/>
-    <w:p/>
-    <w:p/>
-    <w:p/>
     <w:p/>
     <w:p/>
     <w:p>
@@ -5380,9 +5627,19 @@
               </w:numPr>
               <w:spacing w:before="60" w:after="60"/>
             </w:pPr>
-            <w:r>
-              <w:t>Keine Ahnung was ich hier schreiben sollte</w:t>
-            </w:r>
+            <w:proofErr w:type="gramStart"/>
+            <w:r>
+              <w:t>Keine Ahnung</w:t>
+            </w:r>
+            <w:proofErr w:type="gramEnd"/>
+            <w:r>
+              <w:t xml:space="preserve"> was ich hier </w:t>
+            </w:r>
+            <w:proofErr w:type="gramStart"/>
+            <w:r>
+              <w:t>schreiben sollte</w:t>
+            </w:r>
+            <w:proofErr w:type="gramEnd"/>
           </w:p>
         </w:tc>
         <w:tc>
@@ -6026,9 +6283,19 @@
               </w:numPr>
               <w:spacing w:before="60" w:after="60"/>
             </w:pPr>
-            <w:r>
-              <w:t>Will dass ich das Projekt mache</w:t>
-            </w:r>
+            <w:proofErr w:type="gramStart"/>
+            <w:r>
+              <w:t>Will</w:t>
+            </w:r>
+            <w:proofErr w:type="gramEnd"/>
+            <w:r>
+              <w:t xml:space="preserve"> dass ich das Projekt </w:t>
+            </w:r>
+            <w:proofErr w:type="gramStart"/>
+            <w:r>
+              <w:t>mache</w:t>
+            </w:r>
+            <w:proofErr w:type="gramEnd"/>
           </w:p>
         </w:tc>
         <w:tc>
@@ -6040,8 +6307,13 @@
               <w:spacing w:before="60" w:after="60"/>
               <w:jc w:val="center"/>
             </w:pPr>
-            <w:r>
-              <w:t>Landesberufschule 4</w:t>
+            <w:proofErr w:type="spellStart"/>
+            <w:r>
+              <w:t>Landesberufschule</w:t>
+            </w:r>
+            <w:proofErr w:type="spellEnd"/>
+            <w:r>
+              <w:t xml:space="preserve"> 4</w:t>
             </w:r>
           </w:p>
         </w:tc>
@@ -6680,13 +6952,23 @@
                                   <w:szCs w:val="20"/>
                                 </w:rPr>
                               </w:pPr>
+                              <w:proofErr w:type="spellStart"/>
                               <w:r>
                                 <w:rPr>
                                   <w:rFonts w:cs="Arial"/>
                                   <w:color w:val="000000"/>
                                   <w:szCs w:val="20"/>
                                 </w:rPr>
-                                <w:t xml:space="preserve">Landesberufschule 4 </w:t>
+                                <w:t>Landesberufschule</w:t>
+                              </w:r>
+                              <w:proofErr w:type="spellEnd"/>
+                              <w:r>
+                                <w:rPr>
+                                  <w:rFonts w:cs="Arial"/>
+                                  <w:color w:val="000000"/>
+                                  <w:szCs w:val="20"/>
+                                </w:rPr>
+                                <w:t xml:space="preserve"> 4 </w:t>
                               </w:r>
                             </w:p>
                           </w:txbxContent>
@@ -6992,13 +7274,23 @@
                             <w:szCs w:val="20"/>
                           </w:rPr>
                         </w:pPr>
+                        <w:proofErr w:type="spellStart"/>
                         <w:r>
                           <w:rPr>
                             <w:rFonts w:cs="Arial"/>
                             <w:color w:val="000000"/>
                             <w:szCs w:val="20"/>
                           </w:rPr>
-                          <w:t xml:space="preserve">Landesberufschule 4 </w:t>
+                          <w:t>Landesberufschule</w:t>
+                        </w:r>
+                        <w:proofErr w:type="spellEnd"/>
+                        <w:r>
+                          <w:rPr>
+                            <w:rFonts w:cs="Arial"/>
+                            <w:color w:val="000000"/>
+                            <w:szCs w:val="20"/>
+                          </w:rPr>
+                          <w:t xml:space="preserve"> 4 </w:t>
                         </w:r>
                       </w:p>
                     </w:txbxContent>
@@ -7373,8 +7665,13 @@
             <w:r>
               <w:t xml:space="preserve">: </w:t>
             </w:r>
-            <w:r>
-              <w:t>Landesberufschule 4</w:t>
+            <w:proofErr w:type="spellStart"/>
+            <w:r>
+              <w:t>Landesberufschule</w:t>
+            </w:r>
+            <w:proofErr w:type="spellEnd"/>
+            <w:r>
+              <w:t xml:space="preserve"> 4</w:t>
             </w:r>
           </w:p>
         </w:tc>
@@ -8053,8 +8350,13 @@
             </w:pPr>
             <w:r>
               <w:lastRenderedPageBreak/>
-              <w:t>Frontendbasis schaffen mit Authentication, Friendship</w:t>
-            </w:r>
+              <w:t xml:space="preserve">Frontendbasis schaffen mit Authentication, </w:t>
+            </w:r>
+            <w:proofErr w:type="spellStart"/>
+            <w:r>
+              <w:t>Friendship</w:t>
+            </w:r>
+            <w:proofErr w:type="spellEnd"/>
             <w:r>
               <w:t>-</w:t>
             </w:r>
@@ -8519,7 +8821,15 @@
               </w:rPr>
             </w:pPr>
             <w:r>
-              <w:t>Fortlaufendes Server-Hosting für WebApp, Datenbank und Domain</w:t>
+              <w:t xml:space="preserve">Fortlaufendes Server-Hosting für </w:t>
+            </w:r>
+            <w:proofErr w:type="spellStart"/>
+            <w:r>
+              <w:t>WebApp</w:t>
+            </w:r>
+            <w:proofErr w:type="spellEnd"/>
+            <w:r>
+              <w:t>, Datenbank und Domain</w:t>
             </w:r>
           </w:p>
         </w:tc>
@@ -9142,8 +9452,13 @@
             <w:pPr>
               <w:spacing w:before="60" w:after="60"/>
             </w:pPr>
-            <w:r>
-              <w:t>AP Inhalte / Ergebnisse:</w:t>
+            <w:proofErr w:type="gramStart"/>
+            <w:r>
+              <w:t>AP Inhalte</w:t>
+            </w:r>
+            <w:proofErr w:type="gramEnd"/>
+            <w:r>
+              <w:t xml:space="preserve"> / Ergebnisse:</w:t>
             </w:r>
           </w:p>
         </w:tc>
@@ -9385,8 +9700,13 @@
             <w:pPr>
               <w:spacing w:before="60" w:after="60"/>
             </w:pPr>
-            <w:r>
-              <w:t>AP Inhalte / Ergebnisse:</w:t>
+            <w:proofErr w:type="gramStart"/>
+            <w:r>
+              <w:t>AP Inhalte</w:t>
+            </w:r>
+            <w:proofErr w:type="gramEnd"/>
+            <w:r>
+              <w:t xml:space="preserve"> / Ergebnisse:</w:t>
             </w:r>
           </w:p>
         </w:tc>
@@ -9434,8 +9754,13 @@
               <w:spacing w:before="60" w:after="60"/>
             </w:pPr>
             <w:r>
-              <w:t>Umsetzung von Authentifizierung mittels JWT/Https-only</w:t>
-            </w:r>
+              <w:t>Umsetzung von Authentifizierung mittels JWT/Https-</w:t>
+            </w:r>
+            <w:proofErr w:type="spellStart"/>
+            <w:r>
+              <w:t>only</w:t>
+            </w:r>
+            <w:proofErr w:type="spellEnd"/>
           </w:p>
           <w:p>
             <w:pPr>
@@ -9699,8 +10024,13 @@
             <w:pPr>
               <w:spacing w:before="60" w:after="60"/>
             </w:pPr>
-            <w:r>
-              <w:t>AP Inhalte / Ergebnisse:</w:t>
+            <w:proofErr w:type="gramStart"/>
+            <w:r>
+              <w:t>AP Inhalte</w:t>
+            </w:r>
+            <w:proofErr w:type="gramEnd"/>
+            <w:r>
+              <w:t xml:space="preserve"> / Ergebnisse:</w:t>
             </w:r>
           </w:p>
         </w:tc>
@@ -9741,7 +10071,15 @@
               <w:spacing w:before="60" w:after="60"/>
             </w:pPr>
             <w:r>
-              <w:t xml:space="preserve">Tests zu Hubs und Hooks können erst sicher getestet werden, wenn ein Feature im Frontend gebaut ist </w:t>
+              <w:t xml:space="preserve">Tests zu Hubs und Hooks können erst sicher getestet werden, wenn ein Feature im Frontend gebaut </w:t>
+            </w:r>
+            <w:proofErr w:type="gramStart"/>
+            <w:r>
+              <w:t>ist</w:t>
+            </w:r>
+            <w:proofErr w:type="gramEnd"/>
+            <w:r>
+              <w:t xml:space="preserve"> </w:t>
             </w:r>
           </w:p>
         </w:tc>
@@ -12078,6 +12416,7 @@
                 <w:sz w:val="18"/>
               </w:rPr>
             </w:pPr>
+            <w:proofErr w:type="spellStart"/>
             <w:r>
               <w:rPr>
                 <w:rFonts w:ascii="Tahoma" w:hAnsi="Tahoma" w:cs="Tahoma"/>
@@ -12086,7 +12425,18 @@
                 <w:color w:val="70AD47" w:themeColor="accent6"/>
                 <w:sz w:val="18"/>
               </w:rPr>
-              <w:t>FrontendServices wurden aufgebaut und an die Authentication angepasst.</w:t>
+              <w:t>FrontendServices</w:t>
+            </w:r>
+            <w:proofErr w:type="spellEnd"/>
+            <w:r>
+              <w:rPr>
+                <w:rFonts w:ascii="Tahoma" w:hAnsi="Tahoma" w:cs="Tahoma"/>
+                <w:b/>
+                <w:bCs/>
+                <w:color w:val="70AD47" w:themeColor="accent6"/>
+                <w:sz w:val="18"/>
+              </w:rPr>
+              <w:t xml:space="preserve"> wurden aufgebaut und an die Authentication angepasst.</w:t>
             </w:r>
           </w:p>
           <w:p>
@@ -12113,7 +12463,29 @@
                 <w:color w:val="70AD47" w:themeColor="accent6"/>
                 <w:sz w:val="18"/>
               </w:rPr>
-              <w:t>Tests zu Hooks und Hubs konnten erfolgreich getestet werden. Eine Race-Condition musste ausgebessert werden. Hubs laufen nun korrekt und funktionieren.</w:t>
+              <w:t xml:space="preserve">Tests zu Hooks und Hubs konnten erfolgreich getestet werden. Eine </w:t>
+            </w:r>
+            <w:proofErr w:type="spellStart"/>
+            <w:r>
+              <w:rPr>
+                <w:rFonts w:ascii="Tahoma" w:hAnsi="Tahoma" w:cs="Tahoma"/>
+                <w:b/>
+                <w:bCs/>
+                <w:color w:val="70AD47" w:themeColor="accent6"/>
+                <w:sz w:val="18"/>
+              </w:rPr>
+              <w:t>Race-Condition</w:t>
+            </w:r>
+            <w:proofErr w:type="spellEnd"/>
+            <w:r>
+              <w:rPr>
+                <w:rFonts w:ascii="Tahoma" w:hAnsi="Tahoma" w:cs="Tahoma"/>
+                <w:b/>
+                <w:bCs/>
+                <w:color w:val="70AD47" w:themeColor="accent6"/>
+                <w:sz w:val="18"/>
+              </w:rPr>
+              <w:t xml:space="preserve"> musste ausgebessert werden. Hubs laufen nun korrekt und funktionieren.</w:t>
             </w:r>
           </w:p>
           <w:p>
@@ -13570,13 +13942,23 @@
                 <w:lang w:val="en-GB"/>
               </w:rPr>
             </w:pPr>
+            <w:proofErr w:type="spellStart"/>
             <w:r>
               <w:rPr>
                 <w:b/>
                 <w:bCs/>
                 <w:lang w:val="en-GB"/>
               </w:rPr>
-              <w:t>Teamarbeit:</w:t>
+              <w:t>Teamarbeit</w:t>
+            </w:r>
+            <w:proofErr w:type="spellEnd"/>
+            <w:r>
+              <w:rPr>
+                <w:b/>
+                <w:bCs/>
+                <w:lang w:val="en-GB"/>
+              </w:rPr>
+              <w:t>:</w:t>
             </w:r>
           </w:p>
           <w:p>
@@ -13836,7 +14218,25 @@
                 <w:bCs/>
                 <w:lang w:val="de-AT"/>
               </w:rPr>
-              <w:t xml:space="preserve"> Lernerfahrungen („Learnings“):</w:t>
+              <w:t xml:space="preserve"> Lernerfahrungen („</w:t>
+            </w:r>
+            <w:proofErr w:type="spellStart"/>
+            <w:r>
+              <w:rPr>
+                <w:b/>
+                <w:bCs/>
+                <w:lang w:val="de-AT"/>
+              </w:rPr>
+              <w:t>Learnings</w:t>
+            </w:r>
+            <w:proofErr w:type="spellEnd"/>
+            <w:r>
+              <w:rPr>
+                <w:b/>
+                <w:bCs/>
+                <w:lang w:val="de-AT"/>
+              </w:rPr>
+              <w:t>“):</w:t>
             </w:r>
           </w:p>
           <w:p>
@@ -14577,7 +14977,7 @@
         <w:noProof/>
         <w:sz w:val="16"/>
       </w:rPr>
-      <w:t>17.06.2026</w:t>
+      <w:t>18.06.2026</w:t>
     </w:r>
     <w:r>
       <w:rPr>
@@ -14677,7 +15077,15 @@
       </w:r>
       <w:r>
         <w:tab/>
-        <w:t>Beispiel Versionierungs-Systematik: Arbeitsversionen 0.1, 0.2 etc. | Hauptversionen 1.0, 2.0 etc.</w:t>
+        <w:t xml:space="preserve">Beispiel </w:t>
+      </w:r>
+      <w:proofErr w:type="spellStart"/>
+      <w:r>
+        <w:t>Versionierungs</w:t>
+      </w:r>
+      <w:proofErr w:type="spellEnd"/>
+      <w:r>
+        <w:t>-Systematik: Arbeitsversionen 0.1, 0.2 etc. | Hauptversionen 1.0, 2.0 etc.</w:t>
       </w:r>
     </w:p>
   </w:footnote>
@@ -14697,7 +15105,15 @@
       </w:r>
       <w:r>
         <w:tab/>
-        <w:t xml:space="preserve">Die MindMapping Methode eignet sich besonders gut für die </w:t>
+        <w:t xml:space="preserve">Die </w:t>
+      </w:r>
+      <w:proofErr w:type="spellStart"/>
+      <w:r>
+        <w:t>MindMapping</w:t>
+      </w:r>
+      <w:proofErr w:type="spellEnd"/>
+      <w:r>
+        <w:t xml:space="preserve"> Methode eignet sich besonders gut für die </w:t>
       </w:r>
       <w:r>
         <w:rPr>
@@ -14706,7 +15122,15 @@
         <w:t xml:space="preserve">systematische, intensive und umfassende Auseinandersetzung </w:t>
       </w:r>
       <w:r>
-        <w:t xml:space="preserve">mit dem zeitlichen, sachlichen und sozialen Projektkontext sowie der zu Grunde liegenden Ausgangssituation / Problemstellung beim Kunden. Kostenlose Tools sind beispielsweise XMind oder Freemind. </w:t>
+        <w:t xml:space="preserve">mit dem zeitlichen, sachlichen und sozialen Projektkontext sowie der zu Grunde liegenden Ausgangssituation / Problemstellung beim Kunden. Kostenlose Tools sind beispielsweise XMind oder </w:t>
+      </w:r>
+      <w:proofErr w:type="spellStart"/>
+      <w:r>
+        <w:t>Freemind</w:t>
+      </w:r>
+      <w:proofErr w:type="spellEnd"/>
+      <w:r>
+        <w:t xml:space="preserve">. </w:t>
       </w:r>
     </w:p>
   </w:footnote>
@@ -14774,7 +15198,15 @@
       </w:r>
       <w:r>
         <w:tab/>
-        <w:t xml:space="preserve">Projektfortschrittsberichte werden in der Regel wöchtentlich </w:t>
+        <w:t xml:space="preserve">Projektfortschrittsberichte werden in der Regel </w:t>
+      </w:r>
+      <w:proofErr w:type="spellStart"/>
+      <w:r>
+        <w:t>wöchtentlich</w:t>
+      </w:r>
+      <w:proofErr w:type="spellEnd"/>
+      <w:r>
+        <w:t xml:space="preserve"> </w:t>
       </w:r>
       <w:r>
         <w:t>verfasst und an die betreuende</w:t>

</xml_diff>